<commit_message>
Updated instructions for Install
</commit_message>
<xml_diff>
--- a/ClassifiedInstallationStuff/_Instructions/Initial GenBoe Installation Instructions.docx
+++ b/ClassifiedInstallationStuff/_Instructions/Initial GenBoe Installation Instructions.docx
@@ -1,6 +1,6 @@
 
 <file path=word/document.xml><?xml version="1.0" encoding="utf-8"?>
-<w:document xmlns:wpc="http://schemas.microsoft.com/office/word/2010/wordprocessingCanvas" xmlns:cx="http://schemas.microsoft.com/office/drawing/2014/chartex" xmlns:cx1="http://schemas.microsoft.com/office/drawing/2015/9/8/chartex" xmlns:cx2="http://schemas.microsoft.com/office/drawing/2015/10/21/chartex" xmlns:cx3="http://schemas.microsoft.com/office/drawing/2016/5/9/chartex" xmlns:cx4="http://schemas.microsoft.com/office/drawing/2016/5/10/chartex" xmlns:cx5="http://schemas.microsoft.com/office/drawing/2016/5/11/chartex" xmlns:cx6="http://schemas.microsoft.com/office/drawing/2016/5/12/chartex" xmlns:cx7="http://schemas.microsoft.com/office/drawing/2016/5/13/chartex" xmlns:cx8="http://schemas.microsoft.com/office/drawing/2016/5/14/chartex" xmlns:mc="http://schemas.openxmlformats.org/markup-compatibility/2006" xmlns:aink="http://schemas.microsoft.com/office/drawing/2016/ink" xmlns:am3d="http://schemas.microsoft.com/office/drawing/2017/model3d" xmlns:o="urn:schemas-microsoft-com:office:office" xmlns:r="http://schemas.openxmlformats.org/officeDocument/2006/relationships" xmlns:m="http://schemas.openxmlformats.org/officeDocument/2006/math" xmlns:v="urn:schemas-microsoft-com:vml" xmlns:wp14="http://schemas.microsoft.com/office/word/2010/wordprocessingDrawing" xmlns:wp="http://schemas.openxmlformats.org/drawingml/2006/wordprocessingDrawing" xmlns:w10="urn:schemas-microsoft-com:office:word" xmlns:w="http://schemas.openxmlformats.org/wordprocessingml/2006/main" xmlns:w14="http://schemas.microsoft.com/office/word/2010/wordml" xmlns:w15="http://schemas.microsoft.com/office/word/2012/wordml" xmlns:w16cex="http://schemas.microsoft.com/office/word/2018/wordml/cex" xmlns:w16cid="http://schemas.microsoft.com/office/word/2016/wordml/cid" xmlns:w16="http://schemas.microsoft.com/office/word/2018/wordml" xmlns:w16sdtdh="http://schemas.microsoft.com/office/word/2020/wordml/sdtdatahash" xmlns:w16se="http://schemas.microsoft.com/office/word/2015/wordml/symex" xmlns:wpg="http://schemas.microsoft.com/office/word/2010/wordprocessingGroup" xmlns:wpi="http://schemas.microsoft.com/office/word/2010/wordprocessingInk" xmlns:wne="http://schemas.microsoft.com/office/word/2006/wordml" xmlns:wps="http://schemas.microsoft.com/office/word/2010/wordprocessingShape" mc:Ignorable="w14 w15 w16se w16cid w16 w16cex w16sdtdh wp14">
+<w:document xmlns:wpc="http://schemas.microsoft.com/office/word/2010/wordprocessingCanvas" xmlns:cx="http://schemas.microsoft.com/office/drawing/2014/chartex" xmlns:cx1="http://schemas.microsoft.com/office/drawing/2015/9/8/chartex" xmlns:cx2="http://schemas.microsoft.com/office/drawing/2015/10/21/chartex" xmlns:cx3="http://schemas.microsoft.com/office/drawing/2016/5/9/chartex" xmlns:cx4="http://schemas.microsoft.com/office/drawing/2016/5/10/chartex" xmlns:cx5="http://schemas.microsoft.com/office/drawing/2016/5/11/chartex" xmlns:cx6="http://schemas.microsoft.com/office/drawing/2016/5/12/chartex" xmlns:cx7="http://schemas.microsoft.com/office/drawing/2016/5/13/chartex" xmlns:cx8="http://schemas.microsoft.com/office/drawing/2016/5/14/chartex" xmlns:mc="http://schemas.openxmlformats.org/markup-compatibility/2006" xmlns:aink="http://schemas.microsoft.com/office/drawing/2016/ink" xmlns:am3d="http://schemas.microsoft.com/office/drawing/2017/model3d" xmlns:o="urn:schemas-microsoft-com:office:office" xmlns:oel="http://schemas.microsoft.com/office/2019/extlst" xmlns:r="http://schemas.openxmlformats.org/officeDocument/2006/relationships" xmlns:m="http://schemas.openxmlformats.org/officeDocument/2006/math" xmlns:v="urn:schemas-microsoft-com:vml" xmlns:wp14="http://schemas.microsoft.com/office/word/2010/wordprocessingDrawing" xmlns:wp="http://schemas.openxmlformats.org/drawingml/2006/wordprocessingDrawing" xmlns:w10="urn:schemas-microsoft-com:office:word" xmlns:w="http://schemas.openxmlformats.org/wordprocessingml/2006/main" xmlns:w14="http://schemas.microsoft.com/office/word/2010/wordml" xmlns:w15="http://schemas.microsoft.com/office/word/2012/wordml" xmlns:w16cex="http://schemas.microsoft.com/office/word/2018/wordml/cex" xmlns:w16cid="http://schemas.microsoft.com/office/word/2016/wordml/cid" xmlns:w16="http://schemas.microsoft.com/office/word/2018/wordml" xmlns:w16sdtdh="http://schemas.microsoft.com/office/word/2020/wordml/sdtdatahash" xmlns:w16se="http://schemas.microsoft.com/office/word/2015/wordml/symex" xmlns:wpg="http://schemas.microsoft.com/office/word/2010/wordprocessingGroup" xmlns:wpi="http://schemas.microsoft.com/office/word/2010/wordprocessingInk" xmlns:wne="http://schemas.microsoft.com/office/word/2006/wordml" xmlns:wps="http://schemas.microsoft.com/office/word/2010/wordprocessingShape" mc:Ignorable="w14 w15 w16se w16cid w16 w16cex w16sdtdh wp14">
   <w:body>
     <w:p>
       <w:pPr>
@@ -37,17 +37,17 @@
         </w:rPr>
       </w:pPr>
     </w:p>
-    <w:bookmarkStart w:id="0" w:name="_Toc435089160" w:displacedByCustomXml="next"/>
-    <w:bookmarkStart w:id="1" w:name="_Toc402261032" w:displacedByCustomXml="next"/>
-    <w:bookmarkStart w:id="2" w:name="_Toc409096411" w:displacedByCustomXml="next"/>
-    <w:bookmarkStart w:id="3" w:name="_Toc410226779" w:displacedByCustomXml="next"/>
-    <w:bookmarkStart w:id="4" w:name="_Toc410286731" w:displacedByCustomXml="next"/>
+    <w:bookmarkStart w:id="0" w:name="_Toc98332567" w:displacedByCustomXml="next"/>
+    <w:bookmarkStart w:id="1" w:name="_Toc98329161" w:displacedByCustomXml="next"/>
+    <w:bookmarkStart w:id="2" w:name="_Toc426545466" w:displacedByCustomXml="next"/>
+    <w:bookmarkStart w:id="3" w:name="_Toc426545102" w:displacedByCustomXml="next"/>
+    <w:bookmarkStart w:id="4" w:name="_Toc426544400" w:displacedByCustomXml="next"/>
     <w:bookmarkStart w:id="5" w:name="_Toc410652409" w:displacedByCustomXml="next"/>
-    <w:bookmarkStart w:id="6" w:name="_Toc426544400" w:displacedByCustomXml="next"/>
-    <w:bookmarkStart w:id="7" w:name="_Toc426545102" w:displacedByCustomXml="next"/>
-    <w:bookmarkStart w:id="8" w:name="_Toc426545466" w:displacedByCustomXml="next"/>
-    <w:bookmarkStart w:id="9" w:name="_Toc98329161" w:displacedByCustomXml="next"/>
-    <w:bookmarkStart w:id="10" w:name="_Toc98332567" w:displacedByCustomXml="next"/>
+    <w:bookmarkStart w:id="6" w:name="_Toc410286731" w:displacedByCustomXml="next"/>
+    <w:bookmarkStart w:id="7" w:name="_Toc410226779" w:displacedByCustomXml="next"/>
+    <w:bookmarkStart w:id="8" w:name="_Toc409096411" w:displacedByCustomXml="next"/>
+    <w:bookmarkStart w:id="9" w:name="_Toc402261032" w:displacedByCustomXml="next"/>
+    <w:bookmarkStart w:id="10" w:name="_Toc435089160" w:displacedByCustomXml="next"/>
     <w:sdt>
       <w:sdtPr>
         <w:rPr>
@@ -75,8 +75,8 @@
         </w:rPr>
       </w:sdtEndPr>
       <w:sdtContent>
-        <w:bookmarkStart w:id="11" w:name="_Toc320016168" w:displacedByCustomXml="prev"/>
-        <w:bookmarkStart w:id="12" w:name="_Toc266280202" w:displacedByCustomXml="prev"/>
+        <w:bookmarkStart w:id="11" w:name="_Toc266280202" w:displacedByCustomXml="prev"/>
+        <w:bookmarkStart w:id="12" w:name="_Toc320016168" w:displacedByCustomXml="prev"/>
         <w:p>
           <w:pPr>
             <w:pStyle w:val="Heading1"/>
@@ -472,6 +472,61 @@
                 </w:pPr>
                 <w:r>
                   <w:t>Dusan Palider</w:t>
+                </w:r>
+              </w:p>
+            </w:tc>
+          </w:tr>
+          <w:tr>
+            <w:trPr>
+              <w:cnfStyle w:val="000000100000" w:firstRow="0" w:lastRow="0" w:firstColumn="0" w:lastColumn="0" w:oddVBand="0" w:evenVBand="0" w:oddHBand="1" w:evenHBand="0" w:firstRowFirstColumn="0" w:firstRowLastColumn="0" w:lastRowFirstColumn="0" w:lastRowLastColumn="0"/>
+            </w:trPr>
+            <w:tc>
+              <w:tcPr>
+                <w:cnfStyle w:val="001000000000" w:firstRow="0" w:lastRow="0" w:firstColumn="1" w:lastColumn="0" w:oddVBand="0" w:evenVBand="0" w:oddHBand="0" w:evenHBand="0" w:firstRowFirstColumn="0" w:firstRowLastColumn="0" w:lastRowFirstColumn="0" w:lastRowLastColumn="0"/>
+                <w:tcW w:w="1188" w:type="dxa"/>
+              </w:tcPr>
+              <w:p>
+                <w:r>
+                  <w:t>17</w:t>
+                </w:r>
+              </w:p>
+            </w:tc>
+            <w:tc>
+              <w:tcPr>
+                <w:tcW w:w="1278" w:type="dxa"/>
+              </w:tcPr>
+              <w:p>
+                <w:pPr>
+                  <w:cnfStyle w:val="000000100000" w:firstRow="0" w:lastRow="0" w:firstColumn="0" w:lastColumn="0" w:oddVBand="0" w:evenVBand="0" w:oddHBand="1" w:evenHBand="0" w:firstRowFirstColumn="0" w:firstRowLastColumn="0" w:lastRowFirstColumn="0" w:lastRowLastColumn="0"/>
+                </w:pPr>
+                <w:r>
+                  <w:t>3/21/2023</w:t>
+                </w:r>
+              </w:p>
+            </w:tc>
+            <w:tc>
+              <w:tcPr>
+                <w:tcW w:w="4726" w:type="dxa"/>
+              </w:tcPr>
+              <w:p>
+                <w:pPr>
+                  <w:cnfStyle w:val="000000100000" w:firstRow="0" w:lastRow="0" w:firstColumn="0" w:lastColumn="0" w:oddVBand="0" w:evenVBand="0" w:oddHBand="1" w:evenHBand="0" w:firstRowFirstColumn="0" w:firstRowLastColumn="0" w:lastRowFirstColumn="0" w:lastRowLastColumn="0"/>
+                </w:pPr>
+                <w:r>
+                  <w:t>As of IES.2023.9 .Net Framework 4.8.0 is needed (Developer Pack should do the trick)</w:t>
+                </w:r>
+              </w:p>
+            </w:tc>
+            <w:tc>
+              <w:tcPr>
+                <w:tcW w:w="1772" w:type="dxa"/>
+              </w:tcPr>
+              <w:p>
+                <w:pPr>
+                  <w:cnfStyle w:val="000000100000" w:firstRow="0" w:lastRow="0" w:firstColumn="0" w:lastColumn="0" w:oddVBand="0" w:evenVBand="0" w:oddHBand="1" w:evenHBand="0" w:firstRowFirstColumn="0" w:firstRowLastColumn="0" w:lastRowFirstColumn="0" w:lastRowLastColumn="0"/>
+                </w:pPr>
+                <w:r>
+                  <w:t>Hazrat Rafiqzadah</w:t>
                 </w:r>
               </w:p>
             </w:tc>
@@ -1228,7 +1283,15 @@
     </w:p>
     <w:p>
       <w:r>
-        <w:t xml:space="preserve">This document provides instructions on how to deploy, or </w:t>
+        <w:t xml:space="preserve">This document provides instructions on how to </w:t>
+      </w:r>
+      <w:proofErr w:type="gramStart"/>
+      <w:r>
+        <w:t>deploy, or</w:t>
+      </w:r>
+      <w:proofErr w:type="gramEnd"/>
+      <w:r>
+        <w:t xml:space="preserve"> </w:t>
       </w:r>
       <w:r>
         <w:t>upgrade</w:t>
@@ -1542,14 +1605,30 @@
           <w:b/>
           <w:i/>
         </w:rPr>
-        <w:t>Only for the initial deployment</w:t>
-      </w:r>
+        <w:t xml:space="preserve">Only for the initial </w:t>
+      </w:r>
+      <w:proofErr w:type="gramStart"/>
       <w:r>
         <w:rPr>
           <w:b/>
           <w:i/>
         </w:rPr>
-        <w:t>; if you are doing an upgrade, the following should already have been setup</w:t>
+        <w:t>deployment</w:t>
+      </w:r>
+      <w:r>
+        <w:rPr>
+          <w:b/>
+          <w:i/>
+        </w:rPr>
+        <w:t>;</w:t>
+      </w:r>
+      <w:proofErr w:type="gramEnd"/>
+      <w:r>
+        <w:rPr>
+          <w:b/>
+          <w:i/>
+        </w:rPr>
+        <w:t xml:space="preserve"> if you are doing an upgrade, the following should already have been setup</w:t>
       </w:r>
     </w:p>
     <w:p>
@@ -1582,7 +1661,13 @@
         <w:t xml:space="preserve"> with IIS and .Net 4.</w:t>
       </w:r>
       <w:r>
-        <w:t>6.2</w:t>
+        <w:t>8</w:t>
+      </w:r>
+      <w:r>
+        <w:t>.</w:t>
+      </w:r>
+      <w:r>
+        <w:t>0</w:t>
       </w:r>
       <w:r>
         <w:t xml:space="preserve"> or higher </w:t>
@@ -1714,9 +1799,14 @@
         <w:t>, Resource Accounts</w:t>
       </w:r>
       <w:r>
-        <w:t>, etc</w:t>
+        <w:t xml:space="preserve">, </w:t>
+      </w:r>
+      <w:proofErr w:type="spellStart"/>
+      <w:r>
+        <w:t>etc</w:t>
       </w:r>
       <w:bookmarkEnd w:id="39"/>
+      <w:proofErr w:type="spellEnd"/>
     </w:p>
     <w:p>
       <w:pPr>
@@ -1739,6 +1829,7 @@
         </w:numPr>
         <w:ind w:left="1260"/>
       </w:pPr>
+      <w:proofErr w:type="spellStart"/>
       <w:r>
         <w:rPr>
           <w:rFonts w:ascii="Consolas" w:eastAsiaTheme="minorHAnsi" w:hAnsi="Consolas" w:cs="Consolas"/>
@@ -1748,6 +1839,7 @@
         </w:rPr>
         <w:t>DomesticUsersGroup</w:t>
       </w:r>
+      <w:proofErr w:type="spellEnd"/>
       <w:r>
         <w:t xml:space="preserve"> – users that are considered domestic (not international)</w:t>
       </w:r>
@@ -1761,6 +1853,7 @@
         </w:numPr>
         <w:ind w:left="1260"/>
       </w:pPr>
+      <w:proofErr w:type="spellStart"/>
       <w:r>
         <w:rPr>
           <w:rFonts w:ascii="Consolas" w:eastAsiaTheme="minorHAnsi" w:hAnsi="Consolas" w:cs="Consolas"/>
@@ -1770,6 +1863,7 @@
         </w:rPr>
         <w:t>SubsTreatedAsLmEmployees</w:t>
       </w:r>
+      <w:proofErr w:type="spellEnd"/>
       <w:r>
         <w:rPr>
           <w:rFonts w:ascii="Consolas" w:eastAsiaTheme="minorHAnsi" w:hAnsi="Consolas" w:cs="Consolas"/>
@@ -1795,6 +1889,7 @@
         </w:numPr>
         <w:ind w:left="1260"/>
       </w:pPr>
+      <w:proofErr w:type="spellStart"/>
       <w:r>
         <w:rPr>
           <w:rFonts w:ascii="Consolas" w:eastAsiaTheme="minorHAnsi" w:hAnsi="Consolas" w:cs="Consolas"/>
@@ -1802,13 +1897,31 @@
           <w:sz w:val="19"/>
           <w:szCs w:val="19"/>
         </w:rPr>
-        <w:t xml:space="preserve">UsersAllowedProPricerAccess </w:t>
+        <w:t>UsersAllowedProPricerAccess</w:t>
+      </w:r>
+      <w:proofErr w:type="spellEnd"/>
+      <w:r>
+        <w:rPr>
+          <w:rFonts w:ascii="Consolas" w:eastAsiaTheme="minorHAnsi" w:hAnsi="Consolas" w:cs="Consolas"/>
+          <w:color w:val="0000FF"/>
+          <w:sz w:val="19"/>
+          <w:szCs w:val="19"/>
+        </w:rPr>
+        <w:t xml:space="preserve"> </w:t>
       </w:r>
       <w:r>
         <w:t xml:space="preserve">– </w:t>
       </w:r>
       <w:r>
-        <w:t>users that are allowed to generate ProPricer exports</w:t>
+        <w:t xml:space="preserve">users that are allowed to generate </w:t>
+      </w:r>
+      <w:proofErr w:type="spellStart"/>
+      <w:r>
+        <w:t>ProPricer</w:t>
+      </w:r>
+      <w:proofErr w:type="spellEnd"/>
+      <w:r>
+        <w:t xml:space="preserve"> exports</w:t>
       </w:r>
     </w:p>
     <w:p>
@@ -1820,6 +1933,7 @@
         </w:numPr>
         <w:ind w:left="1260"/>
       </w:pPr>
+      <w:proofErr w:type="spellStart"/>
       <w:r>
         <w:rPr>
           <w:rFonts w:ascii="Consolas" w:eastAsiaTheme="minorHAnsi" w:hAnsi="Consolas" w:cs="Consolas"/>
@@ -1829,6 +1943,7 @@
         </w:rPr>
         <w:t>system.web</w:t>
       </w:r>
+      <w:proofErr w:type="spellEnd"/>
       <w:r>
         <w:rPr>
           <w:rFonts w:ascii="Consolas" w:eastAsiaTheme="minorHAnsi" w:hAnsi="Consolas" w:cs="Consolas"/>
@@ -1887,6 +2002,7 @@
         </w:numPr>
         <w:ind w:left="1260"/>
       </w:pPr>
+      <w:proofErr w:type="spellStart"/>
       <w:r>
         <w:rPr>
           <w:rFonts w:ascii="Consolas" w:eastAsiaTheme="minorHAnsi" w:hAnsi="Consolas" w:cs="Consolas"/>
@@ -1896,6 +2012,7 @@
         </w:rPr>
         <w:t>elmah</w:t>
       </w:r>
+      <w:proofErr w:type="spellEnd"/>
       <w:r>
         <w:t xml:space="preserve"> </w:t>
       </w:r>
@@ -1950,6 +2067,7 @@
       <w:r>
         <w:t>. The account that we use is “</w:t>
       </w:r>
+      <w:proofErr w:type="spellStart"/>
       <w:r>
         <w:rPr>
           <w:rFonts w:ascii="Consolas" w:eastAsiaTheme="minorHAnsi" w:hAnsi="Consolas" w:cs="Consolas"/>
@@ -1959,6 +2077,7 @@
         </w:rPr>
         <w:t>genapps</w:t>
       </w:r>
+      <w:proofErr w:type="spellEnd"/>
       <w:r>
         <w:rPr>
           <w:rFonts w:eastAsiaTheme="minorHAnsi" w:cstheme="minorHAnsi"/>
@@ -1988,6 +2107,7 @@
         </w:numPr>
         <w:ind w:left="1260"/>
       </w:pPr>
+      <w:proofErr w:type="spellStart"/>
       <w:r>
         <w:rPr>
           <w:rFonts w:ascii="Consolas" w:eastAsiaTheme="minorHAnsi" w:hAnsi="Consolas" w:cs="Consolas"/>
@@ -1997,6 +2117,7 @@
         </w:rPr>
         <w:t>HelpdeskEmailAddress</w:t>
       </w:r>
+      <w:proofErr w:type="spellEnd"/>
     </w:p>
     <w:p>
       <w:pPr>
@@ -2066,8 +2187,9 @@
           <w:iCs/>
           <w:color w:val="C0504D" w:themeColor="accent2"/>
         </w:rPr>
-        <w:t xml:space="preserve">the IIS </w:t>
-      </w:r>
+        <w:t xml:space="preserve">the </w:t>
+      </w:r>
+      <w:proofErr w:type="gramStart"/>
       <w:r>
         <w:rPr>
           <w:rFonts w:ascii="Calibri" w:eastAsia="Times New Roman" w:hAnsi="Calibri" w:cs="Calibri"/>
@@ -2075,7 +2197,7 @@
           <w:iCs/>
           <w:color w:val="C0504D" w:themeColor="accent2"/>
         </w:rPr>
-        <w:t xml:space="preserve"> instructions </w:t>
+        <w:t xml:space="preserve">IIS </w:t>
       </w:r>
       <w:r>
         <w:rPr>
@@ -2084,8 +2206,9 @@
           <w:iCs/>
           <w:color w:val="C0504D" w:themeColor="accent2"/>
         </w:rPr>
-        <w:t xml:space="preserve">were written circa 2014 by a server admin at the time. </w:t>
-      </w:r>
+        <w:t xml:space="preserve"> instructions</w:t>
+      </w:r>
+      <w:proofErr w:type="gramEnd"/>
       <w:r>
         <w:rPr>
           <w:rFonts w:ascii="Calibri" w:eastAsia="Times New Roman" w:hAnsi="Calibri" w:cs="Calibri"/>
@@ -2093,7 +2216,7 @@
           <w:iCs/>
           <w:color w:val="C0504D" w:themeColor="accent2"/>
         </w:rPr>
-        <w:t>I’m a developer</w:t>
+        <w:t xml:space="preserve"> </w:t>
       </w:r>
       <w:r>
         <w:rPr>
@@ -2102,7 +2225,7 @@
           <w:iCs/>
           <w:color w:val="C0504D" w:themeColor="accent2"/>
         </w:rPr>
-        <w:t xml:space="preserve"> and have no clue if they are still accurate, or if things changed. Please let me know if 1) you need help and we’ll get an admin to help you, or 2) </w:t>
+        <w:t xml:space="preserve">were written circa 2014 by a server admin at the time. </w:t>
       </w:r>
       <w:r>
         <w:rPr>
@@ -2111,7 +2234,7 @@
           <w:iCs/>
           <w:color w:val="C0504D" w:themeColor="accent2"/>
         </w:rPr>
-        <w:t xml:space="preserve">you </w:t>
+        <w:t>I’m a developer</w:t>
       </w:r>
       <w:r>
         <w:rPr>
@@ -2120,7 +2243,7 @@
           <w:iCs/>
           <w:color w:val="C0504D" w:themeColor="accent2"/>
         </w:rPr>
-        <w:t xml:space="preserve">know of </w:t>
+        <w:t xml:space="preserve"> and have no clue if they are still accurate, or if things changed. Please let me know if 1) you need help and we’ll get an admin to help you, or 2) </w:t>
       </w:r>
       <w:r>
         <w:rPr>
@@ -2129,7 +2252,7 @@
           <w:iCs/>
           <w:color w:val="C0504D" w:themeColor="accent2"/>
         </w:rPr>
-        <w:t>a better way</w:t>
+        <w:t xml:space="preserve">you </w:t>
       </w:r>
       <w:r>
         <w:rPr>
@@ -2138,6 +2261,24 @@
           <w:iCs/>
           <w:color w:val="C0504D" w:themeColor="accent2"/>
         </w:rPr>
+        <w:t xml:space="preserve">know of </w:t>
+      </w:r>
+      <w:r>
+        <w:rPr>
+          <w:rFonts w:ascii="Calibri" w:eastAsia="Times New Roman" w:hAnsi="Calibri" w:cs="Calibri"/>
+          <w:i/>
+          <w:iCs/>
+          <w:color w:val="C0504D" w:themeColor="accent2"/>
+        </w:rPr>
+        <w:t>a better way</w:t>
+      </w:r>
+      <w:r>
+        <w:rPr>
+          <w:rFonts w:ascii="Calibri" w:eastAsia="Times New Roman" w:hAnsi="Calibri" w:cs="Calibri"/>
+          <w:i/>
+          <w:iCs/>
+          <w:color w:val="C0504D" w:themeColor="accent2"/>
+        </w:rPr>
         <w:t>, and we can update the instructions</w:t>
       </w:r>
     </w:p>
@@ -2168,7 +2309,21 @@
         <w:rPr>
           <w:rFonts w:ascii="Calibri" w:eastAsia="Times New Roman" w:hAnsi="Calibri" w:cs="Calibri"/>
         </w:rPr>
-        <w:t>Create a directory that will hold the sites files (e.g. E:\web_folders\genboe)</w:t>
+        <w:t>Create a directory that will hold the sites files (</w:t>
+      </w:r>
+      <w:proofErr w:type="gramStart"/>
+      <w:r>
+        <w:rPr>
+          <w:rFonts w:ascii="Calibri" w:eastAsia="Times New Roman" w:hAnsi="Calibri" w:cs="Calibri"/>
+        </w:rPr>
+        <w:t>e.g.</w:t>
+      </w:r>
+      <w:proofErr w:type="gramEnd"/>
+      <w:r>
+        <w:rPr>
+          <w:rFonts w:ascii="Calibri" w:eastAsia="Times New Roman" w:hAnsi="Calibri" w:cs="Calibri"/>
+        </w:rPr>
+        <w:t xml:space="preserve"> E:\web_folders\genboe)</w:t>
       </w:r>
     </w:p>
     <w:p>
@@ -2188,7 +2343,21 @@
         <w:rPr>
           <w:rFonts w:ascii="Calibri" w:eastAsia="Times New Roman" w:hAnsi="Calibri" w:cs="Calibri"/>
         </w:rPr>
-        <w:t>Add read permissions to the directory for the App Pool identity  (resource account</w:t>
+        <w:t xml:space="preserve">Add read permissions to the directory for the App Pool </w:t>
+      </w:r>
+      <w:proofErr w:type="gramStart"/>
+      <w:r>
+        <w:rPr>
+          <w:rFonts w:ascii="Calibri" w:eastAsia="Times New Roman" w:hAnsi="Calibri" w:cs="Calibri"/>
+        </w:rPr>
+        <w:t>identity  (</w:t>
+      </w:r>
+      <w:proofErr w:type="gramEnd"/>
+      <w:r>
+        <w:rPr>
+          <w:rFonts w:ascii="Calibri" w:eastAsia="Times New Roman" w:hAnsi="Calibri" w:cs="Calibri"/>
+        </w:rPr>
+        <w:t>resource account</w:t>
       </w:r>
       <w:r>
         <w:rPr>
@@ -2220,8 +2389,16 @@
         <w:rPr>
           <w:rFonts w:ascii="Calibri" w:eastAsia="Times New Roman" w:hAnsi="Calibri" w:cs="Calibri"/>
         </w:rPr>
-        <w:t>Create an App Pool named prod_genboe</w:t>
-      </w:r>
+        <w:t xml:space="preserve">Create an App Pool named </w:t>
+      </w:r>
+      <w:proofErr w:type="spellStart"/>
+      <w:r>
+        <w:rPr>
+          <w:rFonts w:ascii="Calibri" w:eastAsia="Times New Roman" w:hAnsi="Calibri" w:cs="Calibri"/>
+        </w:rPr>
+        <w:t>prod_genboe</w:t>
+      </w:r>
+      <w:proofErr w:type="spellEnd"/>
     </w:p>
     <w:p>
       <w:pPr>
@@ -2241,6 +2418,12 @@
         </w:rPr>
         <w:t>Select .NET framework 4</w:t>
       </w:r>
+      <w:r>
+        <w:rPr>
+          <w:rFonts w:ascii="Calibri" w:eastAsia="Times New Roman" w:hAnsi="Calibri" w:cs="Calibri"/>
+        </w:rPr>
+        <w:t>.8.0</w:t>
+      </w:r>
     </w:p>
     <w:p>
       <w:pPr>
@@ -2359,8 +2542,16 @@
         <w:rPr>
           <w:rFonts w:ascii="Calibri" w:eastAsia="Times New Roman" w:hAnsi="Calibri" w:cs="Calibri"/>
         </w:rPr>
-        <w:t>Create a web site named genboe_prod</w:t>
-      </w:r>
+        <w:t xml:space="preserve">Create a web site named </w:t>
+      </w:r>
+      <w:proofErr w:type="spellStart"/>
+      <w:r>
+        <w:rPr>
+          <w:rFonts w:ascii="Calibri" w:eastAsia="Times New Roman" w:hAnsi="Calibri" w:cs="Calibri"/>
+        </w:rPr>
+        <w:t>genboe_prod</w:t>
+      </w:r>
+      <w:proofErr w:type="spellEnd"/>
     </w:p>
     <w:p>
       <w:pPr>
@@ -2570,7 +2761,15 @@
         </w:numPr>
       </w:pPr>
       <w:r>
-        <w:t>Copy the contents of the genBoe web application</w:t>
+        <w:t xml:space="preserve">Copy the contents of the </w:t>
+      </w:r>
+      <w:proofErr w:type="spellStart"/>
+      <w:r>
+        <w:t>genBoe</w:t>
+      </w:r>
+      <w:proofErr w:type="spellEnd"/>
+      <w:r>
+        <w:t xml:space="preserve"> web application</w:t>
       </w:r>
       <w:r>
         <w:t xml:space="preserve"> folder</w:t>
@@ -2642,7 +2841,15 @@
         </w:numPr>
       </w:pPr>
       <w:r>
-        <w:t>If you see the application load up without any styles, with console script errors, etc, please check the permissions of these folders</w:t>
+        <w:t xml:space="preserve">If you see the application load up without any styles, with console script errors, </w:t>
+      </w:r>
+      <w:proofErr w:type="spellStart"/>
+      <w:r>
+        <w:t>etc</w:t>
+      </w:r>
+      <w:proofErr w:type="spellEnd"/>
+      <w:r>
+        <w:t>, please check the permissions of these folders</w:t>
       </w:r>
     </w:p>
     <w:p>
@@ -2653,8 +2860,13 @@
           <w:numId w:val="1"/>
         </w:numPr>
       </w:pPr>
-      <w:r>
-        <w:t>Additionally sometimes it’s necessary to configure IIS to handle static files correctly, which could also result in similar issues described above</w:t>
+      <w:proofErr w:type="gramStart"/>
+      <w:r>
+        <w:t>Additionally</w:t>
+      </w:r>
+      <w:proofErr w:type="gramEnd"/>
+      <w:r>
+        <w:t xml:space="preserve"> sometimes it’s necessary to configure IIS to handle static files correctly, which could also result in similar issues described above</w:t>
       </w:r>
     </w:p>
     <w:p>
@@ -2675,7 +2887,15 @@
         <w:t>C</w:t>
       </w:r>
       <w:r>
-        <w:t>onfigure the web application to your environment by editing the web.config. Instructions for the changes are found in Appendix B</w:t>
+        <w:t xml:space="preserve">onfigure the web application to your environment by editing the </w:t>
+      </w:r>
+      <w:proofErr w:type="spellStart"/>
+      <w:r>
+        <w:t>web.config</w:t>
+      </w:r>
+      <w:proofErr w:type="spellEnd"/>
+      <w:r>
+        <w:t>. Instructions for the changes are found in Appendix B</w:t>
       </w:r>
     </w:p>
     <w:p>
@@ -2735,8 +2955,13 @@
           <w:numId w:val="1"/>
         </w:numPr>
       </w:pPr>
-      <w:r>
-        <w:t>Both of these should be placed in an appropriate folder on your server</w:t>
+      <w:proofErr w:type="gramStart"/>
+      <w:r>
+        <w:t>Both of these</w:t>
+      </w:r>
+      <w:proofErr w:type="gramEnd"/>
+      <w:r>
+        <w:t xml:space="preserve"> should be placed in an appropriate folder on your server</w:t>
       </w:r>
     </w:p>
     <w:p>
@@ -2777,6 +3002,7 @@
       <w:r>
         <w:t xml:space="preserve"> </w:t>
       </w:r>
+      <w:proofErr w:type="spellStart"/>
       <w:r>
         <w:rPr>
           <w:rFonts w:ascii="Consolas" w:hAnsi="Consolas"/>
@@ -2785,6 +3011,7 @@
         </w:rPr>
         <w:t>GenBOE.ADSync.exe.config</w:t>
       </w:r>
+      <w:proofErr w:type="spellEnd"/>
       <w:r>
         <w:t xml:space="preserve"> according to Appendix C</w:t>
       </w:r>
@@ -2806,6 +3033,7 @@
       <w:r>
         <w:t xml:space="preserve">– please configure the </w:t>
       </w:r>
+      <w:proofErr w:type="spellStart"/>
       <w:r>
         <w:rPr>
           <w:rFonts w:ascii="Consolas" w:hAnsi="Consolas"/>
@@ -2814,6 +3042,7 @@
         </w:rPr>
         <w:t>GenBOE.AutoBackup.exe.config</w:t>
       </w:r>
+      <w:proofErr w:type="spellEnd"/>
       <w:r>
         <w:t xml:space="preserve"> </w:t>
       </w:r>
@@ -2860,6 +3089,7 @@
       <w:r>
         <w:t xml:space="preserve"> the </w:t>
       </w:r>
+      <w:proofErr w:type="spellStart"/>
       <w:r>
         <w:rPr>
           <w:rFonts w:ascii="Consolas" w:hAnsi="Consolas"/>
@@ -2868,6 +3098,7 @@
         </w:rPr>
         <w:t>GenBOEUser</w:t>
       </w:r>
+      <w:proofErr w:type="spellEnd"/>
       <w:r>
         <w:rPr>
           <w:sz w:val="20"/>
@@ -2945,6 +3176,7 @@
           <w:numId w:val="1"/>
         </w:numPr>
       </w:pPr>
+      <w:proofErr w:type="spellStart"/>
       <w:r>
         <w:rPr>
           <w:rFonts w:ascii="Consolas" w:eastAsiaTheme="minorHAnsi" w:hAnsi="Consolas" w:cs="Consolas"/>
@@ -2954,6 +3186,7 @@
         </w:rPr>
         <w:t>RmsHelpBaseLink</w:t>
       </w:r>
+      <w:proofErr w:type="spellEnd"/>
       <w:r>
         <w:t xml:space="preserve"> </w:t>
       </w:r>
@@ -2976,10 +3209,7 @@
         </w:numPr>
       </w:pPr>
       <w:r>
-        <w:t>Space</w:t>
-      </w:r>
-      <w:r>
-        <w:t xml:space="preserve"> doesn’t use these files in the application</w:t>
+        <w:t>Space doesn’t use these files in the application</w:t>
       </w:r>
     </w:p>
     <w:p>
@@ -2990,6 +3220,7 @@
           <w:numId w:val="1"/>
         </w:numPr>
       </w:pPr>
+      <w:proofErr w:type="spellStart"/>
       <w:r>
         <w:rPr>
           <w:rFonts w:ascii="Consolas" w:eastAsiaTheme="minorHAnsi" w:hAnsi="Consolas" w:cs="Consolas"/>
@@ -2999,6 +3230,7 @@
         </w:rPr>
         <w:t>MOQHelpBaseUrl</w:t>
       </w:r>
+      <w:proofErr w:type="spellEnd"/>
       <w:r>
         <w:t xml:space="preserve"> </w:t>
       </w:r>
@@ -3042,7 +3274,15 @@
         </w:numPr>
       </w:pPr>
       <w:r>
-        <w:t>Please copy files from the “Help Files” folder into appropriate folders, and ensure that permissions are configured correctly.</w:t>
+        <w:t xml:space="preserve">Please copy files from the “Help Files” folder into appropriate </w:t>
+      </w:r>
+      <w:proofErr w:type="gramStart"/>
+      <w:r>
+        <w:t>folders, and</w:t>
+      </w:r>
+      <w:proofErr w:type="gramEnd"/>
+      <w:r>
+        <w:t xml:space="preserve"> ensure that permissions are configured correctly.</w:t>
       </w:r>
       <w:r>
         <w:br w:type="page"/>
@@ -3111,28 +3351,9 @@
           <w:sz w:val="20"/>
           <w:szCs w:val="20"/>
         </w:rPr>
-        <w:t>DECLARE @ntid VARCHAR(50) = '';</w:t>
-      </w:r>
-      <w:r>
-        <w:rPr>
-          <w:color w:val="548DD4" w:themeColor="text2" w:themeTint="99"/>
-        </w:rPr>
-        <w:t xml:space="preserve"> </w:t>
-      </w:r>
-      <w:r>
-        <w:t>- lowercased NTID of the system admin, no domain</w:t>
-      </w:r>
-    </w:p>
-    <w:p>
-      <w:pPr>
-        <w:spacing w:after="0"/>
-        <w:ind w:firstLine="720"/>
-        <w:rPr>
-          <w:rFonts w:ascii="Consolas" w:hAnsi="Consolas"/>
-          <w:sz w:val="20"/>
-          <w:szCs w:val="20"/>
-        </w:rPr>
-      </w:pPr>
+        <w:t xml:space="preserve">DECLARE @ntid </w:t>
+      </w:r>
+      <w:proofErr w:type="gramStart"/>
       <w:r>
         <w:rPr>
           <w:rFonts w:ascii="Consolas" w:hAnsi="Consolas"/>
@@ -3140,22 +3361,9 @@
           <w:sz w:val="20"/>
           <w:szCs w:val="20"/>
         </w:rPr>
-        <w:t xml:space="preserve">DECLARE @displayName VARCHAR(50) = ''; </w:t>
-      </w:r>
-      <w:r>
-        <w:t>- Display name of the system admin</w:t>
-      </w:r>
-    </w:p>
-    <w:p>
-      <w:pPr>
-        <w:spacing w:after="0"/>
-        <w:ind w:firstLine="720"/>
-        <w:rPr>
-          <w:rFonts w:ascii="Consolas" w:hAnsi="Consolas"/>
-          <w:sz w:val="20"/>
-          <w:szCs w:val="20"/>
-        </w:rPr>
-      </w:pPr>
+        <w:t>VARCHAR(</w:t>
+      </w:r>
+      <w:proofErr w:type="gramEnd"/>
       <w:r>
         <w:rPr>
           <w:rFonts w:ascii="Consolas" w:hAnsi="Consolas"/>
@@ -3163,10 +3371,16 @@
           <w:sz w:val="20"/>
           <w:szCs w:val="20"/>
         </w:rPr>
-        <w:t xml:space="preserve">DECLARE @firstName VARCHAR(50) = ''; </w:t>
-      </w:r>
-      <w:r>
-        <w:t>- First name of the system admin</w:t>
+        <w:t>50) = '';</w:t>
+      </w:r>
+      <w:r>
+        <w:rPr>
+          <w:color w:val="548DD4" w:themeColor="text2" w:themeTint="99"/>
+        </w:rPr>
+        <w:t xml:space="preserve"> </w:t>
+      </w:r>
+      <w:r>
+        <w:t>- lowercased NTID of the system admin, no domain</w:t>
       </w:r>
     </w:p>
     <w:p>
@@ -3186,23 +3400,9 @@
           <w:sz w:val="20"/>
           <w:szCs w:val="20"/>
         </w:rPr>
-        <w:t>DECLARE @lastName VARCHAR(50) = '';</w:t>
-      </w:r>
-      <w:r>
-        <w:rPr>
-          <w:color w:val="548DD4" w:themeColor="text2" w:themeTint="99"/>
-        </w:rPr>
-        <w:t xml:space="preserve"> </w:t>
-      </w:r>
-      <w:r>
-        <w:t>- Last name of the system admin</w:t>
-      </w:r>
-    </w:p>
-    <w:p>
-      <w:pPr>
-        <w:spacing w:after="0"/>
-        <w:ind w:firstLine="720"/>
-      </w:pPr>
+        <w:t xml:space="preserve">DECLARE @displayName </w:t>
+      </w:r>
+      <w:proofErr w:type="gramStart"/>
       <w:r>
         <w:rPr>
           <w:rFonts w:ascii="Consolas" w:hAnsi="Consolas"/>
@@ -3210,30 +3410,9 @@
           <w:sz w:val="20"/>
           <w:szCs w:val="20"/>
         </w:rPr>
-        <w:t>DECLARE @email VARCHAR(50) = '';</w:t>
-      </w:r>
-      <w:r>
-        <w:rPr>
-          <w:rFonts w:ascii="Consolas" w:hAnsi="Consolas"/>
-          <w:sz w:val="20"/>
-          <w:szCs w:val="20"/>
-        </w:rPr>
-        <w:t xml:space="preserve"> </w:t>
-      </w:r>
-      <w:r>
-        <w:t>- Email of the system admin</w:t>
-      </w:r>
-    </w:p>
-    <w:p>
-      <w:pPr>
-        <w:spacing w:after="0"/>
-        <w:ind w:firstLine="720"/>
-        <w:rPr>
-          <w:rFonts w:ascii="Consolas" w:hAnsi="Consolas"/>
-          <w:sz w:val="20"/>
-          <w:szCs w:val="20"/>
-        </w:rPr>
-      </w:pPr>
+        <w:t>VARCHAR(</w:t>
+      </w:r>
+      <w:proofErr w:type="gramEnd"/>
       <w:r>
         <w:rPr>
           <w:rFonts w:ascii="Consolas" w:hAnsi="Consolas"/>
@@ -3241,7 +3420,188 @@
           <w:sz w:val="20"/>
           <w:szCs w:val="20"/>
         </w:rPr>
-        <w:t>DECLARE @systemNtid = VARCHAR(50) = '';</w:t>
+        <w:t xml:space="preserve">50) = ''; </w:t>
+      </w:r>
+      <w:r>
+        <w:t>- Display name of the system admin</w:t>
+      </w:r>
+    </w:p>
+    <w:p>
+      <w:pPr>
+        <w:spacing w:after="0"/>
+        <w:ind w:firstLine="720"/>
+        <w:rPr>
+          <w:rFonts w:ascii="Consolas" w:hAnsi="Consolas"/>
+          <w:sz w:val="20"/>
+          <w:szCs w:val="20"/>
+        </w:rPr>
+      </w:pPr>
+      <w:r>
+        <w:rPr>
+          <w:rFonts w:ascii="Consolas" w:hAnsi="Consolas"/>
+          <w:color w:val="548DD4" w:themeColor="text2" w:themeTint="99"/>
+          <w:sz w:val="20"/>
+          <w:szCs w:val="20"/>
+        </w:rPr>
+        <w:t xml:space="preserve">DECLARE @firstName </w:t>
+      </w:r>
+      <w:proofErr w:type="gramStart"/>
+      <w:r>
+        <w:rPr>
+          <w:rFonts w:ascii="Consolas" w:hAnsi="Consolas"/>
+          <w:color w:val="548DD4" w:themeColor="text2" w:themeTint="99"/>
+          <w:sz w:val="20"/>
+          <w:szCs w:val="20"/>
+        </w:rPr>
+        <w:t>VARCHAR(</w:t>
+      </w:r>
+      <w:proofErr w:type="gramEnd"/>
+      <w:r>
+        <w:rPr>
+          <w:rFonts w:ascii="Consolas" w:hAnsi="Consolas"/>
+          <w:color w:val="548DD4" w:themeColor="text2" w:themeTint="99"/>
+          <w:sz w:val="20"/>
+          <w:szCs w:val="20"/>
+        </w:rPr>
+        <w:t xml:space="preserve">50) = ''; </w:t>
+      </w:r>
+      <w:r>
+        <w:t>- First name of the system admin</w:t>
+      </w:r>
+    </w:p>
+    <w:p>
+      <w:pPr>
+        <w:spacing w:after="0"/>
+        <w:ind w:firstLine="720"/>
+        <w:rPr>
+          <w:rFonts w:ascii="Consolas" w:hAnsi="Consolas"/>
+          <w:sz w:val="20"/>
+          <w:szCs w:val="20"/>
+        </w:rPr>
+      </w:pPr>
+      <w:r>
+        <w:rPr>
+          <w:rFonts w:ascii="Consolas" w:hAnsi="Consolas"/>
+          <w:color w:val="548DD4" w:themeColor="text2" w:themeTint="99"/>
+          <w:sz w:val="20"/>
+          <w:szCs w:val="20"/>
+        </w:rPr>
+        <w:t xml:space="preserve">DECLARE @lastName </w:t>
+      </w:r>
+      <w:proofErr w:type="gramStart"/>
+      <w:r>
+        <w:rPr>
+          <w:rFonts w:ascii="Consolas" w:hAnsi="Consolas"/>
+          <w:color w:val="548DD4" w:themeColor="text2" w:themeTint="99"/>
+          <w:sz w:val="20"/>
+          <w:szCs w:val="20"/>
+        </w:rPr>
+        <w:t>VARCHAR(</w:t>
+      </w:r>
+      <w:proofErr w:type="gramEnd"/>
+      <w:r>
+        <w:rPr>
+          <w:rFonts w:ascii="Consolas" w:hAnsi="Consolas"/>
+          <w:color w:val="548DD4" w:themeColor="text2" w:themeTint="99"/>
+          <w:sz w:val="20"/>
+          <w:szCs w:val="20"/>
+        </w:rPr>
+        <w:t>50) = '';</w:t>
+      </w:r>
+      <w:r>
+        <w:rPr>
+          <w:color w:val="548DD4" w:themeColor="text2" w:themeTint="99"/>
+        </w:rPr>
+        <w:t xml:space="preserve"> </w:t>
+      </w:r>
+      <w:r>
+        <w:t>- Last name of the system admin</w:t>
+      </w:r>
+    </w:p>
+    <w:p>
+      <w:pPr>
+        <w:spacing w:after="0"/>
+        <w:ind w:firstLine="720"/>
+      </w:pPr>
+      <w:r>
+        <w:rPr>
+          <w:rFonts w:ascii="Consolas" w:hAnsi="Consolas"/>
+          <w:color w:val="548DD4" w:themeColor="text2" w:themeTint="99"/>
+          <w:sz w:val="20"/>
+          <w:szCs w:val="20"/>
+        </w:rPr>
+        <w:t xml:space="preserve">DECLARE @email </w:t>
+      </w:r>
+      <w:proofErr w:type="gramStart"/>
+      <w:r>
+        <w:rPr>
+          <w:rFonts w:ascii="Consolas" w:hAnsi="Consolas"/>
+          <w:color w:val="548DD4" w:themeColor="text2" w:themeTint="99"/>
+          <w:sz w:val="20"/>
+          <w:szCs w:val="20"/>
+        </w:rPr>
+        <w:t>VARCHAR(</w:t>
+      </w:r>
+      <w:proofErr w:type="gramEnd"/>
+      <w:r>
+        <w:rPr>
+          <w:rFonts w:ascii="Consolas" w:hAnsi="Consolas"/>
+          <w:color w:val="548DD4" w:themeColor="text2" w:themeTint="99"/>
+          <w:sz w:val="20"/>
+          <w:szCs w:val="20"/>
+        </w:rPr>
+        <w:t>50) = '';</w:t>
+      </w:r>
+      <w:r>
+        <w:rPr>
+          <w:rFonts w:ascii="Consolas" w:hAnsi="Consolas"/>
+          <w:sz w:val="20"/>
+          <w:szCs w:val="20"/>
+        </w:rPr>
+        <w:t xml:space="preserve"> </w:t>
+      </w:r>
+      <w:r>
+        <w:t>- Email of the system admin</w:t>
+      </w:r>
+    </w:p>
+    <w:p>
+      <w:pPr>
+        <w:spacing w:after="0"/>
+        <w:ind w:firstLine="720"/>
+        <w:rPr>
+          <w:rFonts w:ascii="Consolas" w:hAnsi="Consolas"/>
+          <w:sz w:val="20"/>
+          <w:szCs w:val="20"/>
+        </w:rPr>
+      </w:pPr>
+      <w:r>
+        <w:rPr>
+          <w:rFonts w:ascii="Consolas" w:hAnsi="Consolas"/>
+          <w:color w:val="548DD4" w:themeColor="text2" w:themeTint="99"/>
+          <w:sz w:val="20"/>
+          <w:szCs w:val="20"/>
+        </w:rPr>
+        <w:t xml:space="preserve">DECLARE @systemNtid = </w:t>
+      </w:r>
+      <w:proofErr w:type="gramStart"/>
+      <w:r>
+        <w:rPr>
+          <w:rFonts w:ascii="Consolas" w:hAnsi="Consolas"/>
+          <w:color w:val="548DD4" w:themeColor="text2" w:themeTint="99"/>
+          <w:sz w:val="20"/>
+          <w:szCs w:val="20"/>
+        </w:rPr>
+        <w:t>VARCHAR(</w:t>
+      </w:r>
+      <w:proofErr w:type="gramEnd"/>
+      <w:r>
+        <w:rPr>
+          <w:rFonts w:ascii="Consolas" w:hAnsi="Consolas"/>
+          <w:color w:val="548DD4" w:themeColor="text2" w:themeTint="99"/>
+          <w:sz w:val="20"/>
+          <w:szCs w:val="20"/>
+        </w:rPr>
+        <w:t>50) = '';</w:t>
       </w:r>
       <w:r>
         <w:t xml:space="preserve"> </w:t>
@@ -3317,7 +3677,15 @@
         <w:t xml:space="preserve"> </w:t>
       </w:r>
       <w:r>
-        <w:t>BOE Web.Config Customization</w:t>
+        <w:t xml:space="preserve">BOE </w:t>
+      </w:r>
+      <w:proofErr w:type="spellStart"/>
+      <w:r>
+        <w:t>Web.Config</w:t>
+      </w:r>
+      <w:proofErr w:type="spellEnd"/>
+      <w:r>
+        <w:t xml:space="preserve"> Customization</w:t>
       </w:r>
       <w:bookmarkEnd w:id="44"/>
       <w:bookmarkEnd w:id="45"/>
@@ -3331,6 +3699,7 @@
         </w:numPr>
         <w:spacing w:after="0"/>
       </w:pPr>
+      <w:proofErr w:type="spellStart"/>
       <w:r>
         <w:rPr>
           <w:rFonts w:ascii="Consolas" w:eastAsiaTheme="minorHAnsi" w:hAnsi="Consolas" w:cs="Consolas"/>
@@ -3340,6 +3709,7 @@
         </w:rPr>
         <w:t>connectionStrings</w:t>
       </w:r>
+      <w:proofErr w:type="spellEnd"/>
       <w:r>
         <w:rPr>
           <w:rFonts w:ascii="Calibri" w:eastAsia="Times New Roman" w:hAnsi="Calibri" w:cs="Calibri"/>
@@ -3356,6 +3726,7 @@
         </w:numPr>
         <w:spacing w:after="0"/>
       </w:pPr>
+      <w:proofErr w:type="spellStart"/>
       <w:r>
         <w:rPr>
           <w:rFonts w:ascii="Consolas" w:eastAsiaTheme="minorHAnsi" w:hAnsi="Consolas" w:cs="Consolas"/>
@@ -3365,6 +3736,7 @@
         </w:rPr>
         <w:t>genTracEntities</w:t>
       </w:r>
+      <w:proofErr w:type="spellEnd"/>
     </w:p>
     <w:p>
       <w:pPr>
@@ -3485,6 +3857,7 @@
         </w:numPr>
         <w:spacing w:after="0"/>
       </w:pPr>
+      <w:proofErr w:type="spellStart"/>
       <w:r>
         <w:rPr>
           <w:rFonts w:ascii="Consolas" w:eastAsiaTheme="minorHAnsi" w:hAnsi="Consolas" w:cs="Consolas"/>
@@ -3494,6 +3867,7 @@
         </w:rPr>
         <w:t>GenBoeEntities</w:t>
       </w:r>
+      <w:proofErr w:type="spellEnd"/>
       <w:r>
         <w:t xml:space="preserve"> </w:t>
       </w:r>
@@ -3513,6 +3887,7 @@
         </w:numPr>
         <w:spacing w:after="0"/>
       </w:pPr>
+      <w:proofErr w:type="spellStart"/>
       <w:r>
         <w:rPr>
           <w:rFonts w:ascii="Consolas" w:eastAsiaTheme="minorHAnsi" w:hAnsi="Consolas" w:cs="Consolas"/>
@@ -3522,6 +3897,7 @@
         </w:rPr>
         <w:t>BI_Datamart_PMMEntities</w:t>
       </w:r>
+      <w:proofErr w:type="spellEnd"/>
       <w:r>
         <w:rPr>
           <w:rStyle w:val="FootnoteReference"/>
@@ -3647,6 +4023,7 @@
         </w:numPr>
         <w:spacing w:after="0"/>
       </w:pPr>
+      <w:proofErr w:type="spellStart"/>
       <w:r>
         <w:rPr>
           <w:rFonts w:ascii="Consolas" w:eastAsiaTheme="minorHAnsi" w:hAnsi="Consolas" w:cs="Consolas"/>
@@ -3656,6 +4033,7 @@
         </w:rPr>
         <w:t>appSettings</w:t>
       </w:r>
+      <w:proofErr w:type="spellEnd"/>
       <w:r>
         <w:rPr>
           <w:rFonts w:ascii="Calibri" w:eastAsia="Times New Roman" w:hAnsi="Calibri" w:cs="Calibri"/>
@@ -3691,6 +4069,7 @@
           <w:rFonts w:ascii="Calibri" w:eastAsia="Times New Roman" w:hAnsi="Calibri" w:cs="Calibri"/>
         </w:rPr>
       </w:pPr>
+      <w:proofErr w:type="spellStart"/>
       <w:r>
         <w:rPr>
           <w:rFonts w:ascii="Consolas" w:eastAsiaTheme="minorHAnsi" w:hAnsi="Consolas" w:cs="Consolas"/>
@@ -3700,6 +4079,7 @@
         </w:rPr>
         <w:t>EmailServer</w:t>
       </w:r>
+      <w:proofErr w:type="spellEnd"/>
       <w:r>
         <w:t xml:space="preserve"> </w:t>
       </w:r>
@@ -3722,6 +4102,7 @@
           <w:rFonts w:ascii="Calibri" w:eastAsia="Times New Roman" w:hAnsi="Calibri" w:cs="Calibri"/>
         </w:rPr>
       </w:pPr>
+      <w:proofErr w:type="spellStart"/>
       <w:r>
         <w:rPr>
           <w:rFonts w:ascii="Consolas" w:eastAsiaTheme="minorHAnsi" w:hAnsi="Consolas" w:cs="Consolas"/>
@@ -3731,6 +4112,7 @@
         </w:rPr>
         <w:t>ActiveDirectoryPath</w:t>
       </w:r>
+      <w:proofErr w:type="spellEnd"/>
       <w:r>
         <w:t xml:space="preserve"> </w:t>
       </w:r>
@@ -3753,6 +4135,7 @@
           <w:rFonts w:ascii="Calibri" w:eastAsia="Times New Roman" w:hAnsi="Calibri" w:cs="Calibri"/>
         </w:rPr>
       </w:pPr>
+      <w:proofErr w:type="spellStart"/>
       <w:r>
         <w:rPr>
           <w:rFonts w:ascii="Consolas" w:eastAsiaTheme="minorHAnsi" w:hAnsi="Consolas" w:cs="Consolas"/>
@@ -3762,6 +4145,7 @@
         </w:rPr>
         <w:t>ServerURL</w:t>
       </w:r>
+      <w:proofErr w:type="spellEnd"/>
       <w:r>
         <w:rPr>
           <w:rFonts w:eastAsiaTheme="minorHAnsi" w:cs="Consolas"/>
@@ -3785,6 +4169,7 @@
           <w:rFonts w:ascii="Calibri" w:eastAsia="Times New Roman" w:hAnsi="Calibri" w:cs="Calibri"/>
         </w:rPr>
       </w:pPr>
+      <w:proofErr w:type="spellStart"/>
       <w:r>
         <w:rPr>
           <w:rFonts w:ascii="Consolas" w:eastAsiaTheme="minorHAnsi" w:hAnsi="Consolas" w:cs="Consolas"/>
@@ -3794,6 +4179,7 @@
         </w:rPr>
         <w:t>ProdUrlBoe</w:t>
       </w:r>
+      <w:proofErr w:type="spellEnd"/>
       <w:r>
         <w:rPr>
           <w:rFonts w:eastAsiaTheme="minorHAnsi" w:cs="Consolas"/>
@@ -3818,6 +4204,7 @@
         </w:rPr>
       </w:pPr>
       <w:bookmarkStart w:id="46" w:name="_Hlk34723628"/>
+      <w:proofErr w:type="spellStart"/>
       <w:r>
         <w:rPr>
           <w:rFonts w:ascii="Consolas" w:eastAsiaTheme="minorHAnsi" w:hAnsi="Consolas" w:cs="Consolas"/>
@@ -3827,6 +4214,7 @@
         </w:rPr>
         <w:t>DomesticUsersGroup</w:t>
       </w:r>
+      <w:proofErr w:type="spellEnd"/>
       <w:r>
         <w:rPr>
           <w:rFonts w:ascii="Calibri" w:eastAsia="Times New Roman" w:hAnsi="Calibri" w:cs="Calibri"/>
@@ -3855,6 +4243,7 @@
           <w:iCs/>
         </w:rPr>
       </w:pPr>
+      <w:proofErr w:type="spellStart"/>
       <w:r>
         <w:rPr>
           <w:rFonts w:ascii="Consolas" w:eastAsiaTheme="minorHAnsi" w:hAnsi="Consolas" w:cs="Consolas"/>
@@ -3862,7 +4251,17 @@
           <w:sz w:val="19"/>
           <w:szCs w:val="19"/>
         </w:rPr>
-        <w:t xml:space="preserve">SubsTreatedAsLmEmployees </w:t>
+        <w:t>SubsTreatedAsLmEmployees</w:t>
+      </w:r>
+      <w:proofErr w:type="spellEnd"/>
+      <w:r>
+        <w:rPr>
+          <w:rFonts w:ascii="Consolas" w:eastAsiaTheme="minorHAnsi" w:hAnsi="Consolas" w:cs="Consolas"/>
+          <w:color w:val="0000FF"/>
+          <w:sz w:val="19"/>
+          <w:szCs w:val="19"/>
+        </w:rPr>
+        <w:t xml:space="preserve"> </w:t>
       </w:r>
       <w:r>
         <w:rPr>
@@ -3883,6 +4282,7 @@
           <w:rFonts w:ascii="Calibri" w:eastAsia="Times New Roman" w:hAnsi="Calibri" w:cs="Calibri"/>
         </w:rPr>
       </w:pPr>
+      <w:proofErr w:type="spellStart"/>
       <w:r>
         <w:rPr>
           <w:rFonts w:ascii="Consolas" w:eastAsiaTheme="minorHAnsi" w:hAnsi="Consolas" w:cs="Consolas"/>
@@ -3892,6 +4292,7 @@
         </w:rPr>
         <w:t>CompanyConfiguration</w:t>
       </w:r>
+      <w:proofErr w:type="spellEnd"/>
     </w:p>
     <w:p>
       <w:pPr>
@@ -3919,6 +4320,7 @@
         </w:rPr>
         <w:t xml:space="preserve">: set to </w:t>
       </w:r>
+      <w:proofErr w:type="spellStart"/>
       <w:r>
         <w:rPr>
           <w:rFonts w:ascii="Consolas" w:eastAsiaTheme="minorHAnsi" w:hAnsi="Consolas" w:cs="Consolas"/>
@@ -3928,6 +4330,7 @@
         </w:rPr>
         <w:t>SpaceSystems</w:t>
       </w:r>
+      <w:proofErr w:type="spellEnd"/>
       <w:r>
         <w:rPr>
           <w:rFonts w:ascii="Calibri" w:eastAsia="Times New Roman" w:hAnsi="Calibri" w:cs="Calibri"/>
@@ -3981,6 +4384,7 @@
         </w:numPr>
         <w:spacing w:after="0"/>
       </w:pPr>
+      <w:proofErr w:type="spellStart"/>
       <w:r>
         <w:rPr>
           <w:rFonts w:ascii="Consolas" w:eastAsiaTheme="minorHAnsi" w:hAnsi="Consolas" w:cs="Consolas"/>
@@ -3990,6 +4394,7 @@
         </w:rPr>
         <w:t>HelpdeskEmailAddress</w:t>
       </w:r>
+      <w:proofErr w:type="spellEnd"/>
       <w:r>
         <w:t xml:space="preserve"> – email displayed to the users to contact for help</w:t>
       </w:r>
@@ -4003,6 +4408,7 @@
         </w:numPr>
         <w:spacing w:after="0"/>
       </w:pPr>
+      <w:proofErr w:type="spellStart"/>
       <w:r>
         <w:rPr>
           <w:rFonts w:ascii="Consolas" w:eastAsiaTheme="minorHAnsi" w:hAnsi="Consolas" w:cs="Consolas"/>
@@ -4012,6 +4418,7 @@
         </w:rPr>
         <w:t>LMIProxy</w:t>
       </w:r>
+      <w:proofErr w:type="spellEnd"/>
       <w:r>
         <w:t xml:space="preserve"> – proxy server used to connect to the network</w:t>
       </w:r>
@@ -4025,6 +4432,7 @@
         </w:numPr>
         <w:spacing w:after="0"/>
       </w:pPr>
+      <w:proofErr w:type="spellStart"/>
       <w:r>
         <w:rPr>
           <w:rFonts w:ascii="Consolas" w:eastAsiaTheme="minorHAnsi" w:hAnsi="Consolas" w:cs="Consolas"/>
@@ -4034,6 +4442,7 @@
         </w:rPr>
         <w:t>ShutOffExternalLinksForClassifiedInstall</w:t>
       </w:r>
+      <w:proofErr w:type="spellEnd"/>
       <w:r>
         <w:t xml:space="preserve"> – set to </w:t>
       </w:r>
@@ -4058,6 +4467,7 @@
           <w:rFonts w:ascii="Calibri" w:eastAsia="Times New Roman" w:hAnsi="Calibri" w:cs="Calibri"/>
         </w:rPr>
       </w:pPr>
+      <w:proofErr w:type="spellStart"/>
       <w:r>
         <w:rPr>
           <w:rFonts w:ascii="Consolas" w:eastAsiaTheme="minorHAnsi" w:hAnsi="Consolas" w:cs="Consolas"/>
@@ -4065,13 +4475,37 @@
           <w:sz w:val="19"/>
           <w:szCs w:val="19"/>
         </w:rPr>
-        <w:t xml:space="preserve">UsersAllowedProPricerAccess </w:t>
-      </w:r>
-      <w:r>
-        <w:rPr>
-          <w:rFonts w:ascii="Calibri" w:eastAsia="Times New Roman" w:hAnsi="Calibri" w:cs="Calibri"/>
-        </w:rPr>
-        <w:t>– AD groups containing users that have access to do ProPricer exports</w:t>
+        <w:t>UsersAllowedProPricerAccess</w:t>
+      </w:r>
+      <w:proofErr w:type="spellEnd"/>
+      <w:r>
+        <w:rPr>
+          <w:rFonts w:ascii="Consolas" w:eastAsiaTheme="minorHAnsi" w:hAnsi="Consolas" w:cs="Consolas"/>
+          <w:color w:val="0000FF"/>
+          <w:sz w:val="19"/>
+          <w:szCs w:val="19"/>
+        </w:rPr>
+        <w:t xml:space="preserve"> </w:t>
+      </w:r>
+      <w:r>
+        <w:rPr>
+          <w:rFonts w:ascii="Calibri" w:eastAsia="Times New Roman" w:hAnsi="Calibri" w:cs="Calibri"/>
+        </w:rPr>
+        <w:t xml:space="preserve">– AD groups containing users that have access to do </w:t>
+      </w:r>
+      <w:proofErr w:type="spellStart"/>
+      <w:r>
+        <w:rPr>
+          <w:rFonts w:ascii="Calibri" w:eastAsia="Times New Roman" w:hAnsi="Calibri" w:cs="Calibri"/>
+        </w:rPr>
+        <w:t>ProPricer</w:t>
+      </w:r>
+      <w:proofErr w:type="spellEnd"/>
+      <w:r>
+        <w:rPr>
+          <w:rFonts w:ascii="Calibri" w:eastAsia="Times New Roman" w:hAnsi="Calibri" w:cs="Calibri"/>
+        </w:rPr>
+        <w:t xml:space="preserve"> exports</w:t>
       </w:r>
     </w:p>
     <w:p>
@@ -4083,6 +4517,7 @@
         </w:numPr>
         <w:spacing w:after="0"/>
       </w:pPr>
+      <w:proofErr w:type="spellStart"/>
       <w:r>
         <w:rPr>
           <w:rFonts w:ascii="Consolas" w:eastAsiaTheme="minorHAnsi" w:hAnsi="Consolas" w:cs="Consolas"/>
@@ -4090,7 +4525,17 @@
           <w:sz w:val="19"/>
           <w:szCs w:val="19"/>
         </w:rPr>
-        <w:t xml:space="preserve">EnableSendToProPricerDirectly </w:t>
+        <w:t>EnableSendToProPricerDirectly</w:t>
+      </w:r>
+      <w:proofErr w:type="spellEnd"/>
+      <w:r>
+        <w:rPr>
+          <w:rFonts w:ascii="Consolas" w:eastAsiaTheme="minorHAnsi" w:hAnsi="Consolas" w:cs="Consolas"/>
+          <w:color w:val="0000FF"/>
+          <w:sz w:val="19"/>
+          <w:szCs w:val="19"/>
+        </w:rPr>
+        <w:t xml:space="preserve"> </w:t>
       </w:r>
       <w:r>
         <w:t xml:space="preserve">– set to </w:t>
@@ -4113,6 +4558,7 @@
         </w:numPr>
         <w:spacing w:after="0"/>
       </w:pPr>
+      <w:proofErr w:type="spellStart"/>
       <w:r>
         <w:rPr>
           <w:rFonts w:ascii="Consolas" w:eastAsiaTheme="minorHAnsi" w:hAnsi="Consolas" w:cs="Consolas"/>
@@ -4120,7 +4566,17 @@
           <w:sz w:val="19"/>
           <w:szCs w:val="19"/>
         </w:rPr>
-        <w:t xml:space="preserve">ProPricerApiUrl </w:t>
+        <w:t>ProPricerApiUrl</w:t>
+      </w:r>
+      <w:proofErr w:type="spellEnd"/>
+      <w:r>
+        <w:rPr>
+          <w:rFonts w:ascii="Consolas" w:eastAsiaTheme="minorHAnsi" w:hAnsi="Consolas" w:cs="Consolas"/>
+          <w:color w:val="0000FF"/>
+          <w:sz w:val="19"/>
+          <w:szCs w:val="19"/>
+        </w:rPr>
+        <w:t xml:space="preserve"> </w:t>
       </w:r>
       <w:r>
         <w:t xml:space="preserve">– </w:t>
@@ -4152,6 +4608,7 @@
         </w:numPr>
         <w:spacing w:after="0"/>
       </w:pPr>
+      <w:proofErr w:type="spellStart"/>
       <w:r>
         <w:rPr>
           <w:rFonts w:ascii="Consolas" w:eastAsiaTheme="minorHAnsi" w:hAnsi="Consolas" w:cs="Consolas"/>
@@ -4159,7 +4616,17 @@
           <w:sz w:val="19"/>
           <w:szCs w:val="19"/>
         </w:rPr>
-        <w:t xml:space="preserve">UnclassifiedBannerText </w:t>
+        <w:t>UnclassifiedBannerText</w:t>
+      </w:r>
+      <w:proofErr w:type="spellEnd"/>
+      <w:r>
+        <w:rPr>
+          <w:rFonts w:ascii="Consolas" w:eastAsiaTheme="minorHAnsi" w:hAnsi="Consolas" w:cs="Consolas"/>
+          <w:color w:val="0000FF"/>
+          <w:sz w:val="19"/>
+          <w:szCs w:val="19"/>
+        </w:rPr>
+        <w:t xml:space="preserve"> </w:t>
       </w:r>
       <w:r>
         <w:t xml:space="preserve">– </w:t>
@@ -4187,6 +4654,7 @@
         </w:numPr>
         <w:spacing w:after="0"/>
       </w:pPr>
+      <w:proofErr w:type="spellStart"/>
       <w:r>
         <w:rPr>
           <w:rFonts w:ascii="Consolas" w:eastAsiaTheme="minorHAnsi" w:hAnsi="Consolas" w:cs="Consolas"/>
@@ -4194,7 +4662,17 @@
           <w:sz w:val="19"/>
           <w:szCs w:val="19"/>
         </w:rPr>
-        <w:t xml:space="preserve">OverrideSubNonUs </w:t>
+        <w:t>OverrideSubNonUs</w:t>
+      </w:r>
+      <w:proofErr w:type="spellEnd"/>
+      <w:r>
+        <w:rPr>
+          <w:rFonts w:ascii="Consolas" w:eastAsiaTheme="minorHAnsi" w:hAnsi="Consolas" w:cs="Consolas"/>
+          <w:color w:val="0000FF"/>
+          <w:sz w:val="19"/>
+          <w:szCs w:val="19"/>
+        </w:rPr>
+        <w:t xml:space="preserve"> </w:t>
       </w:r>
       <w:r>
         <w:t xml:space="preserve">– set to </w:t>
@@ -4218,6 +4696,7 @@
         <w:spacing w:after="0"/>
       </w:pPr>
       <w:bookmarkStart w:id="47" w:name="_Hlk95193873"/>
+      <w:proofErr w:type="spellStart"/>
       <w:r>
         <w:rPr>
           <w:rFonts w:ascii="Consolas" w:eastAsiaTheme="minorHAnsi" w:hAnsi="Consolas" w:cs="Consolas"/>
@@ -4227,6 +4706,7 @@
         </w:rPr>
         <w:t>MOQHelpBaseUrl</w:t>
       </w:r>
+      <w:proofErr w:type="spellEnd"/>
       <w:r>
         <w:rPr>
           <w:rFonts w:ascii="Consolas" w:eastAsiaTheme="minorHAnsi" w:hAnsi="Consolas" w:cs="Consolas"/>
@@ -4276,7 +4756,25 @@
           <w:sz w:val="19"/>
           <w:szCs w:val="19"/>
         </w:rPr>
-        <w:t>http(s):\\</w:t>
+        <w:t>http(s</w:t>
+      </w:r>
+      <w:proofErr w:type="gramStart"/>
+      <w:r>
+        <w:rPr>
+          <w:rFonts w:ascii="Consolas" w:hAnsi="Consolas"/>
+          <w:sz w:val="19"/>
+          <w:szCs w:val="19"/>
+        </w:rPr>
+        <w:t>):\</w:t>
+      </w:r>
+      <w:proofErr w:type="gramEnd"/>
+      <w:r>
+        <w:rPr>
+          <w:rFonts w:ascii="Consolas" w:hAnsi="Consolas"/>
+          <w:sz w:val="19"/>
+          <w:szCs w:val="19"/>
+        </w:rPr>
+        <w:t>\</w:t>
       </w:r>
       <w:r>
         <w:t xml:space="preserve"> and end with </w:t>
@@ -4341,6 +4839,7 @@
         </w:numPr>
         <w:spacing w:after="0"/>
       </w:pPr>
+      <w:proofErr w:type="spellStart"/>
       <w:r>
         <w:rPr>
           <w:rFonts w:ascii="Consolas" w:eastAsiaTheme="minorHAnsi" w:hAnsi="Consolas" w:cs="Consolas"/>
@@ -4348,7 +4847,17 @@
           <w:sz w:val="19"/>
           <w:szCs w:val="19"/>
         </w:rPr>
-        <w:t xml:space="preserve">oAuthDomain </w:t>
+        <w:t>oAuthDomain</w:t>
+      </w:r>
+      <w:proofErr w:type="spellEnd"/>
+      <w:r>
+        <w:rPr>
+          <w:rFonts w:ascii="Consolas" w:eastAsiaTheme="minorHAnsi" w:hAnsi="Consolas" w:cs="Consolas"/>
+          <w:color w:val="0000FF"/>
+          <w:sz w:val="19"/>
+          <w:szCs w:val="19"/>
+        </w:rPr>
+        <w:t xml:space="preserve"> </w:t>
       </w:r>
       <w:r>
         <w:t xml:space="preserve">– </w:t>
@@ -4414,6 +4923,7 @@
         </w:numPr>
         <w:spacing w:after="0"/>
       </w:pPr>
+      <w:proofErr w:type="spellStart"/>
       <w:r>
         <w:rPr>
           <w:rFonts w:ascii="Consolas" w:eastAsiaTheme="minorHAnsi" w:hAnsi="Consolas" w:cs="Consolas"/>
@@ -4423,6 +4933,7 @@
         </w:rPr>
         <w:t>ShowEquivalentPersonsOption</w:t>
       </w:r>
+      <w:proofErr w:type="spellEnd"/>
     </w:p>
     <w:p>
       <w:pPr>
@@ -4448,7 +4959,11 @@
       </w:r>
       <w:commentRangeStart w:id="48"/>
       <w:r>
-        <w:t>set as appropriate</w:t>
+        <w:t xml:space="preserve">set as </w:t>
+      </w:r>
+      <w:proofErr w:type="gramStart"/>
+      <w:r>
+        <w:t>appropriate</w:t>
       </w:r>
       <w:r>
         <w:t xml:space="preserve">, </w:t>
@@ -4464,6 +4979,7 @@
         </w:rPr>
         <w:t>true</w:t>
       </w:r>
+      <w:proofErr w:type="gramEnd"/>
       <w:r>
         <w:t xml:space="preserve"> will cause EPs to be used, instead of hours</w:t>
       </w:r>
@@ -4516,6 +5032,7 @@
         </w:numPr>
         <w:spacing w:after="0"/>
       </w:pPr>
+      <w:proofErr w:type="spellStart"/>
       <w:r>
         <w:rPr>
           <w:rFonts w:ascii="Consolas" w:eastAsiaTheme="minorHAnsi" w:hAnsi="Consolas" w:cs="Consolas"/>
@@ -4525,6 +5042,7 @@
         </w:rPr>
         <w:t>IsBOEFormVisible</w:t>
       </w:r>
+      <w:proofErr w:type="spellEnd"/>
     </w:p>
     <w:p>
       <w:pPr>
@@ -4619,6 +5137,7 @@
           <w:rFonts w:ascii="Calibri" w:eastAsia="Times New Roman" w:hAnsi="Calibri" w:cs="Calibri"/>
         </w:rPr>
       </w:pPr>
+      <w:proofErr w:type="spellStart"/>
       <w:r>
         <w:rPr>
           <w:rFonts w:ascii="Consolas" w:eastAsiaTheme="minorHAnsi" w:hAnsi="Consolas" w:cs="Consolas"/>
@@ -4628,6 +5147,7 @@
         </w:rPr>
         <w:t>IsPortionMarkingEnabled</w:t>
       </w:r>
+      <w:proofErr w:type="spellEnd"/>
     </w:p>
     <w:p>
       <w:pPr>
@@ -4711,6 +5231,7 @@
           <w:rFonts w:ascii="Calibri" w:eastAsia="Times New Roman" w:hAnsi="Calibri" w:cs="Calibri"/>
         </w:rPr>
       </w:pPr>
+      <w:proofErr w:type="spellStart"/>
       <w:r>
         <w:rPr>
           <w:rFonts w:ascii="Consolas" w:eastAsiaTheme="minorHAnsi" w:hAnsi="Consolas" w:cs="Consolas"/>
@@ -4720,6 +5241,7 @@
         </w:rPr>
         <w:t>IESHomeUrl</w:t>
       </w:r>
+      <w:proofErr w:type="spellEnd"/>
     </w:p>
     <w:p>
       <w:pPr>
@@ -4814,6 +5336,7 @@
           <w:rFonts w:ascii="Calibri" w:eastAsia="Times New Roman" w:hAnsi="Calibri" w:cs="Calibri"/>
         </w:rPr>
       </w:pPr>
+      <w:proofErr w:type="spellStart"/>
       <w:r>
         <w:rPr>
           <w:rFonts w:ascii="Consolas" w:eastAsiaTheme="minorHAnsi" w:hAnsi="Consolas" w:cs="Consolas"/>
@@ -4823,6 +5346,7 @@
         </w:rPr>
         <w:t>IsPTMIntegrated</w:t>
       </w:r>
+      <w:proofErr w:type="spellEnd"/>
     </w:p>
     <w:p>
       <w:pPr>
@@ -4934,6 +5458,7 @@
           <w:rFonts w:ascii="Calibri" w:eastAsia="Times New Roman" w:hAnsi="Calibri" w:cs="Calibri"/>
         </w:rPr>
       </w:pPr>
+      <w:proofErr w:type="spellStart"/>
       <w:r>
         <w:rPr>
           <w:rFonts w:ascii="Consolas" w:eastAsiaTheme="minorHAnsi" w:hAnsi="Consolas" w:cs="Consolas"/>
@@ -4943,6 +5468,7 @@
         </w:rPr>
         <w:t>DatabaseESTOffset</w:t>
       </w:r>
+      <w:proofErr w:type="spellEnd"/>
       <w:r>
         <w:rPr>
           <w:rFonts w:ascii="Calibri" w:eastAsia="Times New Roman" w:hAnsi="Calibri" w:cs="Calibri"/>
@@ -4963,6 +5489,7 @@
           <w:rFonts w:ascii="Calibri" w:eastAsia="Times New Roman" w:hAnsi="Calibri" w:cs="Calibri"/>
         </w:rPr>
       </w:pPr>
+      <w:proofErr w:type="spellStart"/>
       <w:r>
         <w:rPr>
           <w:rFonts w:ascii="Consolas" w:eastAsiaTheme="minorHAnsi" w:hAnsi="Consolas" w:cs="Consolas"/>
@@ -4972,6 +5499,7 @@
         </w:rPr>
         <w:t>CanCreateWorkspaceWithoutPtmTrackingNumber</w:t>
       </w:r>
+      <w:proofErr w:type="spellEnd"/>
     </w:p>
     <w:p>
       <w:pPr>
@@ -5077,6 +5605,7 @@
           <w:rFonts w:ascii="Calibri" w:eastAsia="Times New Roman" w:hAnsi="Calibri" w:cs="Calibri"/>
         </w:rPr>
       </w:pPr>
+      <w:proofErr w:type="spellStart"/>
       <w:r>
         <w:rPr>
           <w:rFonts w:ascii="Consolas" w:eastAsiaTheme="minorHAnsi" w:hAnsi="Consolas" w:cs="Consolas"/>
@@ -5084,7 +5613,17 @@
           <w:sz w:val="19"/>
           <w:szCs w:val="19"/>
         </w:rPr>
-        <w:t>Piwik Settings</w:t>
+        <w:t>Piwik</w:t>
+      </w:r>
+      <w:proofErr w:type="spellEnd"/>
+      <w:r>
+        <w:rPr>
+          <w:rFonts w:ascii="Consolas" w:eastAsiaTheme="minorHAnsi" w:hAnsi="Consolas" w:cs="Consolas"/>
+          <w:color w:val="008000"/>
+          <w:sz w:val="19"/>
+          <w:szCs w:val="19"/>
+        </w:rPr>
+        <w:t xml:space="preserve"> Settings</w:t>
       </w:r>
     </w:p>
     <w:p>
@@ -5100,6 +5639,7 @@
           <w:rFonts w:ascii="Calibri" w:eastAsia="Times New Roman" w:hAnsi="Calibri" w:cs="Calibri"/>
         </w:rPr>
       </w:pPr>
+      <w:proofErr w:type="spellStart"/>
       <w:r>
         <w:rPr>
           <w:rFonts w:ascii="Consolas" w:eastAsiaTheme="minorHAnsi" w:hAnsi="Consolas" w:cs="Consolas"/>
@@ -5109,6 +5649,7 @@
         </w:rPr>
         <w:t>DisablePiwik</w:t>
       </w:r>
+      <w:proofErr w:type="spellEnd"/>
       <w:r>
         <w:rPr>
           <w:rStyle w:val="FootnoteReference"/>
@@ -5159,6 +5700,7 @@
         </w:numPr>
         <w:spacing w:after="0"/>
       </w:pPr>
+      <w:proofErr w:type="spellStart"/>
       <w:r>
         <w:rPr>
           <w:rFonts w:ascii="Consolas" w:eastAsiaTheme="minorHAnsi" w:hAnsi="Consolas" w:cs="Consolas"/>
@@ -5168,6 +5710,7 @@
         </w:rPr>
         <w:t>MstMetricsUrl</w:t>
       </w:r>
+      <w:proofErr w:type="spellEnd"/>
     </w:p>
     <w:p>
       <w:pPr>
@@ -5248,6 +5791,7 @@
         </w:numPr>
         <w:spacing w:after="0"/>
       </w:pPr>
+      <w:proofErr w:type="spellStart"/>
       <w:r>
         <w:rPr>
           <w:rFonts w:ascii="Consolas" w:eastAsiaTheme="minorHAnsi" w:hAnsi="Consolas" w:cs="Consolas"/>
@@ -5257,6 +5801,7 @@
         </w:rPr>
         <w:t>MSTSearchCriteriaHelp</w:t>
       </w:r>
+      <w:proofErr w:type="spellEnd"/>
     </w:p>
     <w:p>
       <w:pPr>
@@ -5337,6 +5882,7 @@
         </w:numPr>
         <w:spacing w:after="0"/>
       </w:pPr>
+      <w:proofErr w:type="spellStart"/>
       <w:r>
         <w:rPr>
           <w:rFonts w:ascii="Consolas" w:eastAsiaTheme="minorHAnsi" w:hAnsi="Consolas" w:cs="Consolas"/>
@@ -5346,6 +5892,7 @@
         </w:rPr>
         <w:t>MSTSearchResultsHelpLink</w:t>
       </w:r>
+      <w:proofErr w:type="spellEnd"/>
     </w:p>
     <w:p>
       <w:pPr>
@@ -5426,6 +5973,7 @@
         </w:numPr>
         <w:spacing w:after="0"/>
       </w:pPr>
+      <w:proofErr w:type="spellStart"/>
       <w:r>
         <w:rPr>
           <w:rFonts w:ascii="Consolas" w:eastAsiaTheme="minorHAnsi" w:hAnsi="Consolas" w:cs="Consolas"/>
@@ -5435,6 +5983,7 @@
         </w:rPr>
         <w:t>MSTSearchResultsDetailHelpLink</w:t>
       </w:r>
+      <w:proofErr w:type="spellEnd"/>
       <w:r>
         <w:rPr>
           <w:rFonts w:ascii="Calibri" w:eastAsia="Times New Roman" w:hAnsi="Calibri" w:cs="Calibri"/>
@@ -5551,6 +6100,7 @@
         </w:numPr>
         <w:spacing w:after="0"/>
       </w:pPr>
+      <w:proofErr w:type="spellStart"/>
       <w:r>
         <w:rPr>
           <w:rFonts w:ascii="Consolas" w:eastAsiaTheme="minorHAnsi" w:hAnsi="Consolas" w:cs="Consolas"/>
@@ -5560,6 +6110,7 @@
         </w:rPr>
         <w:t>RmsHelpBaseLink</w:t>
       </w:r>
+      <w:proofErr w:type="spellEnd"/>
     </w:p>
     <w:p>
       <w:pPr>
@@ -5665,6 +6216,7 @@
         </w:numPr>
         <w:spacing w:after="0"/>
       </w:pPr>
+      <w:proofErr w:type="spellStart"/>
       <w:r>
         <w:rPr>
           <w:rFonts w:ascii="Consolas" w:eastAsiaTheme="minorHAnsi" w:hAnsi="Consolas" w:cs="Consolas"/>
@@ -5674,6 +6226,7 @@
         </w:rPr>
         <w:t>RmsHelpBaseLinkNew</w:t>
       </w:r>
+      <w:proofErr w:type="spellEnd"/>
     </w:p>
     <w:p>
       <w:pPr>
@@ -5744,6 +6297,7 @@
         </w:rPr>
         <w:t xml:space="preserve">Please set to the same value as </w:t>
       </w:r>
+      <w:proofErr w:type="spellStart"/>
       <w:r>
         <w:rPr>
           <w:rFonts w:ascii="Consolas" w:eastAsiaTheme="minorHAnsi" w:hAnsi="Consolas" w:cs="Consolas"/>
@@ -5753,6 +6307,7 @@
         </w:rPr>
         <w:t>RmsHelpBaseLink</w:t>
       </w:r>
+      <w:proofErr w:type="spellEnd"/>
     </w:p>
     <w:p>
       <w:pPr>
@@ -5801,6 +6356,7 @@
           <w:rFonts w:ascii="Calibri" w:eastAsia="Times New Roman" w:hAnsi="Calibri" w:cs="Calibri"/>
         </w:rPr>
       </w:pPr>
+      <w:proofErr w:type="spellStart"/>
       <w:r>
         <w:rPr>
           <w:rFonts w:ascii="Consolas" w:eastAsiaTheme="minorHAnsi" w:hAnsi="Consolas" w:cs="Consolas"/>
@@ -5810,6 +6366,7 @@
         </w:rPr>
         <w:t>IsProjectMapEnabled</w:t>
       </w:r>
+      <w:proofErr w:type="spellEnd"/>
     </w:p>
     <w:p>
       <w:pPr>
@@ -5925,8 +6482,16 @@
         <w:rPr>
           <w:rFonts w:ascii="Calibri" w:eastAsia="Times New Roman" w:hAnsi="Calibri" w:cs="Calibri"/>
         </w:rPr>
-        <w:t>Below are used by Project Map functionality (if turned on above)..</w:t>
-      </w:r>
+        <w:t>Below are used by Project Map functionality (if turned on above</w:t>
+      </w:r>
+      <w:proofErr w:type="gramStart"/>
+      <w:r>
+        <w:rPr>
+          <w:rFonts w:ascii="Calibri" w:eastAsia="Times New Roman" w:hAnsi="Calibri" w:cs="Calibri"/>
+        </w:rPr>
+        <w:t>)..</w:t>
+      </w:r>
+      <w:proofErr w:type="gramEnd"/>
     </w:p>
     <w:p>
       <w:pPr>
@@ -5941,6 +6506,7 @@
           <w:rFonts w:ascii="Calibri" w:eastAsia="Times New Roman" w:hAnsi="Calibri" w:cs="Calibri"/>
         </w:rPr>
       </w:pPr>
+      <w:proofErr w:type="spellStart"/>
       <w:r>
         <w:rPr>
           <w:rFonts w:ascii="Consolas" w:eastAsiaTheme="minorHAnsi" w:hAnsi="Consolas" w:cs="Consolas"/>
@@ -5950,6 +6516,7 @@
         </w:rPr>
         <w:t>ReportServerLocation</w:t>
       </w:r>
+      <w:proofErr w:type="spellEnd"/>
       <w:r>
         <w:rPr>
           <w:rFonts w:ascii="Calibri" w:eastAsia="Times New Roman" w:hAnsi="Calibri" w:cs="Calibri"/>
@@ -5970,6 +6537,7 @@
           <w:rFonts w:ascii="Calibri" w:eastAsia="Times New Roman" w:hAnsi="Calibri" w:cs="Calibri"/>
         </w:rPr>
       </w:pPr>
+      <w:proofErr w:type="spellStart"/>
       <w:r>
         <w:rPr>
           <w:rFonts w:ascii="Consolas" w:eastAsiaTheme="minorHAnsi" w:hAnsi="Consolas" w:cs="Consolas"/>
@@ -5979,6 +6547,7 @@
         </w:rPr>
         <w:t>ReportServerFolderName</w:t>
       </w:r>
+      <w:proofErr w:type="spellEnd"/>
       <w:r>
         <w:rPr>
           <w:rFonts w:ascii="Calibri" w:eastAsia="Times New Roman" w:hAnsi="Calibri" w:cs="Calibri"/>
@@ -5999,6 +6568,7 @@
           <w:rFonts w:ascii="Calibri" w:eastAsia="Times New Roman" w:hAnsi="Calibri" w:cs="Calibri"/>
         </w:rPr>
       </w:pPr>
+      <w:proofErr w:type="spellStart"/>
       <w:r>
         <w:rPr>
           <w:rFonts w:ascii="Consolas" w:eastAsiaTheme="minorHAnsi" w:hAnsi="Consolas" w:cs="Consolas"/>
@@ -6008,6 +6578,7 @@
         </w:rPr>
         <w:t>system.web</w:t>
       </w:r>
+      <w:proofErr w:type="spellEnd"/>
       <w:r>
         <w:rPr>
           <w:rFonts w:ascii="Consolas" w:eastAsiaTheme="minorHAnsi" w:hAnsi="Consolas" w:cs="Consolas"/>
@@ -6139,6 +6710,7 @@
         </w:rPr>
         <w:t>"</w:t>
       </w:r>
+      <w:proofErr w:type="spellStart"/>
       <w:r>
         <w:rPr>
           <w:rFonts w:ascii="Consolas" w:eastAsiaTheme="minorHAnsi" w:hAnsi="Consolas" w:cs="Consolas"/>
@@ -6148,6 +6720,7 @@
         </w:rPr>
         <w:t>elmah.axd</w:t>
       </w:r>
+      <w:proofErr w:type="spellEnd"/>
       <w:r>
         <w:rPr>
           <w:rFonts w:ascii="Consolas" w:eastAsiaTheme="minorHAnsi" w:hAnsi="Consolas" w:cs="Consolas"/>
@@ -6172,6 +6745,7 @@
         </w:rPr>
         <w:t xml:space="preserve">-&gt; </w:t>
       </w:r>
+      <w:proofErr w:type="spellStart"/>
       <w:r>
         <w:rPr>
           <w:rFonts w:ascii="Consolas" w:eastAsiaTheme="minorHAnsi" w:hAnsi="Consolas" w:cs="Consolas"/>
@@ -6181,6 +6755,7 @@
         </w:rPr>
         <w:t>system.web</w:t>
       </w:r>
+      <w:proofErr w:type="spellEnd"/>
       <w:r>
         <w:rPr>
           <w:rFonts w:ascii="Consolas" w:eastAsiaTheme="minorHAnsi" w:hAnsi="Consolas" w:cs="Consolas"/>
@@ -6259,6 +6834,7 @@
           <w:numId w:val="4"/>
         </w:numPr>
       </w:pPr>
+      <w:proofErr w:type="spellStart"/>
       <w:r>
         <w:rPr>
           <w:rFonts w:ascii="Consolas" w:eastAsiaTheme="minorHAnsi" w:hAnsi="Consolas" w:cs="Consolas"/>
@@ -6268,6 +6844,7 @@
         </w:rPr>
         <w:t>elmah</w:t>
       </w:r>
+      <w:proofErr w:type="spellEnd"/>
       <w:r>
         <w:t xml:space="preserve"> section</w:t>
       </w:r>
@@ -6287,6 +6864,7 @@
         </w:rPr>
         <w:t xml:space="preserve">in </w:t>
       </w:r>
+      <w:proofErr w:type="spellStart"/>
       <w:r>
         <w:rPr>
           <w:rFonts w:ascii="Consolas" w:eastAsiaTheme="minorHAnsi" w:hAnsi="Consolas" w:cs="Consolas"/>
@@ -6296,12 +6874,28 @@
         </w:rPr>
         <w:t>errorLog</w:t>
       </w:r>
-      <w:r>
-        <w:rPr>
-          <w:rFonts w:ascii="Calibri" w:eastAsia="Times New Roman" w:hAnsi="Calibri" w:cs="Calibri"/>
-        </w:rPr>
-        <w:t xml:space="preserve"> setting,  update the </w:t>
-      </w:r>
+      <w:proofErr w:type="spellEnd"/>
+      <w:r>
+        <w:rPr>
+          <w:rFonts w:ascii="Calibri" w:eastAsia="Times New Roman" w:hAnsi="Calibri" w:cs="Calibri"/>
+        </w:rPr>
+        <w:t xml:space="preserve"> </w:t>
+      </w:r>
+      <w:proofErr w:type="gramStart"/>
+      <w:r>
+        <w:rPr>
+          <w:rFonts w:ascii="Calibri" w:eastAsia="Times New Roman" w:hAnsi="Calibri" w:cs="Calibri"/>
+        </w:rPr>
+        <w:t>setting,  update</w:t>
+      </w:r>
+      <w:proofErr w:type="gramEnd"/>
+      <w:r>
+        <w:rPr>
+          <w:rFonts w:ascii="Calibri" w:eastAsia="Times New Roman" w:hAnsi="Calibri" w:cs="Calibri"/>
+        </w:rPr>
+        <w:t xml:space="preserve"> the </w:t>
+      </w:r>
+      <w:proofErr w:type="spellStart"/>
       <w:r>
         <w:rPr>
           <w:rFonts w:ascii="Consolas" w:eastAsiaTheme="minorHAnsi" w:hAnsi="Consolas" w:cs="Consolas"/>
@@ -6311,6 +6905,7 @@
         </w:rPr>
         <w:t>connectionString</w:t>
       </w:r>
+      <w:proofErr w:type="spellEnd"/>
       <w:r>
         <w:rPr>
           <w:rFonts w:ascii="Calibri" w:eastAsia="Times New Roman" w:hAnsi="Calibri" w:cs="Calibri"/>
@@ -6327,7 +6922,15 @@
         </w:numPr>
       </w:pPr>
       <w:r>
-        <w:t>Remove the HTTPS redirect portion of web.config. Example:</w:t>
+        <w:t xml:space="preserve">Remove the HTTPS redirect portion of </w:t>
+      </w:r>
+      <w:proofErr w:type="spellStart"/>
+      <w:r>
+        <w:t>web.config</w:t>
+      </w:r>
+      <w:proofErr w:type="spellEnd"/>
+      <w:r>
+        <w:t>. Example:</w:t>
       </w:r>
     </w:p>
     <w:p>
@@ -6428,6 +7031,7 @@
         </w:rPr>
         <w:t xml:space="preserve"> </w:t>
       </w:r>
+      <w:proofErr w:type="spellStart"/>
       <w:r>
         <w:rPr>
           <w:rFonts w:ascii="Consolas" w:eastAsiaTheme="minorHAnsi" w:hAnsi="Consolas" w:cs="Consolas"/>
@@ -6437,6 +7041,7 @@
         </w:rPr>
         <w:t>stopProcessing</w:t>
       </w:r>
+      <w:proofErr w:type="spellEnd"/>
       <w:r>
         <w:rPr>
           <w:rFonts w:ascii="Consolas" w:eastAsiaTheme="minorHAnsi" w:hAnsi="Consolas" w:cs="Consolas"/>
@@ -6493,6 +7098,7 @@
         </w:rPr>
         <w:t xml:space="preserve">          &lt;match </w:t>
       </w:r>
+      <w:proofErr w:type="spellStart"/>
       <w:r>
         <w:rPr>
           <w:rFonts w:ascii="Consolas" w:eastAsiaTheme="minorHAnsi" w:hAnsi="Consolas" w:cs="Consolas"/>
@@ -6502,6 +7108,7 @@
         </w:rPr>
         <w:t>url</w:t>
       </w:r>
+      <w:proofErr w:type="spellEnd"/>
       <w:r>
         <w:rPr>
           <w:rFonts w:ascii="Consolas" w:eastAsiaTheme="minorHAnsi" w:hAnsi="Consolas" w:cs="Consolas"/>
@@ -6509,7 +7116,27 @@
           <w:sz w:val="19"/>
           <w:szCs w:val="19"/>
         </w:rPr>
-        <w:t>="(.*)"</w:t>
+        <w:t>="</w:t>
+      </w:r>
+      <w:proofErr w:type="gramStart"/>
+      <w:r>
+        <w:rPr>
+          <w:rFonts w:ascii="Consolas" w:eastAsiaTheme="minorHAnsi" w:hAnsi="Consolas" w:cs="Consolas"/>
+          <w:color w:val="8064A2" w:themeColor="accent4"/>
+          <w:sz w:val="19"/>
+          <w:szCs w:val="19"/>
+        </w:rPr>
+        <w:t>(.*</w:t>
+      </w:r>
+      <w:proofErr w:type="gramEnd"/>
+      <w:r>
+        <w:rPr>
+          <w:rFonts w:ascii="Consolas" w:eastAsiaTheme="minorHAnsi" w:hAnsi="Consolas" w:cs="Consolas"/>
+          <w:color w:val="8064A2" w:themeColor="accent4"/>
+          <w:sz w:val="19"/>
+          <w:szCs w:val="19"/>
+        </w:rPr>
+        <w:t>)"</w:t>
       </w:r>
       <w:r>
         <w:rPr>
@@ -6672,6 +7299,7 @@
         </w:rPr>
         <w:t xml:space="preserve">="Redirect" </w:t>
       </w:r>
+      <w:proofErr w:type="spellStart"/>
       <w:r>
         <w:rPr>
           <w:rFonts w:ascii="Consolas" w:eastAsiaTheme="minorHAnsi" w:hAnsi="Consolas" w:cs="Consolas"/>
@@ -6681,6 +7309,7 @@
         </w:rPr>
         <w:t>url</w:t>
       </w:r>
+      <w:proofErr w:type="spellEnd"/>
       <w:r>
         <w:rPr>
           <w:rFonts w:ascii="Consolas" w:eastAsiaTheme="minorHAnsi" w:hAnsi="Consolas" w:cs="Consolas"/>
@@ -6795,7 +7424,15 @@
         <w:t>C</w:t>
       </w:r>
       <w:r>
-        <w:t>: AD Sync - App.Config Customization</w:t>
+        <w:t xml:space="preserve">: AD Sync - </w:t>
+      </w:r>
+      <w:proofErr w:type="spellStart"/>
+      <w:r>
+        <w:t>App.Config</w:t>
+      </w:r>
+      <w:proofErr w:type="spellEnd"/>
+      <w:r>
+        <w:t xml:space="preserve"> Customization</w:t>
       </w:r>
       <w:bookmarkEnd w:id="51"/>
       <w:bookmarkEnd w:id="52"/>
@@ -6809,6 +7446,7 @@
         </w:numPr>
         <w:spacing w:after="0"/>
       </w:pPr>
+      <w:proofErr w:type="spellStart"/>
       <w:r>
         <w:rPr>
           <w:rFonts w:ascii="Consolas" w:eastAsiaTheme="minorHAnsi" w:hAnsi="Consolas" w:cs="Consolas"/>
@@ -6818,6 +7456,7 @@
         </w:rPr>
         <w:t>connectionStrings</w:t>
       </w:r>
+      <w:proofErr w:type="spellEnd"/>
       <w:r>
         <w:rPr>
           <w:rFonts w:ascii="Calibri" w:eastAsia="Times New Roman" w:hAnsi="Calibri" w:cs="Calibri"/>
@@ -6834,6 +7473,7 @@
         </w:numPr>
         <w:spacing w:after="0"/>
       </w:pPr>
+      <w:proofErr w:type="spellStart"/>
       <w:r>
         <w:rPr>
           <w:rFonts w:ascii="Consolas" w:eastAsiaTheme="minorHAnsi" w:hAnsi="Consolas" w:cs="Consolas"/>
@@ -6843,6 +7483,7 @@
         </w:rPr>
         <w:t>genTracEntities</w:t>
       </w:r>
+      <w:proofErr w:type="spellEnd"/>
     </w:p>
     <w:p>
       <w:pPr>
@@ -6860,6 +7501,7 @@
         </w:rPr>
         <w:t>Space</w:t>
       </w:r>
+      <w:proofErr w:type="gramStart"/>
       <w:r>
         <w:rPr>
           <w:rFonts w:ascii="Calibri" w:eastAsia="Times New Roman" w:hAnsi="Calibri" w:cs="Calibri"/>
@@ -6870,7 +7512,14 @@
         <w:rPr>
           <w:rFonts w:ascii="Calibri" w:eastAsia="Times New Roman" w:hAnsi="Calibri" w:cs="Calibri"/>
         </w:rPr>
-        <w:t xml:space="preserve">: if using PTM, PTM database connection string. </w:t>
+        <w:t>:</w:t>
+      </w:r>
+      <w:proofErr w:type="gramEnd"/>
+      <w:r>
+        <w:rPr>
+          <w:rFonts w:ascii="Calibri" w:eastAsia="Times New Roman" w:hAnsi="Calibri" w:cs="Calibri"/>
+        </w:rPr>
+        <w:t xml:space="preserve"> if using PTM, PTM database connection string. </w:t>
       </w:r>
       <w:r>
         <w:rPr>
@@ -6951,6 +7600,7 @@
         </w:numPr>
         <w:spacing w:after="0"/>
       </w:pPr>
+      <w:proofErr w:type="spellStart"/>
       <w:r>
         <w:rPr>
           <w:rFonts w:ascii="Consolas" w:eastAsiaTheme="minorHAnsi" w:hAnsi="Consolas" w:cs="Consolas"/>
@@ -6958,7 +7608,17 @@
           <w:sz w:val="19"/>
           <w:szCs w:val="19"/>
         </w:rPr>
-        <w:t xml:space="preserve">GenBoeEntities </w:t>
+        <w:t>GenBoeEntities</w:t>
+      </w:r>
+      <w:proofErr w:type="spellEnd"/>
+      <w:r>
+        <w:rPr>
+          <w:rFonts w:ascii="Consolas" w:eastAsiaTheme="minorHAnsi" w:hAnsi="Consolas" w:cs="Consolas"/>
+          <w:color w:val="0000FF"/>
+          <w:sz w:val="19"/>
+          <w:szCs w:val="19"/>
+        </w:rPr>
+        <w:t xml:space="preserve"> </w:t>
       </w:r>
       <w:r>
         <w:rPr>
@@ -6976,6 +7636,7 @@
         </w:numPr>
         <w:spacing w:after="0"/>
       </w:pPr>
+      <w:proofErr w:type="spellStart"/>
       <w:r>
         <w:rPr>
           <w:rFonts w:ascii="Consolas" w:eastAsiaTheme="minorHAnsi" w:hAnsi="Consolas" w:cs="Consolas"/>
@@ -6985,6 +7646,7 @@
         </w:rPr>
         <w:t>appSettings</w:t>
       </w:r>
+      <w:proofErr w:type="spellEnd"/>
       <w:r>
         <w:rPr>
           <w:rFonts w:ascii="Calibri" w:eastAsia="Times New Roman" w:hAnsi="Calibri" w:cs="Calibri"/>
@@ -7023,6 +7685,7 @@
           <w:rFonts w:ascii="Calibri" w:eastAsia="Times New Roman" w:hAnsi="Calibri" w:cs="Calibri"/>
         </w:rPr>
       </w:pPr>
+      <w:proofErr w:type="spellStart"/>
       <w:r>
         <w:rPr>
           <w:rFonts w:ascii="Consolas" w:eastAsiaTheme="minorHAnsi" w:hAnsi="Consolas" w:cs="Consolas"/>
@@ -7032,6 +7695,7 @@
         </w:rPr>
         <w:t>ActiveDirectoryPath</w:t>
       </w:r>
+      <w:proofErr w:type="spellEnd"/>
       <w:r>
         <w:t xml:space="preserve"> </w:t>
       </w:r>
@@ -7051,6 +7715,7 @@
         </w:numPr>
         <w:spacing w:after="0"/>
       </w:pPr>
+      <w:proofErr w:type="spellStart"/>
       <w:r>
         <w:rPr>
           <w:rFonts w:ascii="Consolas" w:eastAsiaTheme="minorHAnsi" w:hAnsi="Consolas" w:cs="Consolas"/>
@@ -7060,6 +7725,7 @@
         </w:rPr>
         <w:t>LMIProxy</w:t>
       </w:r>
+      <w:proofErr w:type="spellEnd"/>
       <w:r>
         <w:t xml:space="preserve"> – proxy server used to connect to the network</w:t>
       </w:r>
@@ -7073,6 +7739,7 @@
         </w:numPr>
         <w:spacing w:after="0"/>
       </w:pPr>
+      <w:proofErr w:type="spellStart"/>
       <w:r>
         <w:rPr>
           <w:rFonts w:ascii="Consolas" w:eastAsiaTheme="minorHAnsi" w:hAnsi="Consolas" w:cs="Consolas"/>
@@ -7082,6 +7749,7 @@
         </w:rPr>
         <w:t>CompanyConfiguration</w:t>
       </w:r>
+      <w:proofErr w:type="spellEnd"/>
     </w:p>
     <w:p>
       <w:pPr>
@@ -7109,6 +7777,7 @@
         </w:rPr>
         <w:t xml:space="preserve">: set to </w:t>
       </w:r>
+      <w:proofErr w:type="spellStart"/>
       <w:r>
         <w:rPr>
           <w:rFonts w:ascii="Consolas" w:eastAsiaTheme="minorHAnsi" w:hAnsi="Consolas" w:cs="Consolas"/>
@@ -7118,6 +7787,7 @@
         </w:rPr>
         <w:t>SpaceSystems</w:t>
       </w:r>
+      <w:proofErr w:type="spellEnd"/>
       <w:r>
         <w:rPr>
           <w:rFonts w:ascii="Calibri" w:eastAsia="Times New Roman" w:hAnsi="Calibri" w:cs="Calibri"/>
@@ -7174,6 +7844,7 @@
           <w:rFonts w:ascii="Calibri" w:eastAsia="Times New Roman" w:hAnsi="Calibri" w:cs="Calibri"/>
         </w:rPr>
       </w:pPr>
+      <w:proofErr w:type="spellStart"/>
       <w:r>
         <w:rPr>
           <w:rFonts w:ascii="Consolas" w:eastAsiaTheme="minorHAnsi" w:hAnsi="Consolas" w:cs="Consolas"/>
@@ -7183,6 +7854,7 @@
         </w:rPr>
         <w:t>PtmAuthGroups</w:t>
       </w:r>
+      <w:proofErr w:type="spellEnd"/>
     </w:p>
     <w:p>
       <w:pPr>
@@ -7293,6 +7965,7 @@
           <w:rFonts w:ascii="Calibri" w:eastAsia="Times New Roman" w:hAnsi="Calibri" w:cs="Calibri"/>
         </w:rPr>
       </w:pPr>
+      <w:proofErr w:type="spellStart"/>
       <w:r>
         <w:rPr>
           <w:rFonts w:ascii="Consolas" w:eastAsiaTheme="minorHAnsi" w:hAnsi="Consolas" w:cs="Consolas"/>
@@ -7302,6 +7975,7 @@
         </w:rPr>
         <w:t>system.web</w:t>
       </w:r>
+      <w:proofErr w:type="spellEnd"/>
       <w:r>
         <w:rPr>
           <w:rFonts w:ascii="Consolas" w:eastAsiaTheme="minorHAnsi" w:hAnsi="Consolas" w:cs="Consolas"/>
@@ -7388,6 +8062,7 @@
           <w:numId w:val="12"/>
         </w:numPr>
       </w:pPr>
+      <w:proofErr w:type="spellStart"/>
       <w:r>
         <w:rPr>
           <w:rFonts w:ascii="Consolas" w:eastAsiaTheme="minorHAnsi" w:hAnsi="Consolas" w:cs="Consolas"/>
@@ -7397,6 +8072,7 @@
         </w:rPr>
         <w:t>elmah</w:t>
       </w:r>
+      <w:proofErr w:type="spellEnd"/>
       <w:r>
         <w:t xml:space="preserve"> section</w:t>
       </w:r>
@@ -7421,6 +8097,7 @@
         </w:rPr>
         <w:t xml:space="preserve">in </w:t>
       </w:r>
+      <w:proofErr w:type="spellStart"/>
       <w:r>
         <w:rPr>
           <w:rFonts w:ascii="Consolas" w:eastAsiaTheme="minorHAnsi" w:hAnsi="Consolas" w:cs="Consolas"/>
@@ -7430,12 +8107,28 @@
         </w:rPr>
         <w:t>errorLog</w:t>
       </w:r>
-      <w:r>
-        <w:rPr>
-          <w:rFonts w:ascii="Calibri" w:eastAsia="Times New Roman" w:hAnsi="Calibri" w:cs="Calibri"/>
-        </w:rPr>
-        <w:t xml:space="preserve"> setting,  update the </w:t>
-      </w:r>
+      <w:proofErr w:type="spellEnd"/>
+      <w:r>
+        <w:rPr>
+          <w:rFonts w:ascii="Calibri" w:eastAsia="Times New Roman" w:hAnsi="Calibri" w:cs="Calibri"/>
+        </w:rPr>
+        <w:t xml:space="preserve"> </w:t>
+      </w:r>
+      <w:proofErr w:type="gramStart"/>
+      <w:r>
+        <w:rPr>
+          <w:rFonts w:ascii="Calibri" w:eastAsia="Times New Roman" w:hAnsi="Calibri" w:cs="Calibri"/>
+        </w:rPr>
+        <w:t>setting,  update</w:t>
+      </w:r>
+      <w:proofErr w:type="gramEnd"/>
+      <w:r>
+        <w:rPr>
+          <w:rFonts w:ascii="Calibri" w:eastAsia="Times New Roman" w:hAnsi="Calibri" w:cs="Calibri"/>
+        </w:rPr>
+        <w:t xml:space="preserve"> the </w:t>
+      </w:r>
+      <w:proofErr w:type="spellStart"/>
       <w:r>
         <w:rPr>
           <w:rFonts w:ascii="Consolas" w:eastAsiaTheme="minorHAnsi" w:hAnsi="Consolas" w:cs="Consolas"/>
@@ -7445,6 +8138,7 @@
         </w:rPr>
         <w:t>connectionString</w:t>
       </w:r>
+      <w:proofErr w:type="spellEnd"/>
       <w:r>
         <w:rPr>
           <w:rFonts w:ascii="Calibri" w:eastAsia="Times New Roman" w:hAnsi="Calibri" w:cs="Calibri"/>
@@ -7471,7 +8165,15 @@
         <w:t>g</w:t>
       </w:r>
       <w:r>
-        <w:t>enBOE Auto Backup - App.Config Customization</w:t>
+        <w:t xml:space="preserve">enBOE Auto Backup - </w:t>
+      </w:r>
+      <w:proofErr w:type="spellStart"/>
+      <w:r>
+        <w:t>App.Config</w:t>
+      </w:r>
+      <w:proofErr w:type="spellEnd"/>
+      <w:r>
+        <w:t xml:space="preserve"> Customization</w:t>
       </w:r>
       <w:bookmarkEnd w:id="53"/>
       <w:bookmarkEnd w:id="54"/>
@@ -7485,6 +8187,7 @@
         </w:numPr>
         <w:spacing w:after="0"/>
       </w:pPr>
+      <w:proofErr w:type="spellStart"/>
       <w:r>
         <w:rPr>
           <w:rFonts w:ascii="Consolas" w:eastAsiaTheme="minorHAnsi" w:hAnsi="Consolas" w:cs="Consolas"/>
@@ -7494,6 +8197,7 @@
         </w:rPr>
         <w:t>connectionStrings</w:t>
       </w:r>
+      <w:proofErr w:type="spellEnd"/>
       <w:r>
         <w:rPr>
           <w:rFonts w:ascii="Calibri" w:eastAsia="Times New Roman" w:hAnsi="Calibri" w:cs="Calibri"/>
@@ -7510,6 +8214,7 @@
         </w:numPr>
         <w:spacing w:after="0"/>
       </w:pPr>
+      <w:proofErr w:type="spellStart"/>
       <w:r>
         <w:rPr>
           <w:rFonts w:ascii="Consolas" w:eastAsiaTheme="minorHAnsi" w:hAnsi="Consolas" w:cs="Consolas"/>
@@ -7517,7 +8222,17 @@
           <w:sz w:val="19"/>
           <w:szCs w:val="19"/>
         </w:rPr>
-        <w:t xml:space="preserve">GenBoeEntities </w:t>
+        <w:t>GenBoeEntities</w:t>
+      </w:r>
+      <w:proofErr w:type="spellEnd"/>
+      <w:r>
+        <w:rPr>
+          <w:rFonts w:ascii="Consolas" w:eastAsiaTheme="minorHAnsi" w:hAnsi="Consolas" w:cs="Consolas"/>
+          <w:color w:val="0000FF"/>
+          <w:sz w:val="19"/>
+          <w:szCs w:val="19"/>
+        </w:rPr>
+        <w:t xml:space="preserve"> </w:t>
       </w:r>
       <w:r>
         <w:rPr>
@@ -7535,6 +8250,7 @@
         </w:numPr>
         <w:spacing w:after="0"/>
       </w:pPr>
+      <w:proofErr w:type="spellStart"/>
       <w:r>
         <w:rPr>
           <w:rFonts w:ascii="Consolas" w:eastAsiaTheme="minorHAnsi" w:hAnsi="Consolas" w:cs="Consolas"/>
@@ -7544,6 +8260,7 @@
         </w:rPr>
         <w:t>appSettings</w:t>
       </w:r>
+      <w:proofErr w:type="spellEnd"/>
       <w:r>
         <w:rPr>
           <w:rFonts w:ascii="Calibri" w:eastAsia="Times New Roman" w:hAnsi="Calibri" w:cs="Calibri"/>
@@ -7563,6 +8280,7 @@
           <w:rFonts w:ascii="Calibri" w:eastAsia="Times New Roman" w:hAnsi="Calibri" w:cs="Calibri"/>
         </w:rPr>
       </w:pPr>
+      <w:proofErr w:type="spellStart"/>
       <w:r>
         <w:rPr>
           <w:rFonts w:ascii="Consolas" w:eastAsiaTheme="minorHAnsi" w:hAnsi="Consolas" w:cs="Consolas"/>
@@ -7572,6 +8290,7 @@
         </w:rPr>
         <w:t>EmailServer</w:t>
       </w:r>
+      <w:proofErr w:type="spellEnd"/>
       <w:r>
         <w:t xml:space="preserve"> </w:t>
       </w:r>
@@ -7591,6 +8310,7 @@
         </w:numPr>
         <w:spacing w:after="0"/>
       </w:pPr>
+      <w:proofErr w:type="spellStart"/>
       <w:r>
         <w:rPr>
           <w:rFonts w:ascii="Consolas" w:eastAsiaTheme="minorHAnsi" w:hAnsi="Consolas" w:cs="Consolas"/>
@@ -7600,6 +8320,7 @@
         </w:rPr>
         <w:t>HelpdeskEmailAddress</w:t>
       </w:r>
+      <w:proofErr w:type="spellEnd"/>
       <w:r>
         <w:t xml:space="preserve"> – email displayed to the users to contact for help</w:t>
       </w:r>
@@ -7616,6 +8337,7 @@
           <w:rFonts w:ascii="Calibri" w:eastAsia="Times New Roman" w:hAnsi="Calibri" w:cs="Calibri"/>
         </w:rPr>
       </w:pPr>
+      <w:proofErr w:type="spellStart"/>
       <w:r>
         <w:rPr>
           <w:rFonts w:ascii="Consolas" w:eastAsiaTheme="minorHAnsi" w:hAnsi="Consolas" w:cs="Consolas"/>
@@ -7623,7 +8345,17 @@
           <w:sz w:val="19"/>
           <w:szCs w:val="19"/>
         </w:rPr>
-        <w:t xml:space="preserve">EmailOnFailureOnly </w:t>
+        <w:t>EmailOnFailureOnly</w:t>
+      </w:r>
+      <w:proofErr w:type="spellEnd"/>
+      <w:r>
+        <w:rPr>
+          <w:rFonts w:ascii="Consolas" w:eastAsiaTheme="minorHAnsi" w:hAnsi="Consolas" w:cs="Consolas"/>
+          <w:color w:val="0000FF"/>
+          <w:sz w:val="19"/>
+          <w:szCs w:val="19"/>
+        </w:rPr>
+        <w:t xml:space="preserve"> </w:t>
       </w:r>
       <w:r>
         <w:rPr>
@@ -7652,6 +8384,7 @@
           <w:rFonts w:ascii="Calibri" w:eastAsia="Times New Roman" w:hAnsi="Calibri" w:cs="Calibri"/>
         </w:rPr>
       </w:pPr>
+      <w:proofErr w:type="spellStart"/>
       <w:r>
         <w:rPr>
           <w:rFonts w:ascii="Consolas" w:eastAsiaTheme="minorHAnsi" w:hAnsi="Consolas" w:cs="Consolas"/>
@@ -7659,7 +8392,17 @@
           <w:sz w:val="19"/>
           <w:szCs w:val="19"/>
         </w:rPr>
-        <w:t xml:space="preserve">SendEmailTo </w:t>
+        <w:t>SendEmailTo</w:t>
+      </w:r>
+      <w:proofErr w:type="spellEnd"/>
+      <w:r>
+        <w:rPr>
+          <w:rFonts w:ascii="Consolas" w:eastAsiaTheme="minorHAnsi" w:hAnsi="Consolas" w:cs="Consolas"/>
+          <w:color w:val="0000FF"/>
+          <w:sz w:val="19"/>
+          <w:szCs w:val="19"/>
+        </w:rPr>
+        <w:t xml:space="preserve"> </w:t>
       </w:r>
       <w:r>
         <w:rPr>
@@ -7694,6 +8437,7 @@
           <w:numId w:val="11"/>
         </w:numPr>
       </w:pPr>
+      <w:proofErr w:type="spellStart"/>
       <w:r>
         <w:rPr>
           <w:rFonts w:ascii="Consolas" w:eastAsiaTheme="minorHAnsi" w:hAnsi="Consolas" w:cs="Consolas"/>
@@ -7703,6 +8447,7 @@
         </w:rPr>
         <w:t>elmah</w:t>
       </w:r>
+      <w:proofErr w:type="spellEnd"/>
       <w:r>
         <w:t xml:space="preserve"> section</w:t>
       </w:r>
@@ -7722,6 +8467,7 @@
         </w:rPr>
         <w:t xml:space="preserve">in </w:t>
       </w:r>
+      <w:proofErr w:type="spellStart"/>
       <w:r>
         <w:rPr>
           <w:rFonts w:ascii="Consolas" w:eastAsiaTheme="minorHAnsi" w:hAnsi="Consolas" w:cs="Consolas"/>
@@ -7731,12 +8477,28 @@
         </w:rPr>
         <w:t>errorLog</w:t>
       </w:r>
-      <w:r>
-        <w:rPr>
-          <w:rFonts w:ascii="Calibri" w:eastAsia="Times New Roman" w:hAnsi="Calibri" w:cs="Calibri"/>
-        </w:rPr>
-        <w:t xml:space="preserve"> setting,  update the </w:t>
-      </w:r>
+      <w:proofErr w:type="spellEnd"/>
+      <w:r>
+        <w:rPr>
+          <w:rFonts w:ascii="Calibri" w:eastAsia="Times New Roman" w:hAnsi="Calibri" w:cs="Calibri"/>
+        </w:rPr>
+        <w:t xml:space="preserve"> </w:t>
+      </w:r>
+      <w:proofErr w:type="gramStart"/>
+      <w:r>
+        <w:rPr>
+          <w:rFonts w:ascii="Calibri" w:eastAsia="Times New Roman" w:hAnsi="Calibri" w:cs="Calibri"/>
+        </w:rPr>
+        <w:t>setting,  update</w:t>
+      </w:r>
+      <w:proofErr w:type="gramEnd"/>
+      <w:r>
+        <w:rPr>
+          <w:rFonts w:ascii="Calibri" w:eastAsia="Times New Roman" w:hAnsi="Calibri" w:cs="Calibri"/>
+        </w:rPr>
+        <w:t xml:space="preserve"> the </w:t>
+      </w:r>
+      <w:proofErr w:type="spellStart"/>
       <w:r>
         <w:rPr>
           <w:rFonts w:ascii="Consolas" w:eastAsiaTheme="minorHAnsi" w:hAnsi="Consolas" w:cs="Consolas"/>
@@ -7746,6 +8508,7 @@
         </w:rPr>
         <w:t>connectionString</w:t>
       </w:r>
+      <w:proofErr w:type="spellEnd"/>
       <w:r>
         <w:rPr>
           <w:rFonts w:ascii="Calibri" w:eastAsia="Times New Roman" w:hAnsi="Calibri" w:cs="Calibri"/>
@@ -7782,7 +8545,7 @@
 </file>
 
 <file path=word/comments.xml><?xml version="1.0" encoding="utf-8"?>
-<w:comments xmlns:wpc="http://schemas.microsoft.com/office/word/2010/wordprocessingCanvas" xmlns:cx="http://schemas.microsoft.com/office/drawing/2014/chartex" xmlns:cx1="http://schemas.microsoft.com/office/drawing/2015/9/8/chartex" xmlns:cx2="http://schemas.microsoft.com/office/drawing/2015/10/21/chartex" xmlns:cx3="http://schemas.microsoft.com/office/drawing/2016/5/9/chartex" xmlns:cx4="http://schemas.microsoft.com/office/drawing/2016/5/10/chartex" xmlns:cx5="http://schemas.microsoft.com/office/drawing/2016/5/11/chartex" xmlns:cx6="http://schemas.microsoft.com/office/drawing/2016/5/12/chartex" xmlns:cx7="http://schemas.microsoft.com/office/drawing/2016/5/13/chartex" xmlns:cx8="http://schemas.microsoft.com/office/drawing/2016/5/14/chartex" xmlns:mc="http://schemas.openxmlformats.org/markup-compatibility/2006" xmlns:aink="http://schemas.microsoft.com/office/drawing/2016/ink" xmlns:am3d="http://schemas.microsoft.com/office/drawing/2017/model3d" xmlns:o="urn:schemas-microsoft-com:office:office" xmlns:r="http://schemas.openxmlformats.org/officeDocument/2006/relationships" xmlns:m="http://schemas.openxmlformats.org/officeDocument/2006/math" xmlns:v="urn:schemas-microsoft-com:vml" xmlns:wp14="http://schemas.microsoft.com/office/word/2010/wordprocessingDrawing" xmlns:wp="http://schemas.openxmlformats.org/drawingml/2006/wordprocessingDrawing" xmlns:w10="urn:schemas-microsoft-com:office:word" xmlns:w="http://schemas.openxmlformats.org/wordprocessingml/2006/main" xmlns:w14="http://schemas.microsoft.com/office/word/2010/wordml" xmlns:w15="http://schemas.microsoft.com/office/word/2012/wordml" xmlns:w16cex="http://schemas.microsoft.com/office/word/2018/wordml/cex" xmlns:w16cid="http://schemas.microsoft.com/office/word/2016/wordml/cid" xmlns:w16="http://schemas.microsoft.com/office/word/2018/wordml" xmlns:w16sdtdh="http://schemas.microsoft.com/office/word/2020/wordml/sdtdatahash" xmlns:w16se="http://schemas.microsoft.com/office/word/2015/wordml/symex" xmlns:wpg="http://schemas.microsoft.com/office/word/2010/wordprocessingGroup" xmlns:wpi="http://schemas.microsoft.com/office/word/2010/wordprocessingInk" xmlns:wne="http://schemas.microsoft.com/office/word/2006/wordml" xmlns:wps="http://schemas.microsoft.com/office/word/2010/wordprocessingShape" mc:Ignorable="w14 w15 w16se w16cid w16 w16cex w16sdtdh wp14">
+<w:comments xmlns:wpc="http://schemas.microsoft.com/office/word/2010/wordprocessingCanvas" xmlns:cx="http://schemas.microsoft.com/office/drawing/2014/chartex" xmlns:cx1="http://schemas.microsoft.com/office/drawing/2015/9/8/chartex" xmlns:cx2="http://schemas.microsoft.com/office/drawing/2015/10/21/chartex" xmlns:cx3="http://schemas.microsoft.com/office/drawing/2016/5/9/chartex" xmlns:cx4="http://schemas.microsoft.com/office/drawing/2016/5/10/chartex" xmlns:cx5="http://schemas.microsoft.com/office/drawing/2016/5/11/chartex" xmlns:cx6="http://schemas.microsoft.com/office/drawing/2016/5/12/chartex" xmlns:cx7="http://schemas.microsoft.com/office/drawing/2016/5/13/chartex" xmlns:cx8="http://schemas.microsoft.com/office/drawing/2016/5/14/chartex" xmlns:mc="http://schemas.openxmlformats.org/markup-compatibility/2006" xmlns:aink="http://schemas.microsoft.com/office/drawing/2016/ink" xmlns:am3d="http://schemas.microsoft.com/office/drawing/2017/model3d" xmlns:o="urn:schemas-microsoft-com:office:office" xmlns:oel="http://schemas.microsoft.com/office/2019/extlst" xmlns:r="http://schemas.openxmlformats.org/officeDocument/2006/relationships" xmlns:m="http://schemas.openxmlformats.org/officeDocument/2006/math" xmlns:v="urn:schemas-microsoft-com:vml" xmlns:wp14="http://schemas.microsoft.com/office/word/2010/wordprocessingDrawing" xmlns:wp="http://schemas.openxmlformats.org/drawingml/2006/wordprocessingDrawing" xmlns:w10="urn:schemas-microsoft-com:office:word" xmlns:w="http://schemas.openxmlformats.org/wordprocessingml/2006/main" xmlns:w14="http://schemas.microsoft.com/office/word/2010/wordml" xmlns:w15="http://schemas.microsoft.com/office/word/2012/wordml" xmlns:w16cex="http://schemas.microsoft.com/office/word/2018/wordml/cex" xmlns:w16cid="http://schemas.microsoft.com/office/word/2016/wordml/cid" xmlns:w16="http://schemas.microsoft.com/office/word/2018/wordml" xmlns:w16sdtdh="http://schemas.microsoft.com/office/word/2020/wordml/sdtdatahash" xmlns:w16se="http://schemas.microsoft.com/office/word/2015/wordml/symex" xmlns:wpg="http://schemas.microsoft.com/office/word/2010/wordprocessingGroup" xmlns:wpi="http://schemas.microsoft.com/office/word/2010/wordprocessingInk" xmlns:wne="http://schemas.microsoft.com/office/word/2006/wordml" xmlns:wps="http://schemas.microsoft.com/office/word/2010/wordprocessingShape" mc:Ignorable="w14 w15 w16se w16cid w16 w16cex w16sdtdh wp14">
   <w:comment w:id="48" w:author="Palider, Dusan (US)" w:date="2022-03-16T13:49:00Z" w:initials="DP">
     <w:p>
       <w:pPr>
@@ -7841,7 +8604,7 @@
 </file>
 
 <file path=word/commentsExtended.xml><?xml version="1.0" encoding="utf-8"?>
-<w15:commentsEx xmlns:wpc="http://schemas.microsoft.com/office/word/2010/wordprocessingCanvas" xmlns:cx="http://schemas.microsoft.com/office/drawing/2014/chartex" xmlns:cx1="http://schemas.microsoft.com/office/drawing/2015/9/8/chartex" xmlns:cx2="http://schemas.microsoft.com/office/drawing/2015/10/21/chartex" xmlns:cx3="http://schemas.microsoft.com/office/drawing/2016/5/9/chartex" xmlns:cx4="http://schemas.microsoft.com/office/drawing/2016/5/10/chartex" xmlns:cx5="http://schemas.microsoft.com/office/drawing/2016/5/11/chartex" xmlns:cx6="http://schemas.microsoft.com/office/drawing/2016/5/12/chartex" xmlns:cx7="http://schemas.microsoft.com/office/drawing/2016/5/13/chartex" xmlns:cx8="http://schemas.microsoft.com/office/drawing/2016/5/14/chartex" xmlns:mc="http://schemas.openxmlformats.org/markup-compatibility/2006" xmlns:aink="http://schemas.microsoft.com/office/drawing/2016/ink" xmlns:am3d="http://schemas.microsoft.com/office/drawing/2017/model3d" xmlns:o="urn:schemas-microsoft-com:office:office" xmlns:r="http://schemas.openxmlformats.org/officeDocument/2006/relationships" xmlns:m="http://schemas.openxmlformats.org/officeDocument/2006/math" xmlns:v="urn:schemas-microsoft-com:vml" xmlns:wp14="http://schemas.microsoft.com/office/word/2010/wordprocessingDrawing" xmlns:wp="http://schemas.openxmlformats.org/drawingml/2006/wordprocessingDrawing" xmlns:w10="urn:schemas-microsoft-com:office:word" xmlns:w="http://schemas.openxmlformats.org/wordprocessingml/2006/main" xmlns:w14="http://schemas.microsoft.com/office/word/2010/wordml" xmlns:w15="http://schemas.microsoft.com/office/word/2012/wordml" xmlns:w16cex="http://schemas.microsoft.com/office/word/2018/wordml/cex" xmlns:w16cid="http://schemas.microsoft.com/office/word/2016/wordml/cid" xmlns:w16="http://schemas.microsoft.com/office/word/2018/wordml" xmlns:w16sdtdh="http://schemas.microsoft.com/office/word/2020/wordml/sdtdatahash" xmlns:w16se="http://schemas.microsoft.com/office/word/2015/wordml/symex" xmlns:wpg="http://schemas.microsoft.com/office/word/2010/wordprocessingGroup" xmlns:wpi="http://schemas.microsoft.com/office/word/2010/wordprocessingInk" xmlns:wne="http://schemas.microsoft.com/office/word/2006/wordml" xmlns:wps="http://schemas.microsoft.com/office/word/2010/wordprocessingShape" mc:Ignorable="w14 w15 w16se w16cid w16 w16cex w16sdtdh wp14">
+<w15:commentsEx xmlns:wpc="http://schemas.microsoft.com/office/word/2010/wordprocessingCanvas" xmlns:cx="http://schemas.microsoft.com/office/drawing/2014/chartex" xmlns:cx1="http://schemas.microsoft.com/office/drawing/2015/9/8/chartex" xmlns:cx2="http://schemas.microsoft.com/office/drawing/2015/10/21/chartex" xmlns:cx3="http://schemas.microsoft.com/office/drawing/2016/5/9/chartex" xmlns:cx4="http://schemas.microsoft.com/office/drawing/2016/5/10/chartex" xmlns:cx5="http://schemas.microsoft.com/office/drawing/2016/5/11/chartex" xmlns:cx6="http://schemas.microsoft.com/office/drawing/2016/5/12/chartex" xmlns:cx7="http://schemas.microsoft.com/office/drawing/2016/5/13/chartex" xmlns:cx8="http://schemas.microsoft.com/office/drawing/2016/5/14/chartex" xmlns:mc="http://schemas.openxmlformats.org/markup-compatibility/2006" xmlns:aink="http://schemas.microsoft.com/office/drawing/2016/ink" xmlns:am3d="http://schemas.microsoft.com/office/drawing/2017/model3d" xmlns:o="urn:schemas-microsoft-com:office:office" xmlns:oel="http://schemas.microsoft.com/office/2019/extlst" xmlns:r="http://schemas.openxmlformats.org/officeDocument/2006/relationships" xmlns:m="http://schemas.openxmlformats.org/officeDocument/2006/math" xmlns:v="urn:schemas-microsoft-com:vml" xmlns:wp14="http://schemas.microsoft.com/office/word/2010/wordprocessingDrawing" xmlns:wp="http://schemas.openxmlformats.org/drawingml/2006/wordprocessingDrawing" xmlns:w10="urn:schemas-microsoft-com:office:word" xmlns:w="http://schemas.openxmlformats.org/wordprocessingml/2006/main" xmlns:w14="http://schemas.microsoft.com/office/word/2010/wordml" xmlns:w15="http://schemas.microsoft.com/office/word/2012/wordml" xmlns:w16cex="http://schemas.microsoft.com/office/word/2018/wordml/cex" xmlns:w16cid="http://schemas.microsoft.com/office/word/2016/wordml/cid" xmlns:w16="http://schemas.microsoft.com/office/word/2018/wordml" xmlns:w16sdtdh="http://schemas.microsoft.com/office/word/2020/wordml/sdtdatahash" xmlns:w16se="http://schemas.microsoft.com/office/word/2015/wordml/symex" xmlns:wpg="http://schemas.microsoft.com/office/word/2010/wordprocessingGroup" xmlns:wpi="http://schemas.microsoft.com/office/word/2010/wordprocessingInk" xmlns:wne="http://schemas.microsoft.com/office/word/2006/wordml" xmlns:wps="http://schemas.microsoft.com/office/word/2010/wordprocessingShape" mc:Ignorable="w14 w15 w16se w16cid w16 w16cex w16sdtdh wp14">
   <w15:commentEx w15:paraId="5130C7D0" w15:done="0"/>
   <w15:commentEx w15:paraId="415B1A11" w15:done="0"/>
   <w15:commentEx w15:paraId="1019FC62" w15:done="0"/>
@@ -7849,7 +8612,7 @@
 </file>
 
 <file path=word/commentsExtensible.xml><?xml version="1.0" encoding="utf-8"?>
-<w16cex:commentsExtensible xmlns:wpc="http://schemas.microsoft.com/office/word/2010/wordprocessingCanvas" xmlns:cx="http://schemas.microsoft.com/office/drawing/2014/chartex" xmlns:cx1="http://schemas.microsoft.com/office/drawing/2015/9/8/chartex" xmlns:cx2="http://schemas.microsoft.com/office/drawing/2015/10/21/chartex" xmlns:cx3="http://schemas.microsoft.com/office/drawing/2016/5/9/chartex" xmlns:cx4="http://schemas.microsoft.com/office/drawing/2016/5/10/chartex" xmlns:cx5="http://schemas.microsoft.com/office/drawing/2016/5/11/chartex" xmlns:cx6="http://schemas.microsoft.com/office/drawing/2016/5/12/chartex" xmlns:cx7="http://schemas.microsoft.com/office/drawing/2016/5/13/chartex" xmlns:cx8="http://schemas.microsoft.com/office/drawing/2016/5/14/chartex" xmlns:mc="http://schemas.openxmlformats.org/markup-compatibility/2006" xmlns:aink="http://schemas.microsoft.com/office/drawing/2016/ink" xmlns:am3d="http://schemas.microsoft.com/office/drawing/2017/model3d" xmlns:o="urn:schemas-microsoft-com:office:office" xmlns:r="http://schemas.openxmlformats.org/officeDocument/2006/relationships" xmlns:m="http://schemas.openxmlformats.org/officeDocument/2006/math" xmlns:v="urn:schemas-microsoft-com:vml" xmlns:wp14="http://schemas.microsoft.com/office/word/2010/wordprocessingDrawing" xmlns:wp="http://schemas.openxmlformats.org/drawingml/2006/wordprocessingDrawing" xmlns:w10="urn:schemas-microsoft-com:office:word" xmlns:w="http://schemas.openxmlformats.org/wordprocessingml/2006/main" xmlns:w14="http://schemas.microsoft.com/office/word/2010/wordml" xmlns:w15="http://schemas.microsoft.com/office/word/2012/wordml" xmlns:w16cex="http://schemas.microsoft.com/office/word/2018/wordml/cex" xmlns:w16cid="http://schemas.microsoft.com/office/word/2016/wordml/cid" xmlns:w16="http://schemas.microsoft.com/office/word/2018/wordml" xmlns:w16sdtdh="http://schemas.microsoft.com/office/word/2020/wordml/sdtdatahash" xmlns:w16se="http://schemas.microsoft.com/office/word/2015/wordml/symex" xmlns:wpg="http://schemas.microsoft.com/office/word/2010/wordprocessingGroup" xmlns:wpi="http://schemas.microsoft.com/office/word/2010/wordprocessingInk" xmlns:wne="http://schemas.microsoft.com/office/word/2006/wordml" xmlns:wps="http://schemas.microsoft.com/office/word/2010/wordprocessingShape" mc:Ignorable="w14 w15 w16se w16cid w16 w16cex w16sdtdh wp14">
+<w16cex:commentsExtensible xmlns:wpc="http://schemas.microsoft.com/office/word/2010/wordprocessingCanvas" xmlns:cx="http://schemas.microsoft.com/office/drawing/2014/chartex" xmlns:cx1="http://schemas.microsoft.com/office/drawing/2015/9/8/chartex" xmlns:cx2="http://schemas.microsoft.com/office/drawing/2015/10/21/chartex" xmlns:cx3="http://schemas.microsoft.com/office/drawing/2016/5/9/chartex" xmlns:cx4="http://schemas.microsoft.com/office/drawing/2016/5/10/chartex" xmlns:cx5="http://schemas.microsoft.com/office/drawing/2016/5/11/chartex" xmlns:cx6="http://schemas.microsoft.com/office/drawing/2016/5/12/chartex" xmlns:cx7="http://schemas.microsoft.com/office/drawing/2016/5/13/chartex" xmlns:cx8="http://schemas.microsoft.com/office/drawing/2016/5/14/chartex" xmlns:mc="http://schemas.openxmlformats.org/markup-compatibility/2006" xmlns:aink="http://schemas.microsoft.com/office/drawing/2016/ink" xmlns:am3d="http://schemas.microsoft.com/office/drawing/2017/model3d" xmlns:o="urn:schemas-microsoft-com:office:office" xmlns:oel="http://schemas.microsoft.com/office/2019/extlst" xmlns:r="http://schemas.openxmlformats.org/officeDocument/2006/relationships" xmlns:m="http://schemas.openxmlformats.org/officeDocument/2006/math" xmlns:v="urn:schemas-microsoft-com:vml" xmlns:wp14="http://schemas.microsoft.com/office/word/2010/wordprocessingDrawing" xmlns:wp="http://schemas.openxmlformats.org/drawingml/2006/wordprocessingDrawing" xmlns:w10="urn:schemas-microsoft-com:office:word" xmlns:w="http://schemas.openxmlformats.org/wordprocessingml/2006/main" xmlns:w14="http://schemas.microsoft.com/office/word/2010/wordml" xmlns:w15="http://schemas.microsoft.com/office/word/2012/wordml" xmlns:w16cex="http://schemas.microsoft.com/office/word/2018/wordml/cex" xmlns:w16cid="http://schemas.microsoft.com/office/word/2016/wordml/cid" xmlns:w16="http://schemas.microsoft.com/office/word/2018/wordml" xmlns:w16sdtdh="http://schemas.microsoft.com/office/word/2020/wordml/sdtdatahash" xmlns:w16se="http://schemas.microsoft.com/office/word/2015/wordml/symex" xmlns:wpg="http://schemas.microsoft.com/office/word/2010/wordprocessingGroup" xmlns:wpi="http://schemas.microsoft.com/office/word/2010/wordprocessingInk" xmlns:wne="http://schemas.microsoft.com/office/word/2006/wordml" xmlns:wps="http://schemas.microsoft.com/office/word/2010/wordprocessingShape" mc:Ignorable="w14 w15 w16se w16cid w16 w16cex w16sdtdh wp14">
   <w16cex:commentExtensible w16cex:durableId="25DC6983" w16cex:dateUtc="2022-03-16T17:49:00Z"/>
   <w16cex:commentExtensible w16cex:durableId="25DC696B" w16cex:dateUtc="2022-03-16T17:49:00Z"/>
   <w16cex:commentExtensible w16cex:durableId="25DC670B" w16cex:dateUtc="2022-03-16T17:39:00Z"/>
@@ -7857,7 +8620,7 @@
 </file>
 
 <file path=word/commentsIds.xml><?xml version="1.0" encoding="utf-8"?>
-<w16cid:commentsIds xmlns:wpc="http://schemas.microsoft.com/office/word/2010/wordprocessingCanvas" xmlns:cx="http://schemas.microsoft.com/office/drawing/2014/chartex" xmlns:cx1="http://schemas.microsoft.com/office/drawing/2015/9/8/chartex" xmlns:cx2="http://schemas.microsoft.com/office/drawing/2015/10/21/chartex" xmlns:cx3="http://schemas.microsoft.com/office/drawing/2016/5/9/chartex" xmlns:cx4="http://schemas.microsoft.com/office/drawing/2016/5/10/chartex" xmlns:cx5="http://schemas.microsoft.com/office/drawing/2016/5/11/chartex" xmlns:cx6="http://schemas.microsoft.com/office/drawing/2016/5/12/chartex" xmlns:cx7="http://schemas.microsoft.com/office/drawing/2016/5/13/chartex" xmlns:cx8="http://schemas.microsoft.com/office/drawing/2016/5/14/chartex" xmlns:mc="http://schemas.openxmlformats.org/markup-compatibility/2006" xmlns:aink="http://schemas.microsoft.com/office/drawing/2016/ink" xmlns:am3d="http://schemas.microsoft.com/office/drawing/2017/model3d" xmlns:o="urn:schemas-microsoft-com:office:office" xmlns:r="http://schemas.openxmlformats.org/officeDocument/2006/relationships" xmlns:m="http://schemas.openxmlformats.org/officeDocument/2006/math" xmlns:v="urn:schemas-microsoft-com:vml" xmlns:wp14="http://schemas.microsoft.com/office/word/2010/wordprocessingDrawing" xmlns:wp="http://schemas.openxmlformats.org/drawingml/2006/wordprocessingDrawing" xmlns:w10="urn:schemas-microsoft-com:office:word" xmlns:w="http://schemas.openxmlformats.org/wordprocessingml/2006/main" xmlns:w14="http://schemas.microsoft.com/office/word/2010/wordml" xmlns:w15="http://schemas.microsoft.com/office/word/2012/wordml" xmlns:w16cex="http://schemas.microsoft.com/office/word/2018/wordml/cex" xmlns:w16cid="http://schemas.microsoft.com/office/word/2016/wordml/cid" xmlns:w16="http://schemas.microsoft.com/office/word/2018/wordml" xmlns:w16sdtdh="http://schemas.microsoft.com/office/word/2020/wordml/sdtdatahash" xmlns:w16se="http://schemas.microsoft.com/office/word/2015/wordml/symex" xmlns:wpg="http://schemas.microsoft.com/office/word/2010/wordprocessingGroup" xmlns:wpi="http://schemas.microsoft.com/office/word/2010/wordprocessingInk" xmlns:wne="http://schemas.microsoft.com/office/word/2006/wordml" xmlns:wps="http://schemas.microsoft.com/office/word/2010/wordprocessingShape" mc:Ignorable="w14 w15 w16se w16cid w16 w16cex w16sdtdh wp14">
+<w16cid:commentsIds xmlns:wpc="http://schemas.microsoft.com/office/word/2010/wordprocessingCanvas" xmlns:cx="http://schemas.microsoft.com/office/drawing/2014/chartex" xmlns:cx1="http://schemas.microsoft.com/office/drawing/2015/9/8/chartex" xmlns:cx2="http://schemas.microsoft.com/office/drawing/2015/10/21/chartex" xmlns:cx3="http://schemas.microsoft.com/office/drawing/2016/5/9/chartex" xmlns:cx4="http://schemas.microsoft.com/office/drawing/2016/5/10/chartex" xmlns:cx5="http://schemas.microsoft.com/office/drawing/2016/5/11/chartex" xmlns:cx6="http://schemas.microsoft.com/office/drawing/2016/5/12/chartex" xmlns:cx7="http://schemas.microsoft.com/office/drawing/2016/5/13/chartex" xmlns:cx8="http://schemas.microsoft.com/office/drawing/2016/5/14/chartex" xmlns:mc="http://schemas.openxmlformats.org/markup-compatibility/2006" xmlns:aink="http://schemas.microsoft.com/office/drawing/2016/ink" xmlns:am3d="http://schemas.microsoft.com/office/drawing/2017/model3d" xmlns:o="urn:schemas-microsoft-com:office:office" xmlns:oel="http://schemas.microsoft.com/office/2019/extlst" xmlns:r="http://schemas.openxmlformats.org/officeDocument/2006/relationships" xmlns:m="http://schemas.openxmlformats.org/officeDocument/2006/math" xmlns:v="urn:schemas-microsoft-com:vml" xmlns:wp14="http://schemas.microsoft.com/office/word/2010/wordprocessingDrawing" xmlns:wp="http://schemas.openxmlformats.org/drawingml/2006/wordprocessingDrawing" xmlns:w10="urn:schemas-microsoft-com:office:word" xmlns:w="http://schemas.openxmlformats.org/wordprocessingml/2006/main" xmlns:w14="http://schemas.microsoft.com/office/word/2010/wordml" xmlns:w15="http://schemas.microsoft.com/office/word/2012/wordml" xmlns:w16cex="http://schemas.microsoft.com/office/word/2018/wordml/cex" xmlns:w16cid="http://schemas.microsoft.com/office/word/2016/wordml/cid" xmlns:w16="http://schemas.microsoft.com/office/word/2018/wordml" xmlns:w16sdtdh="http://schemas.microsoft.com/office/word/2020/wordml/sdtdatahash" xmlns:w16se="http://schemas.microsoft.com/office/word/2015/wordml/symex" xmlns:wpg="http://schemas.microsoft.com/office/word/2010/wordprocessingGroup" xmlns:wpi="http://schemas.microsoft.com/office/word/2010/wordprocessingInk" xmlns:wne="http://schemas.microsoft.com/office/word/2006/wordml" xmlns:wps="http://schemas.microsoft.com/office/word/2010/wordprocessingShape" mc:Ignorable="w14 w15 w16se w16cid w16 w16cex w16sdtdh wp14">
   <w16cid:commentId w16cid:paraId="5130C7D0" w16cid:durableId="25DC6983"/>
   <w16cid:commentId w16cid:paraId="415B1A11" w16cid:durableId="25DC696B"/>
   <w16cid:commentId w16cid:paraId="1019FC62" w16cid:durableId="25DC670B"/>
@@ -7865,7 +8628,7 @@
 </file>
 
 <file path=word/endnotes.xml><?xml version="1.0" encoding="utf-8"?>
-<w:endnotes xmlns:wpc="http://schemas.microsoft.com/office/word/2010/wordprocessingCanvas" xmlns:cx="http://schemas.microsoft.com/office/drawing/2014/chartex" xmlns:cx1="http://schemas.microsoft.com/office/drawing/2015/9/8/chartex" xmlns:cx2="http://schemas.microsoft.com/office/drawing/2015/10/21/chartex" xmlns:cx3="http://schemas.microsoft.com/office/drawing/2016/5/9/chartex" xmlns:cx4="http://schemas.microsoft.com/office/drawing/2016/5/10/chartex" xmlns:cx5="http://schemas.microsoft.com/office/drawing/2016/5/11/chartex" xmlns:cx6="http://schemas.microsoft.com/office/drawing/2016/5/12/chartex" xmlns:cx7="http://schemas.microsoft.com/office/drawing/2016/5/13/chartex" xmlns:cx8="http://schemas.microsoft.com/office/drawing/2016/5/14/chartex" xmlns:mc="http://schemas.openxmlformats.org/markup-compatibility/2006" xmlns:aink="http://schemas.microsoft.com/office/drawing/2016/ink" xmlns:am3d="http://schemas.microsoft.com/office/drawing/2017/model3d" xmlns:o="urn:schemas-microsoft-com:office:office" xmlns:r="http://schemas.openxmlformats.org/officeDocument/2006/relationships" xmlns:m="http://schemas.openxmlformats.org/officeDocument/2006/math" xmlns:v="urn:schemas-microsoft-com:vml" xmlns:wp14="http://schemas.microsoft.com/office/word/2010/wordprocessingDrawing" xmlns:wp="http://schemas.openxmlformats.org/drawingml/2006/wordprocessingDrawing" xmlns:w10="urn:schemas-microsoft-com:office:word" xmlns:w="http://schemas.openxmlformats.org/wordprocessingml/2006/main" xmlns:w14="http://schemas.microsoft.com/office/word/2010/wordml" xmlns:w15="http://schemas.microsoft.com/office/word/2012/wordml" xmlns:w16cex="http://schemas.microsoft.com/office/word/2018/wordml/cex" xmlns:w16cid="http://schemas.microsoft.com/office/word/2016/wordml/cid" xmlns:w16="http://schemas.microsoft.com/office/word/2018/wordml" xmlns:w16sdtdh="http://schemas.microsoft.com/office/word/2020/wordml/sdtdatahash" xmlns:w16se="http://schemas.microsoft.com/office/word/2015/wordml/symex" xmlns:wpg="http://schemas.microsoft.com/office/word/2010/wordprocessingGroup" xmlns:wpi="http://schemas.microsoft.com/office/word/2010/wordprocessingInk" xmlns:wne="http://schemas.microsoft.com/office/word/2006/wordml" xmlns:wps="http://schemas.microsoft.com/office/word/2010/wordprocessingShape" mc:Ignorable="w14 w15 w16se w16cid w16 w16cex w16sdtdh wp14">
+<w:endnotes xmlns:wpc="http://schemas.microsoft.com/office/word/2010/wordprocessingCanvas" xmlns:cx="http://schemas.microsoft.com/office/drawing/2014/chartex" xmlns:cx1="http://schemas.microsoft.com/office/drawing/2015/9/8/chartex" xmlns:cx2="http://schemas.microsoft.com/office/drawing/2015/10/21/chartex" xmlns:cx3="http://schemas.microsoft.com/office/drawing/2016/5/9/chartex" xmlns:cx4="http://schemas.microsoft.com/office/drawing/2016/5/10/chartex" xmlns:cx5="http://schemas.microsoft.com/office/drawing/2016/5/11/chartex" xmlns:cx6="http://schemas.microsoft.com/office/drawing/2016/5/12/chartex" xmlns:cx7="http://schemas.microsoft.com/office/drawing/2016/5/13/chartex" xmlns:cx8="http://schemas.microsoft.com/office/drawing/2016/5/14/chartex" xmlns:mc="http://schemas.openxmlformats.org/markup-compatibility/2006" xmlns:aink="http://schemas.microsoft.com/office/drawing/2016/ink" xmlns:am3d="http://schemas.microsoft.com/office/drawing/2017/model3d" xmlns:o="urn:schemas-microsoft-com:office:office" xmlns:oel="http://schemas.microsoft.com/office/2019/extlst" xmlns:r="http://schemas.openxmlformats.org/officeDocument/2006/relationships" xmlns:m="http://schemas.openxmlformats.org/officeDocument/2006/math" xmlns:v="urn:schemas-microsoft-com:vml" xmlns:wp14="http://schemas.microsoft.com/office/word/2010/wordprocessingDrawing" xmlns:wp="http://schemas.openxmlformats.org/drawingml/2006/wordprocessingDrawing" xmlns:w10="urn:schemas-microsoft-com:office:word" xmlns:w="http://schemas.openxmlformats.org/wordprocessingml/2006/main" xmlns:w14="http://schemas.microsoft.com/office/word/2010/wordml" xmlns:w15="http://schemas.microsoft.com/office/word/2012/wordml" xmlns:w16cex="http://schemas.microsoft.com/office/word/2018/wordml/cex" xmlns:w16cid="http://schemas.microsoft.com/office/word/2016/wordml/cid" xmlns:w16="http://schemas.microsoft.com/office/word/2018/wordml" xmlns:w16sdtdh="http://schemas.microsoft.com/office/word/2020/wordml/sdtdatahash" xmlns:w16se="http://schemas.microsoft.com/office/word/2015/wordml/symex" xmlns:wpg="http://schemas.microsoft.com/office/word/2010/wordprocessingGroup" xmlns:wpi="http://schemas.microsoft.com/office/word/2010/wordprocessingInk" xmlns:wne="http://schemas.microsoft.com/office/word/2006/wordml" xmlns:wps="http://schemas.microsoft.com/office/word/2010/wordprocessingShape" mc:Ignorable="w14 w15 w16se w16cid w16 w16cex w16sdtdh wp14">
   <w:endnote w:type="separator" w:id="-1">
     <w:p>
       <w:pPr>
@@ -7890,12 +8653,131 @@
 </file>
 
 <file path=word/footer1.xml><?xml version="1.0" encoding="utf-8"?>
-<w:ftr xmlns:wpc="http://schemas.microsoft.com/office/word/2010/wordprocessingCanvas" xmlns:cx="http://schemas.microsoft.com/office/drawing/2014/chartex" xmlns:cx1="http://schemas.microsoft.com/office/drawing/2015/9/8/chartex" xmlns:cx2="http://schemas.microsoft.com/office/drawing/2015/10/21/chartex" xmlns:cx3="http://schemas.microsoft.com/office/drawing/2016/5/9/chartex" xmlns:cx4="http://schemas.microsoft.com/office/drawing/2016/5/10/chartex" xmlns:cx5="http://schemas.microsoft.com/office/drawing/2016/5/11/chartex" xmlns:cx6="http://schemas.microsoft.com/office/drawing/2016/5/12/chartex" xmlns:cx7="http://schemas.microsoft.com/office/drawing/2016/5/13/chartex" xmlns:cx8="http://schemas.microsoft.com/office/drawing/2016/5/14/chartex" xmlns:mc="http://schemas.openxmlformats.org/markup-compatibility/2006" xmlns:aink="http://schemas.microsoft.com/office/drawing/2016/ink" xmlns:am3d="http://schemas.microsoft.com/office/drawing/2017/model3d" xmlns:o="urn:schemas-microsoft-com:office:office" xmlns:r="http://schemas.openxmlformats.org/officeDocument/2006/relationships" xmlns:m="http://schemas.openxmlformats.org/officeDocument/2006/math" xmlns:v="urn:schemas-microsoft-com:vml" xmlns:wp14="http://schemas.microsoft.com/office/word/2010/wordprocessingDrawing" xmlns:wp="http://schemas.openxmlformats.org/drawingml/2006/wordprocessingDrawing" xmlns:w10="urn:schemas-microsoft-com:office:word" xmlns:w="http://schemas.openxmlformats.org/wordprocessingml/2006/main" xmlns:w14="http://schemas.microsoft.com/office/word/2010/wordml" xmlns:w15="http://schemas.microsoft.com/office/word/2012/wordml" xmlns:w16cex="http://schemas.microsoft.com/office/word/2018/wordml/cex" xmlns:w16cid="http://schemas.microsoft.com/office/word/2016/wordml/cid" xmlns:w16="http://schemas.microsoft.com/office/word/2018/wordml" xmlns:w16sdtdh="http://schemas.microsoft.com/office/word/2020/wordml/sdtdatahash" xmlns:w16se="http://schemas.microsoft.com/office/word/2015/wordml/symex" xmlns:wpg="http://schemas.microsoft.com/office/word/2010/wordprocessingGroup" xmlns:wpi="http://schemas.microsoft.com/office/word/2010/wordprocessingInk" xmlns:wne="http://schemas.microsoft.com/office/word/2006/wordml" xmlns:wps="http://schemas.microsoft.com/office/word/2010/wordprocessingShape" mc:Ignorable="w14 w15 w16se w16cid w16 w16cex w16sdtdh wp14">
+<w:ftr xmlns:wpc="http://schemas.microsoft.com/office/word/2010/wordprocessingCanvas" xmlns:cx="http://schemas.microsoft.com/office/drawing/2014/chartex" xmlns:cx1="http://schemas.microsoft.com/office/drawing/2015/9/8/chartex" xmlns:cx2="http://schemas.microsoft.com/office/drawing/2015/10/21/chartex" xmlns:cx3="http://schemas.microsoft.com/office/drawing/2016/5/9/chartex" xmlns:cx4="http://schemas.microsoft.com/office/drawing/2016/5/10/chartex" xmlns:cx5="http://schemas.microsoft.com/office/drawing/2016/5/11/chartex" xmlns:cx6="http://schemas.microsoft.com/office/drawing/2016/5/12/chartex" xmlns:cx7="http://schemas.microsoft.com/office/drawing/2016/5/13/chartex" xmlns:cx8="http://schemas.microsoft.com/office/drawing/2016/5/14/chartex" xmlns:mc="http://schemas.openxmlformats.org/markup-compatibility/2006" xmlns:aink="http://schemas.microsoft.com/office/drawing/2016/ink" xmlns:am3d="http://schemas.microsoft.com/office/drawing/2017/model3d" xmlns:o="urn:schemas-microsoft-com:office:office" xmlns:oel="http://schemas.microsoft.com/office/2019/extlst" xmlns:r="http://schemas.openxmlformats.org/officeDocument/2006/relationships" xmlns:m="http://schemas.openxmlformats.org/officeDocument/2006/math" xmlns:v="urn:schemas-microsoft-com:vml" xmlns:wp14="http://schemas.microsoft.com/office/word/2010/wordprocessingDrawing" xmlns:wp="http://schemas.openxmlformats.org/drawingml/2006/wordprocessingDrawing" xmlns:w10="urn:schemas-microsoft-com:office:word" xmlns:w="http://schemas.openxmlformats.org/wordprocessingml/2006/main" xmlns:w14="http://schemas.microsoft.com/office/word/2010/wordml" xmlns:w15="http://schemas.microsoft.com/office/word/2012/wordml" xmlns:w16cex="http://schemas.microsoft.com/office/word/2018/wordml/cex" xmlns:w16cid="http://schemas.microsoft.com/office/word/2016/wordml/cid" xmlns:w16="http://schemas.microsoft.com/office/word/2018/wordml" xmlns:w16sdtdh="http://schemas.microsoft.com/office/word/2020/wordml/sdtdatahash" xmlns:w16se="http://schemas.microsoft.com/office/word/2015/wordml/symex" xmlns:wpg="http://schemas.microsoft.com/office/word/2010/wordprocessingGroup" xmlns:wpi="http://schemas.microsoft.com/office/word/2010/wordprocessingInk" xmlns:wne="http://schemas.microsoft.com/office/word/2006/wordml" xmlns:wps="http://schemas.microsoft.com/office/word/2010/wordprocessingShape" mc:Ignorable="w14 w15 w16se w16cid w16 w16cex w16sdtdh wp14">
   <w:p>
     <w:pPr>
       <w:pStyle w:val="Footer"/>
       <w:jc w:val="center"/>
     </w:pPr>
+    <w:r>
+      <w:rPr>
+        <w:noProof/>
+      </w:rPr>
+      <mc:AlternateContent>
+        <mc:Choice Requires="wps">
+          <w:drawing>
+            <wp:anchor distT="0" distB="0" distL="0" distR="0" simplePos="0" relativeHeight="251662336" behindDoc="0" locked="0" layoutInCell="1" allowOverlap="1" wp14:anchorId="502D05D3" wp14:editId="3DD61E31">
+              <wp:simplePos x="635" y="635"/>
+              <wp:positionH relativeFrom="column">
+                <wp:align>center</wp:align>
+              </wp:positionH>
+              <wp:positionV relativeFrom="paragraph">
+                <wp:posOffset>635</wp:posOffset>
+              </wp:positionV>
+              <wp:extent cx="443865" cy="443865"/>
+              <wp:effectExtent l="0" t="0" r="1905" b="18415"/>
+              <wp:wrapSquare wrapText="bothSides"/>
+              <wp:docPr id="5" name="Text Box 5" descr="Lockheed Martin Proprietary Information">
+                <a:extLst xmlns:a="http://schemas.openxmlformats.org/drawingml/2006/main">
+                  <a:ext uri="{5AE41FA2-C0FF-4470-9BD4-5FADCA87CBE2}">
+                    <aclsh:classification xmlns:aclsh="http://schemas.microsoft.com/office/drawing/2020/classificationShape" classificationOutcomeType="ftr"/>
+                  </a:ext>
+                </a:extLst>
+              </wp:docPr>
+              <wp:cNvGraphicFramePr/>
+              <a:graphic xmlns:a="http://schemas.openxmlformats.org/drawingml/2006/main">
+                <a:graphicData uri="http://schemas.microsoft.com/office/word/2010/wordprocessingShape">
+                  <wps:wsp>
+                    <wps:cNvSpPr txBox="1"/>
+                    <wps:spPr>
+                      <a:xfrm>
+                        <a:off x="0" y="0"/>
+                        <a:ext cx="443865" cy="443865"/>
+                      </a:xfrm>
+                      <a:prstGeom prst="rect">
+                        <a:avLst/>
+                      </a:prstGeom>
+                      <a:noFill/>
+                      <a:ln>
+                        <a:noFill/>
+                      </a:ln>
+                    </wps:spPr>
+                    <wps:txbx>
+                      <w:txbxContent>
+                        <w:p>
+                          <w:pPr>
+                            <w:rPr>
+                              <w:rFonts w:ascii="Calibri" w:eastAsia="Calibri" w:hAnsi="Calibri" w:cs="Calibri"/>
+                              <w:noProof/>
+                              <w:color w:val="000000"/>
+                              <w:sz w:val="20"/>
+                              <w:szCs w:val="20"/>
+                            </w:rPr>
+                          </w:pPr>
+                          <w:r>
+                            <w:rPr>
+                              <w:rFonts w:ascii="Calibri" w:eastAsia="Calibri" w:hAnsi="Calibri" w:cs="Calibri"/>
+                              <w:noProof/>
+                              <w:color w:val="000000"/>
+                              <w:sz w:val="20"/>
+                              <w:szCs w:val="20"/>
+                            </w:rPr>
+                            <w:t>Lockheed Martin Proprietary Information</w:t>
+                          </w:r>
+                        </w:p>
+                      </w:txbxContent>
+                    </wps:txbx>
+                    <wps:bodyPr rot="0" spcFirstLastPara="0" vertOverflow="overflow" horzOverflow="overflow" vert="horz" wrap="none" lIns="0" tIns="0" rIns="0" bIns="0" numCol="1" spcCol="0" rtlCol="0" fromWordArt="0" anchor="t" anchorCtr="0" forceAA="0" compatLnSpc="1">
+                      <a:prstTxWarp prst="textNoShape">
+                        <a:avLst/>
+                      </a:prstTxWarp>
+                      <a:spAutoFit/>
+                    </wps:bodyPr>
+                  </wps:wsp>
+                </a:graphicData>
+              </a:graphic>
+            </wp:anchor>
+          </w:drawing>
+        </mc:Choice>
+        <mc:Fallback>
+          <w:pict>
+            <v:shapetype w14:anchorId="502D05D3" id="_x0000_t202" coordsize="21600,21600" o:spt="202" path="m,l,21600r21600,l21600,xe">
+              <v:stroke joinstyle="miter"/>
+              <v:path gradientshapeok="t" o:connecttype="rect"/>
+            </v:shapetype>
+            <v:shape id="Text Box 5" o:spid="_x0000_s1028" type="#_x0000_t202" alt="Lockheed Martin Proprietary Information" style="position:absolute;left:0;text-align:left;margin-left:0;margin-top:.05pt;width:34.95pt;height:34.95pt;z-index:251662336;visibility:visible;mso-wrap-style:none;mso-wrap-distance-left:0;mso-wrap-distance-top:0;mso-wrap-distance-right:0;mso-wrap-distance-bottom:0;mso-position-horizontal:center;mso-position-horizontal-relative:text;mso-position-vertical:absolute;mso-position-vertical-relative:text;v-text-anchor:top" o:gfxdata="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" filled="f" stroked="f">
+              <v:fill o:detectmouseclick="t"/>
+              <v:textbox style="mso-fit-shape-to-text:t" inset="0,0,0,0">
+                <w:txbxContent>
+                  <w:p>
+                    <w:pPr>
+                      <w:rPr>
+                        <w:rFonts w:ascii="Calibri" w:eastAsia="Calibri" w:hAnsi="Calibri" w:cs="Calibri"/>
+                        <w:noProof/>
+                        <w:color w:val="000000"/>
+                        <w:sz w:val="20"/>
+                        <w:szCs w:val="20"/>
+                      </w:rPr>
+                    </w:pPr>
+                    <w:r>
+                      <w:rPr>
+                        <w:rFonts w:ascii="Calibri" w:eastAsia="Calibri" w:hAnsi="Calibri" w:cs="Calibri"/>
+                        <w:noProof/>
+                        <w:color w:val="000000"/>
+                        <w:sz w:val="20"/>
+                        <w:szCs w:val="20"/>
+                      </w:rPr>
+                      <w:t>Lockheed Martin Proprietary Information</w:t>
+                    </w:r>
+                  </w:p>
+                </w:txbxContent>
+              </v:textbox>
+              <w10:wrap type="square"/>
+            </v:shape>
+          </w:pict>
+        </mc:Fallback>
+      </mc:AlternateContent>
+    </w:r>
     <w:r>
       <w:t>Lockheed Martin Proprietary Information</w:t>
     </w:r>
@@ -7909,12 +8791,131 @@
 </file>
 
 <file path=word/footer2.xml><?xml version="1.0" encoding="utf-8"?>
-<w:ftr xmlns:wpc="http://schemas.microsoft.com/office/word/2010/wordprocessingCanvas" xmlns:cx="http://schemas.microsoft.com/office/drawing/2014/chartex" xmlns:cx1="http://schemas.microsoft.com/office/drawing/2015/9/8/chartex" xmlns:cx2="http://schemas.microsoft.com/office/drawing/2015/10/21/chartex" xmlns:cx3="http://schemas.microsoft.com/office/drawing/2016/5/9/chartex" xmlns:cx4="http://schemas.microsoft.com/office/drawing/2016/5/10/chartex" xmlns:cx5="http://schemas.microsoft.com/office/drawing/2016/5/11/chartex" xmlns:cx6="http://schemas.microsoft.com/office/drawing/2016/5/12/chartex" xmlns:cx7="http://schemas.microsoft.com/office/drawing/2016/5/13/chartex" xmlns:cx8="http://schemas.microsoft.com/office/drawing/2016/5/14/chartex" xmlns:mc="http://schemas.openxmlformats.org/markup-compatibility/2006" xmlns:aink="http://schemas.microsoft.com/office/drawing/2016/ink" xmlns:am3d="http://schemas.microsoft.com/office/drawing/2017/model3d" xmlns:o="urn:schemas-microsoft-com:office:office" xmlns:r="http://schemas.openxmlformats.org/officeDocument/2006/relationships" xmlns:m="http://schemas.openxmlformats.org/officeDocument/2006/math" xmlns:v="urn:schemas-microsoft-com:vml" xmlns:wp14="http://schemas.microsoft.com/office/word/2010/wordprocessingDrawing" xmlns:wp="http://schemas.openxmlformats.org/drawingml/2006/wordprocessingDrawing" xmlns:w10="urn:schemas-microsoft-com:office:word" xmlns:w="http://schemas.openxmlformats.org/wordprocessingml/2006/main" xmlns:w14="http://schemas.microsoft.com/office/word/2010/wordml" xmlns:w15="http://schemas.microsoft.com/office/word/2012/wordml" xmlns:w16cex="http://schemas.microsoft.com/office/word/2018/wordml/cex" xmlns:w16cid="http://schemas.microsoft.com/office/word/2016/wordml/cid" xmlns:w16="http://schemas.microsoft.com/office/word/2018/wordml" xmlns:w16sdtdh="http://schemas.microsoft.com/office/word/2020/wordml/sdtdatahash" xmlns:w16se="http://schemas.microsoft.com/office/word/2015/wordml/symex" xmlns:wpg="http://schemas.microsoft.com/office/word/2010/wordprocessingGroup" xmlns:wpi="http://schemas.microsoft.com/office/word/2010/wordprocessingInk" xmlns:wne="http://schemas.microsoft.com/office/word/2006/wordml" xmlns:wps="http://schemas.microsoft.com/office/word/2010/wordprocessingShape" mc:Ignorable="w14 w15 w16se w16cid w16 w16cex w16sdtdh wp14">
+<w:ftr xmlns:wpc="http://schemas.microsoft.com/office/word/2010/wordprocessingCanvas" xmlns:cx="http://schemas.microsoft.com/office/drawing/2014/chartex" xmlns:cx1="http://schemas.microsoft.com/office/drawing/2015/9/8/chartex" xmlns:cx2="http://schemas.microsoft.com/office/drawing/2015/10/21/chartex" xmlns:cx3="http://schemas.microsoft.com/office/drawing/2016/5/9/chartex" xmlns:cx4="http://schemas.microsoft.com/office/drawing/2016/5/10/chartex" xmlns:cx5="http://schemas.microsoft.com/office/drawing/2016/5/11/chartex" xmlns:cx6="http://schemas.microsoft.com/office/drawing/2016/5/12/chartex" xmlns:cx7="http://schemas.microsoft.com/office/drawing/2016/5/13/chartex" xmlns:cx8="http://schemas.microsoft.com/office/drawing/2016/5/14/chartex" xmlns:mc="http://schemas.openxmlformats.org/markup-compatibility/2006" xmlns:aink="http://schemas.microsoft.com/office/drawing/2016/ink" xmlns:am3d="http://schemas.microsoft.com/office/drawing/2017/model3d" xmlns:o="urn:schemas-microsoft-com:office:office" xmlns:oel="http://schemas.microsoft.com/office/2019/extlst" xmlns:r="http://schemas.openxmlformats.org/officeDocument/2006/relationships" xmlns:m="http://schemas.openxmlformats.org/officeDocument/2006/math" xmlns:v="urn:schemas-microsoft-com:vml" xmlns:wp14="http://schemas.microsoft.com/office/word/2010/wordprocessingDrawing" xmlns:wp="http://schemas.openxmlformats.org/drawingml/2006/wordprocessingDrawing" xmlns:w10="urn:schemas-microsoft-com:office:word" xmlns:w="http://schemas.openxmlformats.org/wordprocessingml/2006/main" xmlns:w14="http://schemas.microsoft.com/office/word/2010/wordml" xmlns:w15="http://schemas.microsoft.com/office/word/2012/wordml" xmlns:w16cex="http://schemas.microsoft.com/office/word/2018/wordml/cex" xmlns:w16cid="http://schemas.microsoft.com/office/word/2016/wordml/cid" xmlns:w16="http://schemas.microsoft.com/office/word/2018/wordml" xmlns:w16sdtdh="http://schemas.microsoft.com/office/word/2020/wordml/sdtdatahash" xmlns:w16se="http://schemas.microsoft.com/office/word/2015/wordml/symex" xmlns:wpg="http://schemas.microsoft.com/office/word/2010/wordprocessingGroup" xmlns:wpi="http://schemas.microsoft.com/office/word/2010/wordprocessingInk" xmlns:wne="http://schemas.microsoft.com/office/word/2006/wordml" xmlns:wps="http://schemas.microsoft.com/office/word/2010/wordprocessingShape" mc:Ignorable="w14 w15 w16se w16cid w16 w16cex w16sdtdh wp14">
   <w:p>
     <w:pPr>
       <w:pStyle w:val="Footer"/>
       <w:jc w:val="center"/>
     </w:pPr>
+    <w:r>
+      <w:rPr>
+        <w:noProof/>
+      </w:rPr>
+      <mc:AlternateContent>
+        <mc:Choice Requires="wps">
+          <w:drawing>
+            <wp:anchor distT="0" distB="0" distL="0" distR="0" simplePos="0" relativeHeight="251663360" behindDoc="0" locked="0" layoutInCell="1" allowOverlap="1" wp14:anchorId="06EAA9A5" wp14:editId="6C6631D6">
+              <wp:simplePos x="914400" y="9258300"/>
+              <wp:positionH relativeFrom="column">
+                <wp:align>center</wp:align>
+              </wp:positionH>
+              <wp:positionV relativeFrom="paragraph">
+                <wp:posOffset>635</wp:posOffset>
+              </wp:positionV>
+              <wp:extent cx="443865" cy="443865"/>
+              <wp:effectExtent l="0" t="0" r="1905" b="18415"/>
+              <wp:wrapSquare wrapText="bothSides"/>
+              <wp:docPr id="6" name="Text Box 6" descr="Lockheed Martin Proprietary Information">
+                <a:extLst xmlns:a="http://schemas.openxmlformats.org/drawingml/2006/main">
+                  <a:ext uri="{5AE41FA2-C0FF-4470-9BD4-5FADCA87CBE2}">
+                    <aclsh:classification xmlns:aclsh="http://schemas.microsoft.com/office/drawing/2020/classificationShape" classificationOutcomeType="ftr"/>
+                  </a:ext>
+                </a:extLst>
+              </wp:docPr>
+              <wp:cNvGraphicFramePr/>
+              <a:graphic xmlns:a="http://schemas.openxmlformats.org/drawingml/2006/main">
+                <a:graphicData uri="http://schemas.microsoft.com/office/word/2010/wordprocessingShape">
+                  <wps:wsp>
+                    <wps:cNvSpPr txBox="1"/>
+                    <wps:spPr>
+                      <a:xfrm>
+                        <a:off x="0" y="0"/>
+                        <a:ext cx="443865" cy="443865"/>
+                      </a:xfrm>
+                      <a:prstGeom prst="rect">
+                        <a:avLst/>
+                      </a:prstGeom>
+                      <a:noFill/>
+                      <a:ln>
+                        <a:noFill/>
+                      </a:ln>
+                    </wps:spPr>
+                    <wps:txbx>
+                      <w:txbxContent>
+                        <w:p>
+                          <w:pPr>
+                            <w:rPr>
+                              <w:rFonts w:ascii="Calibri" w:eastAsia="Calibri" w:hAnsi="Calibri" w:cs="Calibri"/>
+                              <w:noProof/>
+                              <w:color w:val="000000"/>
+                              <w:sz w:val="20"/>
+                              <w:szCs w:val="20"/>
+                            </w:rPr>
+                          </w:pPr>
+                          <w:r>
+                            <w:rPr>
+                              <w:rFonts w:ascii="Calibri" w:eastAsia="Calibri" w:hAnsi="Calibri" w:cs="Calibri"/>
+                              <w:noProof/>
+                              <w:color w:val="000000"/>
+                              <w:sz w:val="20"/>
+                              <w:szCs w:val="20"/>
+                            </w:rPr>
+                            <w:t>Lockheed Martin Proprietary Information</w:t>
+                          </w:r>
+                        </w:p>
+                      </w:txbxContent>
+                    </wps:txbx>
+                    <wps:bodyPr rot="0" spcFirstLastPara="0" vertOverflow="overflow" horzOverflow="overflow" vert="horz" wrap="none" lIns="0" tIns="0" rIns="0" bIns="0" numCol="1" spcCol="0" rtlCol="0" fromWordArt="0" anchor="t" anchorCtr="0" forceAA="0" compatLnSpc="1">
+                      <a:prstTxWarp prst="textNoShape">
+                        <a:avLst/>
+                      </a:prstTxWarp>
+                      <a:spAutoFit/>
+                    </wps:bodyPr>
+                  </wps:wsp>
+                </a:graphicData>
+              </a:graphic>
+            </wp:anchor>
+          </w:drawing>
+        </mc:Choice>
+        <mc:Fallback>
+          <w:pict>
+            <v:shapetype w14:anchorId="06EAA9A5" id="_x0000_t202" coordsize="21600,21600" o:spt="202" path="m,l,21600r21600,l21600,xe">
+              <v:stroke joinstyle="miter"/>
+              <v:path gradientshapeok="t" o:connecttype="rect"/>
+            </v:shapetype>
+            <v:shape id="Text Box 6" o:spid="_x0000_s1029" type="#_x0000_t202" alt="Lockheed Martin Proprietary Information" style="position:absolute;left:0;text-align:left;margin-left:0;margin-top:.05pt;width:34.95pt;height:34.95pt;z-index:251663360;visibility:visible;mso-wrap-style:none;mso-wrap-distance-left:0;mso-wrap-distance-top:0;mso-wrap-distance-right:0;mso-wrap-distance-bottom:0;mso-position-horizontal:center;mso-position-horizontal-relative:text;mso-position-vertical:absolute;mso-position-vertical-relative:text;v-text-anchor:top" o:gfxdata="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" filled="f" stroked="f">
+              <v:fill o:detectmouseclick="t"/>
+              <v:textbox style="mso-fit-shape-to-text:t" inset="0,0,0,0">
+                <w:txbxContent>
+                  <w:p>
+                    <w:pPr>
+                      <w:rPr>
+                        <w:rFonts w:ascii="Calibri" w:eastAsia="Calibri" w:hAnsi="Calibri" w:cs="Calibri"/>
+                        <w:noProof/>
+                        <w:color w:val="000000"/>
+                        <w:sz w:val="20"/>
+                        <w:szCs w:val="20"/>
+                      </w:rPr>
+                    </w:pPr>
+                    <w:r>
+                      <w:rPr>
+                        <w:rFonts w:ascii="Calibri" w:eastAsia="Calibri" w:hAnsi="Calibri" w:cs="Calibri"/>
+                        <w:noProof/>
+                        <w:color w:val="000000"/>
+                        <w:sz w:val="20"/>
+                        <w:szCs w:val="20"/>
+                      </w:rPr>
+                      <w:t>Lockheed Martin Proprietary Information</w:t>
+                    </w:r>
+                  </w:p>
+                </w:txbxContent>
+              </v:textbox>
+              <w10:wrap type="square"/>
+            </v:shape>
+          </w:pict>
+        </mc:Fallback>
+      </mc:AlternateContent>
+    </w:r>
     <w:r>
       <w:t>Lockheed Martin Proprietary Information</w:t>
     </w:r>
@@ -7928,12 +8929,131 @@
 </file>
 
 <file path=word/footer3.xml><?xml version="1.0" encoding="utf-8"?>
-<w:ftr xmlns:wpc="http://schemas.microsoft.com/office/word/2010/wordprocessingCanvas" xmlns:cx="http://schemas.microsoft.com/office/drawing/2014/chartex" xmlns:cx1="http://schemas.microsoft.com/office/drawing/2015/9/8/chartex" xmlns:cx2="http://schemas.microsoft.com/office/drawing/2015/10/21/chartex" xmlns:cx3="http://schemas.microsoft.com/office/drawing/2016/5/9/chartex" xmlns:cx4="http://schemas.microsoft.com/office/drawing/2016/5/10/chartex" xmlns:cx5="http://schemas.microsoft.com/office/drawing/2016/5/11/chartex" xmlns:cx6="http://schemas.microsoft.com/office/drawing/2016/5/12/chartex" xmlns:cx7="http://schemas.microsoft.com/office/drawing/2016/5/13/chartex" xmlns:cx8="http://schemas.microsoft.com/office/drawing/2016/5/14/chartex" xmlns:mc="http://schemas.openxmlformats.org/markup-compatibility/2006" xmlns:aink="http://schemas.microsoft.com/office/drawing/2016/ink" xmlns:am3d="http://schemas.microsoft.com/office/drawing/2017/model3d" xmlns:o="urn:schemas-microsoft-com:office:office" xmlns:r="http://schemas.openxmlformats.org/officeDocument/2006/relationships" xmlns:m="http://schemas.openxmlformats.org/officeDocument/2006/math" xmlns:v="urn:schemas-microsoft-com:vml" xmlns:wp14="http://schemas.microsoft.com/office/word/2010/wordprocessingDrawing" xmlns:wp="http://schemas.openxmlformats.org/drawingml/2006/wordprocessingDrawing" xmlns:w10="urn:schemas-microsoft-com:office:word" xmlns:w="http://schemas.openxmlformats.org/wordprocessingml/2006/main" xmlns:w14="http://schemas.microsoft.com/office/word/2010/wordml" xmlns:w15="http://schemas.microsoft.com/office/word/2012/wordml" xmlns:w16cex="http://schemas.microsoft.com/office/word/2018/wordml/cex" xmlns:w16cid="http://schemas.microsoft.com/office/word/2016/wordml/cid" xmlns:w16="http://schemas.microsoft.com/office/word/2018/wordml" xmlns:w16sdtdh="http://schemas.microsoft.com/office/word/2020/wordml/sdtdatahash" xmlns:w16se="http://schemas.microsoft.com/office/word/2015/wordml/symex" xmlns:wpg="http://schemas.microsoft.com/office/word/2010/wordprocessingGroup" xmlns:wpi="http://schemas.microsoft.com/office/word/2010/wordprocessingInk" xmlns:wne="http://schemas.microsoft.com/office/word/2006/wordml" xmlns:wps="http://schemas.microsoft.com/office/word/2010/wordprocessingShape" mc:Ignorable="w14 w15 w16se w16cid w16 w16cex w16sdtdh wp14">
+<w:ftr xmlns:wpc="http://schemas.microsoft.com/office/word/2010/wordprocessingCanvas" xmlns:cx="http://schemas.microsoft.com/office/drawing/2014/chartex" xmlns:cx1="http://schemas.microsoft.com/office/drawing/2015/9/8/chartex" xmlns:cx2="http://schemas.microsoft.com/office/drawing/2015/10/21/chartex" xmlns:cx3="http://schemas.microsoft.com/office/drawing/2016/5/9/chartex" xmlns:cx4="http://schemas.microsoft.com/office/drawing/2016/5/10/chartex" xmlns:cx5="http://schemas.microsoft.com/office/drawing/2016/5/11/chartex" xmlns:cx6="http://schemas.microsoft.com/office/drawing/2016/5/12/chartex" xmlns:cx7="http://schemas.microsoft.com/office/drawing/2016/5/13/chartex" xmlns:cx8="http://schemas.microsoft.com/office/drawing/2016/5/14/chartex" xmlns:mc="http://schemas.openxmlformats.org/markup-compatibility/2006" xmlns:aink="http://schemas.microsoft.com/office/drawing/2016/ink" xmlns:am3d="http://schemas.microsoft.com/office/drawing/2017/model3d" xmlns:o="urn:schemas-microsoft-com:office:office" xmlns:oel="http://schemas.microsoft.com/office/2019/extlst" xmlns:r="http://schemas.openxmlformats.org/officeDocument/2006/relationships" xmlns:m="http://schemas.openxmlformats.org/officeDocument/2006/math" xmlns:v="urn:schemas-microsoft-com:vml" xmlns:wp14="http://schemas.microsoft.com/office/word/2010/wordprocessingDrawing" xmlns:wp="http://schemas.openxmlformats.org/drawingml/2006/wordprocessingDrawing" xmlns:w10="urn:schemas-microsoft-com:office:word" xmlns:w="http://schemas.openxmlformats.org/wordprocessingml/2006/main" xmlns:w14="http://schemas.microsoft.com/office/word/2010/wordml" xmlns:w15="http://schemas.microsoft.com/office/word/2012/wordml" xmlns:w16cex="http://schemas.microsoft.com/office/word/2018/wordml/cex" xmlns:w16cid="http://schemas.microsoft.com/office/word/2016/wordml/cid" xmlns:w16="http://schemas.microsoft.com/office/word/2018/wordml" xmlns:w16sdtdh="http://schemas.microsoft.com/office/word/2020/wordml/sdtdatahash" xmlns:w16se="http://schemas.microsoft.com/office/word/2015/wordml/symex" xmlns:wpg="http://schemas.microsoft.com/office/word/2010/wordprocessingGroup" xmlns:wpi="http://schemas.microsoft.com/office/word/2010/wordprocessingInk" xmlns:wne="http://schemas.microsoft.com/office/word/2006/wordml" xmlns:wps="http://schemas.microsoft.com/office/word/2010/wordprocessingShape" mc:Ignorable="w14 w15 w16se w16cid w16 w16cex w16sdtdh wp14">
   <w:p>
     <w:pPr>
       <w:pStyle w:val="Footer"/>
       <w:jc w:val="center"/>
     </w:pPr>
+    <w:r>
+      <w:rPr>
+        <w:noProof/>
+      </w:rPr>
+      <mc:AlternateContent>
+        <mc:Choice Requires="wps">
+          <w:drawing>
+            <wp:anchor distT="0" distB="0" distL="0" distR="0" simplePos="0" relativeHeight="251661312" behindDoc="0" locked="0" layoutInCell="1" allowOverlap="1" wp14:anchorId="4BDD09FE" wp14:editId="292868B1">
+              <wp:simplePos x="635" y="635"/>
+              <wp:positionH relativeFrom="column">
+                <wp:align>center</wp:align>
+              </wp:positionH>
+              <wp:positionV relativeFrom="paragraph">
+                <wp:posOffset>635</wp:posOffset>
+              </wp:positionV>
+              <wp:extent cx="443865" cy="443865"/>
+              <wp:effectExtent l="0" t="0" r="1905" b="18415"/>
+              <wp:wrapSquare wrapText="bothSides"/>
+              <wp:docPr id="4" name="Text Box 4" descr="Lockheed Martin Proprietary Information">
+                <a:extLst xmlns:a="http://schemas.openxmlformats.org/drawingml/2006/main">
+                  <a:ext uri="{5AE41FA2-C0FF-4470-9BD4-5FADCA87CBE2}">
+                    <aclsh:classification xmlns:aclsh="http://schemas.microsoft.com/office/drawing/2020/classificationShape" classificationOutcomeType="ftr"/>
+                  </a:ext>
+                </a:extLst>
+              </wp:docPr>
+              <wp:cNvGraphicFramePr/>
+              <a:graphic xmlns:a="http://schemas.openxmlformats.org/drawingml/2006/main">
+                <a:graphicData uri="http://schemas.microsoft.com/office/word/2010/wordprocessingShape">
+                  <wps:wsp>
+                    <wps:cNvSpPr txBox="1"/>
+                    <wps:spPr>
+                      <a:xfrm>
+                        <a:off x="0" y="0"/>
+                        <a:ext cx="443865" cy="443865"/>
+                      </a:xfrm>
+                      <a:prstGeom prst="rect">
+                        <a:avLst/>
+                      </a:prstGeom>
+                      <a:noFill/>
+                      <a:ln>
+                        <a:noFill/>
+                      </a:ln>
+                    </wps:spPr>
+                    <wps:txbx>
+                      <w:txbxContent>
+                        <w:p>
+                          <w:pPr>
+                            <w:rPr>
+                              <w:rFonts w:ascii="Calibri" w:eastAsia="Calibri" w:hAnsi="Calibri" w:cs="Calibri"/>
+                              <w:noProof/>
+                              <w:color w:val="000000"/>
+                              <w:sz w:val="20"/>
+                              <w:szCs w:val="20"/>
+                            </w:rPr>
+                          </w:pPr>
+                          <w:r>
+                            <w:rPr>
+                              <w:rFonts w:ascii="Calibri" w:eastAsia="Calibri" w:hAnsi="Calibri" w:cs="Calibri"/>
+                              <w:noProof/>
+                              <w:color w:val="000000"/>
+                              <w:sz w:val="20"/>
+                              <w:szCs w:val="20"/>
+                            </w:rPr>
+                            <w:t>Lockheed Martin Proprietary Information</w:t>
+                          </w:r>
+                        </w:p>
+                      </w:txbxContent>
+                    </wps:txbx>
+                    <wps:bodyPr rot="0" spcFirstLastPara="0" vertOverflow="overflow" horzOverflow="overflow" vert="horz" wrap="none" lIns="0" tIns="0" rIns="0" bIns="0" numCol="1" spcCol="0" rtlCol="0" fromWordArt="0" anchor="t" anchorCtr="0" forceAA="0" compatLnSpc="1">
+                      <a:prstTxWarp prst="textNoShape">
+                        <a:avLst/>
+                      </a:prstTxWarp>
+                      <a:spAutoFit/>
+                    </wps:bodyPr>
+                  </wps:wsp>
+                </a:graphicData>
+              </a:graphic>
+            </wp:anchor>
+          </w:drawing>
+        </mc:Choice>
+        <mc:Fallback>
+          <w:pict>
+            <v:shapetype w14:anchorId="4BDD09FE" id="_x0000_t202" coordsize="21600,21600" o:spt="202" path="m,l,21600r21600,l21600,xe">
+              <v:stroke joinstyle="miter"/>
+              <v:path gradientshapeok="t" o:connecttype="rect"/>
+            </v:shapetype>
+            <v:shape id="Text Box 4" o:spid="_x0000_s1031" type="#_x0000_t202" alt="Lockheed Martin Proprietary Information" style="position:absolute;left:0;text-align:left;margin-left:0;margin-top:.05pt;width:34.95pt;height:34.95pt;z-index:251661312;visibility:visible;mso-wrap-style:none;mso-wrap-distance-left:0;mso-wrap-distance-top:0;mso-wrap-distance-right:0;mso-wrap-distance-bottom:0;mso-position-horizontal:center;mso-position-horizontal-relative:text;mso-position-vertical:absolute;mso-position-vertical-relative:text;v-text-anchor:top" o:gfxdata="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" filled="f" stroked="f">
+              <v:fill o:detectmouseclick="t"/>
+              <v:textbox style="mso-fit-shape-to-text:t" inset="0,0,0,0">
+                <w:txbxContent>
+                  <w:p>
+                    <w:pPr>
+                      <w:rPr>
+                        <w:rFonts w:ascii="Calibri" w:eastAsia="Calibri" w:hAnsi="Calibri" w:cs="Calibri"/>
+                        <w:noProof/>
+                        <w:color w:val="000000"/>
+                        <w:sz w:val="20"/>
+                        <w:szCs w:val="20"/>
+                      </w:rPr>
+                    </w:pPr>
+                    <w:r>
+                      <w:rPr>
+                        <w:rFonts w:ascii="Calibri" w:eastAsia="Calibri" w:hAnsi="Calibri" w:cs="Calibri"/>
+                        <w:noProof/>
+                        <w:color w:val="000000"/>
+                        <w:sz w:val="20"/>
+                        <w:szCs w:val="20"/>
+                      </w:rPr>
+                      <w:t>Lockheed Martin Proprietary Information</w:t>
+                    </w:r>
+                  </w:p>
+                </w:txbxContent>
+              </v:textbox>
+              <w10:wrap type="square"/>
+            </v:shape>
+          </w:pict>
+        </mc:Fallback>
+      </mc:AlternateContent>
+    </w:r>
     <w:r>
       <w:t>Lockheed Martin Proprietary Information</w:t>
     </w:r>
@@ -7947,7 +9067,7 @@
 </file>
 
 <file path=word/footnotes.xml><?xml version="1.0" encoding="utf-8"?>
-<w:footnotes xmlns:wpc="http://schemas.microsoft.com/office/word/2010/wordprocessingCanvas" xmlns:cx="http://schemas.microsoft.com/office/drawing/2014/chartex" xmlns:cx1="http://schemas.microsoft.com/office/drawing/2015/9/8/chartex" xmlns:cx2="http://schemas.microsoft.com/office/drawing/2015/10/21/chartex" xmlns:cx3="http://schemas.microsoft.com/office/drawing/2016/5/9/chartex" xmlns:cx4="http://schemas.microsoft.com/office/drawing/2016/5/10/chartex" xmlns:cx5="http://schemas.microsoft.com/office/drawing/2016/5/11/chartex" xmlns:cx6="http://schemas.microsoft.com/office/drawing/2016/5/12/chartex" xmlns:cx7="http://schemas.microsoft.com/office/drawing/2016/5/13/chartex" xmlns:cx8="http://schemas.microsoft.com/office/drawing/2016/5/14/chartex" xmlns:mc="http://schemas.openxmlformats.org/markup-compatibility/2006" xmlns:aink="http://schemas.microsoft.com/office/drawing/2016/ink" xmlns:am3d="http://schemas.microsoft.com/office/drawing/2017/model3d" xmlns:o="urn:schemas-microsoft-com:office:office" xmlns:r="http://schemas.openxmlformats.org/officeDocument/2006/relationships" xmlns:m="http://schemas.openxmlformats.org/officeDocument/2006/math" xmlns:v="urn:schemas-microsoft-com:vml" xmlns:wp14="http://schemas.microsoft.com/office/word/2010/wordprocessingDrawing" xmlns:wp="http://schemas.openxmlformats.org/drawingml/2006/wordprocessingDrawing" xmlns:w10="urn:schemas-microsoft-com:office:word" xmlns:w="http://schemas.openxmlformats.org/wordprocessingml/2006/main" xmlns:w14="http://schemas.microsoft.com/office/word/2010/wordml" xmlns:w15="http://schemas.microsoft.com/office/word/2012/wordml" xmlns:w16cex="http://schemas.microsoft.com/office/word/2018/wordml/cex" xmlns:w16cid="http://schemas.microsoft.com/office/word/2016/wordml/cid" xmlns:w16="http://schemas.microsoft.com/office/word/2018/wordml" xmlns:w16sdtdh="http://schemas.microsoft.com/office/word/2020/wordml/sdtdatahash" xmlns:w16se="http://schemas.microsoft.com/office/word/2015/wordml/symex" xmlns:wpg="http://schemas.microsoft.com/office/word/2010/wordprocessingGroup" xmlns:wpi="http://schemas.microsoft.com/office/word/2010/wordprocessingInk" xmlns:wne="http://schemas.microsoft.com/office/word/2006/wordml" xmlns:wps="http://schemas.microsoft.com/office/word/2010/wordprocessingShape" mc:Ignorable="w14 w15 w16se w16cid w16 w16cex w16sdtdh wp14">
+<w:footnotes xmlns:wpc="http://schemas.microsoft.com/office/word/2010/wordprocessingCanvas" xmlns:cx="http://schemas.microsoft.com/office/drawing/2014/chartex" xmlns:cx1="http://schemas.microsoft.com/office/drawing/2015/9/8/chartex" xmlns:cx2="http://schemas.microsoft.com/office/drawing/2015/10/21/chartex" xmlns:cx3="http://schemas.microsoft.com/office/drawing/2016/5/9/chartex" xmlns:cx4="http://schemas.microsoft.com/office/drawing/2016/5/10/chartex" xmlns:cx5="http://schemas.microsoft.com/office/drawing/2016/5/11/chartex" xmlns:cx6="http://schemas.microsoft.com/office/drawing/2016/5/12/chartex" xmlns:cx7="http://schemas.microsoft.com/office/drawing/2016/5/13/chartex" xmlns:cx8="http://schemas.microsoft.com/office/drawing/2016/5/14/chartex" xmlns:mc="http://schemas.openxmlformats.org/markup-compatibility/2006" xmlns:aink="http://schemas.microsoft.com/office/drawing/2016/ink" xmlns:am3d="http://schemas.microsoft.com/office/drawing/2017/model3d" xmlns:o="urn:schemas-microsoft-com:office:office" xmlns:oel="http://schemas.microsoft.com/office/2019/extlst" xmlns:r="http://schemas.openxmlformats.org/officeDocument/2006/relationships" xmlns:m="http://schemas.openxmlformats.org/officeDocument/2006/math" xmlns:v="urn:schemas-microsoft-com:vml" xmlns:wp14="http://schemas.microsoft.com/office/word/2010/wordprocessingDrawing" xmlns:wp="http://schemas.openxmlformats.org/drawingml/2006/wordprocessingDrawing" xmlns:w10="urn:schemas-microsoft-com:office:word" xmlns:w="http://schemas.openxmlformats.org/wordprocessingml/2006/main" xmlns:w14="http://schemas.microsoft.com/office/word/2010/wordml" xmlns:w15="http://schemas.microsoft.com/office/word/2012/wordml" xmlns:w16cex="http://schemas.microsoft.com/office/word/2018/wordml/cex" xmlns:w16cid="http://schemas.microsoft.com/office/word/2016/wordml/cid" xmlns:w16="http://schemas.microsoft.com/office/word/2018/wordml" xmlns:w16sdtdh="http://schemas.microsoft.com/office/word/2020/wordml/sdtdatahash" xmlns:w16se="http://schemas.microsoft.com/office/word/2015/wordml/symex" xmlns:wpg="http://schemas.microsoft.com/office/word/2010/wordprocessingGroup" xmlns:wpi="http://schemas.microsoft.com/office/word/2010/wordprocessingInk" xmlns:wne="http://schemas.microsoft.com/office/word/2006/wordml" xmlns:wps="http://schemas.microsoft.com/office/word/2010/wordprocessingShape" mc:Ignorable="w14 w15 w16se w16cid w16 w16cex w16sdtdh wp14">
   <w:footnote w:type="separator" w:id="-1">
     <w:p>
       <w:pPr>
@@ -8164,12 +9284,131 @@
 </file>
 
 <file path=word/header1.xml><?xml version="1.0" encoding="utf-8"?>
-<w:hdr xmlns:wpc="http://schemas.microsoft.com/office/word/2010/wordprocessingCanvas" xmlns:cx="http://schemas.microsoft.com/office/drawing/2014/chartex" xmlns:cx1="http://schemas.microsoft.com/office/drawing/2015/9/8/chartex" xmlns:cx2="http://schemas.microsoft.com/office/drawing/2015/10/21/chartex" xmlns:cx3="http://schemas.microsoft.com/office/drawing/2016/5/9/chartex" xmlns:cx4="http://schemas.microsoft.com/office/drawing/2016/5/10/chartex" xmlns:cx5="http://schemas.microsoft.com/office/drawing/2016/5/11/chartex" xmlns:cx6="http://schemas.microsoft.com/office/drawing/2016/5/12/chartex" xmlns:cx7="http://schemas.microsoft.com/office/drawing/2016/5/13/chartex" xmlns:cx8="http://schemas.microsoft.com/office/drawing/2016/5/14/chartex" xmlns:mc="http://schemas.openxmlformats.org/markup-compatibility/2006" xmlns:aink="http://schemas.microsoft.com/office/drawing/2016/ink" xmlns:am3d="http://schemas.microsoft.com/office/drawing/2017/model3d" xmlns:o="urn:schemas-microsoft-com:office:office" xmlns:r="http://schemas.openxmlformats.org/officeDocument/2006/relationships" xmlns:m="http://schemas.openxmlformats.org/officeDocument/2006/math" xmlns:v="urn:schemas-microsoft-com:vml" xmlns:wp14="http://schemas.microsoft.com/office/word/2010/wordprocessingDrawing" xmlns:wp="http://schemas.openxmlformats.org/drawingml/2006/wordprocessingDrawing" xmlns:w10="urn:schemas-microsoft-com:office:word" xmlns:w="http://schemas.openxmlformats.org/wordprocessingml/2006/main" xmlns:w14="http://schemas.microsoft.com/office/word/2010/wordml" xmlns:w15="http://schemas.microsoft.com/office/word/2012/wordml" xmlns:w16cex="http://schemas.microsoft.com/office/word/2018/wordml/cex" xmlns:w16cid="http://schemas.microsoft.com/office/word/2016/wordml/cid" xmlns:w16="http://schemas.microsoft.com/office/word/2018/wordml" xmlns:w16sdtdh="http://schemas.microsoft.com/office/word/2020/wordml/sdtdatahash" xmlns:w16se="http://schemas.microsoft.com/office/word/2015/wordml/symex" xmlns:wpg="http://schemas.microsoft.com/office/word/2010/wordprocessingGroup" xmlns:wpi="http://schemas.microsoft.com/office/word/2010/wordprocessingInk" xmlns:wne="http://schemas.microsoft.com/office/word/2006/wordml" xmlns:wps="http://schemas.microsoft.com/office/word/2010/wordprocessingShape" mc:Ignorable="w14 w15 w16se w16cid w16 w16cex w16sdtdh wp14">
+<w:hdr xmlns:wpc="http://schemas.microsoft.com/office/word/2010/wordprocessingCanvas" xmlns:cx="http://schemas.microsoft.com/office/drawing/2014/chartex" xmlns:cx1="http://schemas.microsoft.com/office/drawing/2015/9/8/chartex" xmlns:cx2="http://schemas.microsoft.com/office/drawing/2015/10/21/chartex" xmlns:cx3="http://schemas.microsoft.com/office/drawing/2016/5/9/chartex" xmlns:cx4="http://schemas.microsoft.com/office/drawing/2016/5/10/chartex" xmlns:cx5="http://schemas.microsoft.com/office/drawing/2016/5/11/chartex" xmlns:cx6="http://schemas.microsoft.com/office/drawing/2016/5/12/chartex" xmlns:cx7="http://schemas.microsoft.com/office/drawing/2016/5/13/chartex" xmlns:cx8="http://schemas.microsoft.com/office/drawing/2016/5/14/chartex" xmlns:mc="http://schemas.openxmlformats.org/markup-compatibility/2006" xmlns:aink="http://schemas.microsoft.com/office/drawing/2016/ink" xmlns:am3d="http://schemas.microsoft.com/office/drawing/2017/model3d" xmlns:o="urn:schemas-microsoft-com:office:office" xmlns:oel="http://schemas.microsoft.com/office/2019/extlst" xmlns:r="http://schemas.openxmlformats.org/officeDocument/2006/relationships" xmlns:m="http://schemas.openxmlformats.org/officeDocument/2006/math" xmlns:v="urn:schemas-microsoft-com:vml" xmlns:wp14="http://schemas.microsoft.com/office/word/2010/wordprocessingDrawing" xmlns:wp="http://schemas.openxmlformats.org/drawingml/2006/wordprocessingDrawing" xmlns:w10="urn:schemas-microsoft-com:office:word" xmlns:w="http://schemas.openxmlformats.org/wordprocessingml/2006/main" xmlns:w14="http://schemas.microsoft.com/office/word/2010/wordml" xmlns:w15="http://schemas.microsoft.com/office/word/2012/wordml" xmlns:w16cex="http://schemas.microsoft.com/office/word/2018/wordml/cex" xmlns:w16cid="http://schemas.microsoft.com/office/word/2016/wordml/cid" xmlns:w16="http://schemas.microsoft.com/office/word/2018/wordml" xmlns:w16sdtdh="http://schemas.microsoft.com/office/word/2020/wordml/sdtdatahash" xmlns:w16se="http://schemas.microsoft.com/office/word/2015/wordml/symex" xmlns:wpg="http://schemas.microsoft.com/office/word/2010/wordprocessingGroup" xmlns:wpi="http://schemas.microsoft.com/office/word/2010/wordprocessingInk" xmlns:wne="http://schemas.microsoft.com/office/word/2006/wordml" xmlns:wps="http://schemas.microsoft.com/office/word/2010/wordprocessingShape" mc:Ignorable="w14 w15 w16se w16cid w16 w16cex w16sdtdh wp14">
   <w:p>
     <w:pPr>
       <w:pStyle w:val="Header"/>
       <w:jc w:val="center"/>
     </w:pPr>
+    <w:r>
+      <w:rPr>
+        <w:noProof/>
+      </w:rPr>
+      <mc:AlternateContent>
+        <mc:Choice Requires="wps">
+          <w:drawing>
+            <wp:anchor distT="0" distB="0" distL="0" distR="0" simplePos="0" relativeHeight="251659264" behindDoc="0" locked="0" layoutInCell="1" allowOverlap="1" wp14:anchorId="742589CC" wp14:editId="1DC494EF">
+              <wp:simplePos x="635" y="635"/>
+              <wp:positionH relativeFrom="column">
+                <wp:align>center</wp:align>
+              </wp:positionH>
+              <wp:positionV relativeFrom="paragraph">
+                <wp:posOffset>635</wp:posOffset>
+              </wp:positionV>
+              <wp:extent cx="443865" cy="443865"/>
+              <wp:effectExtent l="0" t="0" r="1905" b="18415"/>
+              <wp:wrapSquare wrapText="bothSides"/>
+              <wp:docPr id="2" name="Text Box 2" descr="Lockheed Martin Proprietary Information">
+                <a:extLst xmlns:a="http://schemas.openxmlformats.org/drawingml/2006/main">
+                  <a:ext uri="{5AE41FA2-C0FF-4470-9BD4-5FADCA87CBE2}">
+                    <aclsh:classification xmlns:aclsh="http://schemas.microsoft.com/office/drawing/2020/classificationShape" classificationOutcomeType="hdr"/>
+                  </a:ext>
+                </a:extLst>
+              </wp:docPr>
+              <wp:cNvGraphicFramePr/>
+              <a:graphic xmlns:a="http://schemas.openxmlformats.org/drawingml/2006/main">
+                <a:graphicData uri="http://schemas.microsoft.com/office/word/2010/wordprocessingShape">
+                  <wps:wsp>
+                    <wps:cNvSpPr txBox="1"/>
+                    <wps:spPr>
+                      <a:xfrm>
+                        <a:off x="0" y="0"/>
+                        <a:ext cx="443865" cy="443865"/>
+                      </a:xfrm>
+                      <a:prstGeom prst="rect">
+                        <a:avLst/>
+                      </a:prstGeom>
+                      <a:noFill/>
+                      <a:ln>
+                        <a:noFill/>
+                      </a:ln>
+                    </wps:spPr>
+                    <wps:txbx>
+                      <w:txbxContent>
+                        <w:p>
+                          <w:pPr>
+                            <w:rPr>
+                              <w:rFonts w:ascii="Calibri" w:eastAsia="Calibri" w:hAnsi="Calibri" w:cs="Calibri"/>
+                              <w:noProof/>
+                              <w:color w:val="000000"/>
+                              <w:sz w:val="20"/>
+                              <w:szCs w:val="20"/>
+                            </w:rPr>
+                          </w:pPr>
+                          <w:r>
+                            <w:rPr>
+                              <w:rFonts w:ascii="Calibri" w:eastAsia="Calibri" w:hAnsi="Calibri" w:cs="Calibri"/>
+                              <w:noProof/>
+                              <w:color w:val="000000"/>
+                              <w:sz w:val="20"/>
+                              <w:szCs w:val="20"/>
+                            </w:rPr>
+                            <w:t>Lockheed Martin Proprietary Information</w:t>
+                          </w:r>
+                        </w:p>
+                      </w:txbxContent>
+                    </wps:txbx>
+                    <wps:bodyPr rot="0" spcFirstLastPara="0" vertOverflow="overflow" horzOverflow="overflow" vert="horz" wrap="none" lIns="0" tIns="0" rIns="0" bIns="0" numCol="1" spcCol="0" rtlCol="0" fromWordArt="0" anchor="t" anchorCtr="0" forceAA="0" compatLnSpc="1">
+                      <a:prstTxWarp prst="textNoShape">
+                        <a:avLst/>
+                      </a:prstTxWarp>
+                      <a:spAutoFit/>
+                    </wps:bodyPr>
+                  </wps:wsp>
+                </a:graphicData>
+              </a:graphic>
+            </wp:anchor>
+          </w:drawing>
+        </mc:Choice>
+        <mc:Fallback>
+          <w:pict>
+            <v:shapetype w14:anchorId="742589CC" id="_x0000_t202" coordsize="21600,21600" o:spt="202" path="m,l,21600r21600,l21600,xe">
+              <v:stroke joinstyle="miter"/>
+              <v:path gradientshapeok="t" o:connecttype="rect"/>
+            </v:shapetype>
+            <v:shape id="Text Box 2" o:spid="_x0000_s1026" type="#_x0000_t202" alt="Lockheed Martin Proprietary Information" style="position:absolute;left:0;text-align:left;margin-left:0;margin-top:.05pt;width:34.95pt;height:34.95pt;z-index:251659264;visibility:visible;mso-wrap-style:none;mso-wrap-distance-left:0;mso-wrap-distance-top:0;mso-wrap-distance-right:0;mso-wrap-distance-bottom:0;mso-position-horizontal:center;mso-position-horizontal-relative:text;mso-position-vertical:absolute;mso-position-vertical-relative:text;v-text-anchor:top" o:gfxdata="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" filled="f" stroked="f">
+              <v:fill o:detectmouseclick="t"/>
+              <v:textbox style="mso-fit-shape-to-text:t" inset="0,0,0,0">
+                <w:txbxContent>
+                  <w:p>
+                    <w:pPr>
+                      <w:rPr>
+                        <w:rFonts w:ascii="Calibri" w:eastAsia="Calibri" w:hAnsi="Calibri" w:cs="Calibri"/>
+                        <w:noProof/>
+                        <w:color w:val="000000"/>
+                        <w:sz w:val="20"/>
+                        <w:szCs w:val="20"/>
+                      </w:rPr>
+                    </w:pPr>
+                    <w:r>
+                      <w:rPr>
+                        <w:rFonts w:ascii="Calibri" w:eastAsia="Calibri" w:hAnsi="Calibri" w:cs="Calibri"/>
+                        <w:noProof/>
+                        <w:color w:val="000000"/>
+                        <w:sz w:val="20"/>
+                        <w:szCs w:val="20"/>
+                      </w:rPr>
+                      <w:t>Lockheed Martin Proprietary Information</w:t>
+                    </w:r>
+                  </w:p>
+                </w:txbxContent>
+              </v:textbox>
+              <w10:wrap type="square"/>
+            </v:shape>
+          </w:pict>
+        </mc:Fallback>
+      </mc:AlternateContent>
+    </w:r>
     <w:r>
       <w:t>Lockheed Martin Proprietary Information</w:t>
     </w:r>
@@ -8183,12 +9422,131 @@
 </file>
 
 <file path=word/header2.xml><?xml version="1.0" encoding="utf-8"?>
-<w:hdr xmlns:wpc="http://schemas.microsoft.com/office/word/2010/wordprocessingCanvas" xmlns:cx="http://schemas.microsoft.com/office/drawing/2014/chartex" xmlns:cx1="http://schemas.microsoft.com/office/drawing/2015/9/8/chartex" xmlns:cx2="http://schemas.microsoft.com/office/drawing/2015/10/21/chartex" xmlns:cx3="http://schemas.microsoft.com/office/drawing/2016/5/9/chartex" xmlns:cx4="http://schemas.microsoft.com/office/drawing/2016/5/10/chartex" xmlns:cx5="http://schemas.microsoft.com/office/drawing/2016/5/11/chartex" xmlns:cx6="http://schemas.microsoft.com/office/drawing/2016/5/12/chartex" xmlns:cx7="http://schemas.microsoft.com/office/drawing/2016/5/13/chartex" xmlns:cx8="http://schemas.microsoft.com/office/drawing/2016/5/14/chartex" xmlns:mc="http://schemas.openxmlformats.org/markup-compatibility/2006" xmlns:aink="http://schemas.microsoft.com/office/drawing/2016/ink" xmlns:am3d="http://schemas.microsoft.com/office/drawing/2017/model3d" xmlns:o="urn:schemas-microsoft-com:office:office" xmlns:r="http://schemas.openxmlformats.org/officeDocument/2006/relationships" xmlns:m="http://schemas.openxmlformats.org/officeDocument/2006/math" xmlns:v="urn:schemas-microsoft-com:vml" xmlns:wp14="http://schemas.microsoft.com/office/word/2010/wordprocessingDrawing" xmlns:wp="http://schemas.openxmlformats.org/drawingml/2006/wordprocessingDrawing" xmlns:w10="urn:schemas-microsoft-com:office:word" xmlns:w="http://schemas.openxmlformats.org/wordprocessingml/2006/main" xmlns:w14="http://schemas.microsoft.com/office/word/2010/wordml" xmlns:w15="http://schemas.microsoft.com/office/word/2012/wordml" xmlns:w16cex="http://schemas.microsoft.com/office/word/2018/wordml/cex" xmlns:w16cid="http://schemas.microsoft.com/office/word/2016/wordml/cid" xmlns:w16="http://schemas.microsoft.com/office/word/2018/wordml" xmlns:w16sdtdh="http://schemas.microsoft.com/office/word/2020/wordml/sdtdatahash" xmlns:w16se="http://schemas.microsoft.com/office/word/2015/wordml/symex" xmlns:wpg="http://schemas.microsoft.com/office/word/2010/wordprocessingGroup" xmlns:wpi="http://schemas.microsoft.com/office/word/2010/wordprocessingInk" xmlns:wne="http://schemas.microsoft.com/office/word/2006/wordml" xmlns:wps="http://schemas.microsoft.com/office/word/2010/wordprocessingShape" mc:Ignorable="w14 w15 w16se w16cid w16 w16cex w16sdtdh wp14">
+<w:hdr xmlns:wpc="http://schemas.microsoft.com/office/word/2010/wordprocessingCanvas" xmlns:cx="http://schemas.microsoft.com/office/drawing/2014/chartex" xmlns:cx1="http://schemas.microsoft.com/office/drawing/2015/9/8/chartex" xmlns:cx2="http://schemas.microsoft.com/office/drawing/2015/10/21/chartex" xmlns:cx3="http://schemas.microsoft.com/office/drawing/2016/5/9/chartex" xmlns:cx4="http://schemas.microsoft.com/office/drawing/2016/5/10/chartex" xmlns:cx5="http://schemas.microsoft.com/office/drawing/2016/5/11/chartex" xmlns:cx6="http://schemas.microsoft.com/office/drawing/2016/5/12/chartex" xmlns:cx7="http://schemas.microsoft.com/office/drawing/2016/5/13/chartex" xmlns:cx8="http://schemas.microsoft.com/office/drawing/2016/5/14/chartex" xmlns:mc="http://schemas.openxmlformats.org/markup-compatibility/2006" xmlns:aink="http://schemas.microsoft.com/office/drawing/2016/ink" xmlns:am3d="http://schemas.microsoft.com/office/drawing/2017/model3d" xmlns:o="urn:schemas-microsoft-com:office:office" xmlns:oel="http://schemas.microsoft.com/office/2019/extlst" xmlns:r="http://schemas.openxmlformats.org/officeDocument/2006/relationships" xmlns:m="http://schemas.openxmlformats.org/officeDocument/2006/math" xmlns:v="urn:schemas-microsoft-com:vml" xmlns:wp14="http://schemas.microsoft.com/office/word/2010/wordprocessingDrawing" xmlns:wp="http://schemas.openxmlformats.org/drawingml/2006/wordprocessingDrawing" xmlns:w10="urn:schemas-microsoft-com:office:word" xmlns:w="http://schemas.openxmlformats.org/wordprocessingml/2006/main" xmlns:w14="http://schemas.microsoft.com/office/word/2010/wordml" xmlns:w15="http://schemas.microsoft.com/office/word/2012/wordml" xmlns:w16cex="http://schemas.microsoft.com/office/word/2018/wordml/cex" xmlns:w16cid="http://schemas.microsoft.com/office/word/2016/wordml/cid" xmlns:w16="http://schemas.microsoft.com/office/word/2018/wordml" xmlns:w16sdtdh="http://schemas.microsoft.com/office/word/2020/wordml/sdtdatahash" xmlns:w16se="http://schemas.microsoft.com/office/word/2015/wordml/symex" xmlns:wpg="http://schemas.microsoft.com/office/word/2010/wordprocessingGroup" xmlns:wpi="http://schemas.microsoft.com/office/word/2010/wordprocessingInk" xmlns:wne="http://schemas.microsoft.com/office/word/2006/wordml" xmlns:wps="http://schemas.microsoft.com/office/word/2010/wordprocessingShape" mc:Ignorable="w14 w15 w16se w16cid w16 w16cex w16sdtdh wp14">
   <w:p>
     <w:pPr>
       <w:pStyle w:val="Header"/>
       <w:jc w:val="center"/>
     </w:pPr>
+    <w:r>
+      <w:rPr>
+        <w:noProof/>
+      </w:rPr>
+      <mc:AlternateContent>
+        <mc:Choice Requires="wps">
+          <w:drawing>
+            <wp:anchor distT="0" distB="0" distL="0" distR="0" simplePos="0" relativeHeight="251660288" behindDoc="0" locked="0" layoutInCell="1" allowOverlap="1" wp14:anchorId="08D62231" wp14:editId="398A31A8">
+              <wp:simplePos x="914400" y="457200"/>
+              <wp:positionH relativeFrom="column">
+                <wp:align>center</wp:align>
+              </wp:positionH>
+              <wp:positionV relativeFrom="paragraph">
+                <wp:posOffset>635</wp:posOffset>
+              </wp:positionV>
+              <wp:extent cx="443865" cy="443865"/>
+              <wp:effectExtent l="0" t="0" r="1905" b="18415"/>
+              <wp:wrapSquare wrapText="bothSides"/>
+              <wp:docPr id="3" name="Text Box 3" descr="Lockheed Martin Proprietary Information">
+                <a:extLst xmlns:a="http://schemas.openxmlformats.org/drawingml/2006/main">
+                  <a:ext uri="{5AE41FA2-C0FF-4470-9BD4-5FADCA87CBE2}">
+                    <aclsh:classification xmlns:aclsh="http://schemas.microsoft.com/office/drawing/2020/classificationShape" classificationOutcomeType="hdr"/>
+                  </a:ext>
+                </a:extLst>
+              </wp:docPr>
+              <wp:cNvGraphicFramePr/>
+              <a:graphic xmlns:a="http://schemas.openxmlformats.org/drawingml/2006/main">
+                <a:graphicData uri="http://schemas.microsoft.com/office/word/2010/wordprocessingShape">
+                  <wps:wsp>
+                    <wps:cNvSpPr txBox="1"/>
+                    <wps:spPr>
+                      <a:xfrm>
+                        <a:off x="0" y="0"/>
+                        <a:ext cx="443865" cy="443865"/>
+                      </a:xfrm>
+                      <a:prstGeom prst="rect">
+                        <a:avLst/>
+                      </a:prstGeom>
+                      <a:noFill/>
+                      <a:ln>
+                        <a:noFill/>
+                      </a:ln>
+                    </wps:spPr>
+                    <wps:txbx>
+                      <w:txbxContent>
+                        <w:p>
+                          <w:pPr>
+                            <w:rPr>
+                              <w:rFonts w:ascii="Calibri" w:eastAsia="Calibri" w:hAnsi="Calibri" w:cs="Calibri"/>
+                              <w:noProof/>
+                              <w:color w:val="000000"/>
+                              <w:sz w:val="20"/>
+                              <w:szCs w:val="20"/>
+                            </w:rPr>
+                          </w:pPr>
+                          <w:r>
+                            <w:rPr>
+                              <w:rFonts w:ascii="Calibri" w:eastAsia="Calibri" w:hAnsi="Calibri" w:cs="Calibri"/>
+                              <w:noProof/>
+                              <w:color w:val="000000"/>
+                              <w:sz w:val="20"/>
+                              <w:szCs w:val="20"/>
+                            </w:rPr>
+                            <w:t>Lockheed Martin Proprietary Information</w:t>
+                          </w:r>
+                        </w:p>
+                      </w:txbxContent>
+                    </wps:txbx>
+                    <wps:bodyPr rot="0" spcFirstLastPara="0" vertOverflow="overflow" horzOverflow="overflow" vert="horz" wrap="none" lIns="0" tIns="0" rIns="0" bIns="0" numCol="1" spcCol="0" rtlCol="0" fromWordArt="0" anchor="t" anchorCtr="0" forceAA="0" compatLnSpc="1">
+                      <a:prstTxWarp prst="textNoShape">
+                        <a:avLst/>
+                      </a:prstTxWarp>
+                      <a:spAutoFit/>
+                    </wps:bodyPr>
+                  </wps:wsp>
+                </a:graphicData>
+              </a:graphic>
+            </wp:anchor>
+          </w:drawing>
+        </mc:Choice>
+        <mc:Fallback>
+          <w:pict>
+            <v:shapetype w14:anchorId="08D62231" id="_x0000_t202" coordsize="21600,21600" o:spt="202" path="m,l,21600r21600,l21600,xe">
+              <v:stroke joinstyle="miter"/>
+              <v:path gradientshapeok="t" o:connecttype="rect"/>
+            </v:shapetype>
+            <v:shape id="Text Box 3" o:spid="_x0000_s1027" type="#_x0000_t202" alt="Lockheed Martin Proprietary Information" style="position:absolute;left:0;text-align:left;margin-left:0;margin-top:.05pt;width:34.95pt;height:34.95pt;z-index:251660288;visibility:visible;mso-wrap-style:none;mso-wrap-distance-left:0;mso-wrap-distance-top:0;mso-wrap-distance-right:0;mso-wrap-distance-bottom:0;mso-position-horizontal:center;mso-position-horizontal-relative:text;mso-position-vertical:absolute;mso-position-vertical-relative:text;v-text-anchor:top" o:gfxdata="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" filled="f" stroked="f">
+              <v:fill o:detectmouseclick="t"/>
+              <v:textbox style="mso-fit-shape-to-text:t" inset="0,0,0,0">
+                <w:txbxContent>
+                  <w:p>
+                    <w:pPr>
+                      <w:rPr>
+                        <w:rFonts w:ascii="Calibri" w:eastAsia="Calibri" w:hAnsi="Calibri" w:cs="Calibri"/>
+                        <w:noProof/>
+                        <w:color w:val="000000"/>
+                        <w:sz w:val="20"/>
+                        <w:szCs w:val="20"/>
+                      </w:rPr>
+                    </w:pPr>
+                    <w:r>
+                      <w:rPr>
+                        <w:rFonts w:ascii="Calibri" w:eastAsia="Calibri" w:hAnsi="Calibri" w:cs="Calibri"/>
+                        <w:noProof/>
+                        <w:color w:val="000000"/>
+                        <w:sz w:val="20"/>
+                        <w:szCs w:val="20"/>
+                      </w:rPr>
+                      <w:t>Lockheed Martin Proprietary Information</w:t>
+                    </w:r>
+                  </w:p>
+                </w:txbxContent>
+              </v:textbox>
+              <w10:wrap type="square"/>
+            </v:shape>
+          </w:pict>
+        </mc:Fallback>
+      </mc:AlternateContent>
+    </w:r>
     <w:r>
       <w:t>Lockheed Martin Proprietary Information</w:t>
     </w:r>
@@ -8202,12 +9560,131 @@
 </file>
 
 <file path=word/header3.xml><?xml version="1.0" encoding="utf-8"?>
-<w:hdr xmlns:wpc="http://schemas.microsoft.com/office/word/2010/wordprocessingCanvas" xmlns:cx="http://schemas.microsoft.com/office/drawing/2014/chartex" xmlns:cx1="http://schemas.microsoft.com/office/drawing/2015/9/8/chartex" xmlns:cx2="http://schemas.microsoft.com/office/drawing/2015/10/21/chartex" xmlns:cx3="http://schemas.microsoft.com/office/drawing/2016/5/9/chartex" xmlns:cx4="http://schemas.microsoft.com/office/drawing/2016/5/10/chartex" xmlns:cx5="http://schemas.microsoft.com/office/drawing/2016/5/11/chartex" xmlns:cx6="http://schemas.microsoft.com/office/drawing/2016/5/12/chartex" xmlns:cx7="http://schemas.microsoft.com/office/drawing/2016/5/13/chartex" xmlns:cx8="http://schemas.microsoft.com/office/drawing/2016/5/14/chartex" xmlns:mc="http://schemas.openxmlformats.org/markup-compatibility/2006" xmlns:aink="http://schemas.microsoft.com/office/drawing/2016/ink" xmlns:am3d="http://schemas.microsoft.com/office/drawing/2017/model3d" xmlns:o="urn:schemas-microsoft-com:office:office" xmlns:r="http://schemas.openxmlformats.org/officeDocument/2006/relationships" xmlns:m="http://schemas.openxmlformats.org/officeDocument/2006/math" xmlns:v="urn:schemas-microsoft-com:vml" xmlns:wp14="http://schemas.microsoft.com/office/word/2010/wordprocessingDrawing" xmlns:wp="http://schemas.openxmlformats.org/drawingml/2006/wordprocessingDrawing" xmlns:w10="urn:schemas-microsoft-com:office:word" xmlns:w="http://schemas.openxmlformats.org/wordprocessingml/2006/main" xmlns:w14="http://schemas.microsoft.com/office/word/2010/wordml" xmlns:w15="http://schemas.microsoft.com/office/word/2012/wordml" xmlns:w16cex="http://schemas.microsoft.com/office/word/2018/wordml/cex" xmlns:w16cid="http://schemas.microsoft.com/office/word/2016/wordml/cid" xmlns:w16="http://schemas.microsoft.com/office/word/2018/wordml" xmlns:w16sdtdh="http://schemas.microsoft.com/office/word/2020/wordml/sdtdatahash" xmlns:w16se="http://schemas.microsoft.com/office/word/2015/wordml/symex" xmlns:wpg="http://schemas.microsoft.com/office/word/2010/wordprocessingGroup" xmlns:wpi="http://schemas.microsoft.com/office/word/2010/wordprocessingInk" xmlns:wne="http://schemas.microsoft.com/office/word/2006/wordml" xmlns:wps="http://schemas.microsoft.com/office/word/2010/wordprocessingShape" mc:Ignorable="w14 w15 w16se w16cid w16 w16cex w16sdtdh wp14">
+<w:hdr xmlns:wpc="http://schemas.microsoft.com/office/word/2010/wordprocessingCanvas" xmlns:cx="http://schemas.microsoft.com/office/drawing/2014/chartex" xmlns:cx1="http://schemas.microsoft.com/office/drawing/2015/9/8/chartex" xmlns:cx2="http://schemas.microsoft.com/office/drawing/2015/10/21/chartex" xmlns:cx3="http://schemas.microsoft.com/office/drawing/2016/5/9/chartex" xmlns:cx4="http://schemas.microsoft.com/office/drawing/2016/5/10/chartex" xmlns:cx5="http://schemas.microsoft.com/office/drawing/2016/5/11/chartex" xmlns:cx6="http://schemas.microsoft.com/office/drawing/2016/5/12/chartex" xmlns:cx7="http://schemas.microsoft.com/office/drawing/2016/5/13/chartex" xmlns:cx8="http://schemas.microsoft.com/office/drawing/2016/5/14/chartex" xmlns:mc="http://schemas.openxmlformats.org/markup-compatibility/2006" xmlns:aink="http://schemas.microsoft.com/office/drawing/2016/ink" xmlns:am3d="http://schemas.microsoft.com/office/drawing/2017/model3d" xmlns:o="urn:schemas-microsoft-com:office:office" xmlns:oel="http://schemas.microsoft.com/office/2019/extlst" xmlns:r="http://schemas.openxmlformats.org/officeDocument/2006/relationships" xmlns:m="http://schemas.openxmlformats.org/officeDocument/2006/math" xmlns:v="urn:schemas-microsoft-com:vml" xmlns:wp14="http://schemas.microsoft.com/office/word/2010/wordprocessingDrawing" xmlns:wp="http://schemas.openxmlformats.org/drawingml/2006/wordprocessingDrawing" xmlns:w10="urn:schemas-microsoft-com:office:word" xmlns:w="http://schemas.openxmlformats.org/wordprocessingml/2006/main" xmlns:w14="http://schemas.microsoft.com/office/word/2010/wordml" xmlns:w15="http://schemas.microsoft.com/office/word/2012/wordml" xmlns:w16cex="http://schemas.microsoft.com/office/word/2018/wordml/cex" xmlns:w16cid="http://schemas.microsoft.com/office/word/2016/wordml/cid" xmlns:w16="http://schemas.microsoft.com/office/word/2018/wordml" xmlns:w16sdtdh="http://schemas.microsoft.com/office/word/2020/wordml/sdtdatahash" xmlns:w16se="http://schemas.microsoft.com/office/word/2015/wordml/symex" xmlns:wpg="http://schemas.microsoft.com/office/word/2010/wordprocessingGroup" xmlns:wpi="http://schemas.microsoft.com/office/word/2010/wordprocessingInk" xmlns:wne="http://schemas.microsoft.com/office/word/2006/wordml" xmlns:wps="http://schemas.microsoft.com/office/word/2010/wordprocessingShape" mc:Ignorable="w14 w15 w16se w16cid w16 w16cex w16sdtdh wp14">
   <w:p>
     <w:pPr>
       <w:pStyle w:val="Header"/>
       <w:jc w:val="center"/>
     </w:pPr>
+    <w:r>
+      <w:rPr>
+        <w:noProof/>
+      </w:rPr>
+      <mc:AlternateContent>
+        <mc:Choice Requires="wps">
+          <w:drawing>
+            <wp:anchor distT="0" distB="0" distL="0" distR="0" simplePos="0" relativeHeight="251658240" behindDoc="0" locked="0" layoutInCell="1" allowOverlap="1" wp14:anchorId="21C5D080" wp14:editId="66A6C2F3">
+              <wp:simplePos x="635" y="635"/>
+              <wp:positionH relativeFrom="column">
+                <wp:align>center</wp:align>
+              </wp:positionH>
+              <wp:positionV relativeFrom="paragraph">
+                <wp:posOffset>635</wp:posOffset>
+              </wp:positionV>
+              <wp:extent cx="443865" cy="443865"/>
+              <wp:effectExtent l="0" t="0" r="1905" b="18415"/>
+              <wp:wrapSquare wrapText="bothSides"/>
+              <wp:docPr id="1" name="Text Box 1" descr="Lockheed Martin Proprietary Information">
+                <a:extLst xmlns:a="http://schemas.openxmlformats.org/drawingml/2006/main">
+                  <a:ext uri="{5AE41FA2-C0FF-4470-9BD4-5FADCA87CBE2}">
+                    <aclsh:classification xmlns:aclsh="http://schemas.microsoft.com/office/drawing/2020/classificationShape" classificationOutcomeType="hdr"/>
+                  </a:ext>
+                </a:extLst>
+              </wp:docPr>
+              <wp:cNvGraphicFramePr/>
+              <a:graphic xmlns:a="http://schemas.openxmlformats.org/drawingml/2006/main">
+                <a:graphicData uri="http://schemas.microsoft.com/office/word/2010/wordprocessingShape">
+                  <wps:wsp>
+                    <wps:cNvSpPr txBox="1"/>
+                    <wps:spPr>
+                      <a:xfrm>
+                        <a:off x="0" y="0"/>
+                        <a:ext cx="443865" cy="443865"/>
+                      </a:xfrm>
+                      <a:prstGeom prst="rect">
+                        <a:avLst/>
+                      </a:prstGeom>
+                      <a:noFill/>
+                      <a:ln>
+                        <a:noFill/>
+                      </a:ln>
+                    </wps:spPr>
+                    <wps:txbx>
+                      <w:txbxContent>
+                        <w:p>
+                          <w:pPr>
+                            <w:rPr>
+                              <w:rFonts w:ascii="Calibri" w:eastAsia="Calibri" w:hAnsi="Calibri" w:cs="Calibri"/>
+                              <w:noProof/>
+                              <w:color w:val="000000"/>
+                              <w:sz w:val="20"/>
+                              <w:szCs w:val="20"/>
+                            </w:rPr>
+                          </w:pPr>
+                          <w:r>
+                            <w:rPr>
+                              <w:rFonts w:ascii="Calibri" w:eastAsia="Calibri" w:hAnsi="Calibri" w:cs="Calibri"/>
+                              <w:noProof/>
+                              <w:color w:val="000000"/>
+                              <w:sz w:val="20"/>
+                              <w:szCs w:val="20"/>
+                            </w:rPr>
+                            <w:t>Lockheed Martin Proprietary Information</w:t>
+                          </w:r>
+                        </w:p>
+                      </w:txbxContent>
+                    </wps:txbx>
+                    <wps:bodyPr rot="0" spcFirstLastPara="0" vertOverflow="overflow" horzOverflow="overflow" vert="horz" wrap="none" lIns="0" tIns="0" rIns="0" bIns="0" numCol="1" spcCol="0" rtlCol="0" fromWordArt="0" anchor="t" anchorCtr="0" forceAA="0" compatLnSpc="1">
+                      <a:prstTxWarp prst="textNoShape">
+                        <a:avLst/>
+                      </a:prstTxWarp>
+                      <a:spAutoFit/>
+                    </wps:bodyPr>
+                  </wps:wsp>
+                </a:graphicData>
+              </a:graphic>
+            </wp:anchor>
+          </w:drawing>
+        </mc:Choice>
+        <mc:Fallback>
+          <w:pict>
+            <v:shapetype w14:anchorId="21C5D080" id="_x0000_t202" coordsize="21600,21600" o:spt="202" path="m,l,21600r21600,l21600,xe">
+              <v:stroke joinstyle="miter"/>
+              <v:path gradientshapeok="t" o:connecttype="rect"/>
+            </v:shapetype>
+            <v:shape id="Text Box 1" o:spid="_x0000_s1030" type="#_x0000_t202" alt="Lockheed Martin Proprietary Information" style="position:absolute;left:0;text-align:left;margin-left:0;margin-top:.05pt;width:34.95pt;height:34.95pt;z-index:251658240;visibility:visible;mso-wrap-style:none;mso-wrap-distance-left:0;mso-wrap-distance-top:0;mso-wrap-distance-right:0;mso-wrap-distance-bottom:0;mso-position-horizontal:center;mso-position-horizontal-relative:text;mso-position-vertical:absolute;mso-position-vertical-relative:text;v-text-anchor:top" o:gfxdata="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" filled="f" stroked="f">
+              <v:fill o:detectmouseclick="t"/>
+              <v:textbox style="mso-fit-shape-to-text:t" inset="0,0,0,0">
+                <w:txbxContent>
+                  <w:p>
+                    <w:pPr>
+                      <w:rPr>
+                        <w:rFonts w:ascii="Calibri" w:eastAsia="Calibri" w:hAnsi="Calibri" w:cs="Calibri"/>
+                        <w:noProof/>
+                        <w:color w:val="000000"/>
+                        <w:sz w:val="20"/>
+                        <w:szCs w:val="20"/>
+                      </w:rPr>
+                    </w:pPr>
+                    <w:r>
+                      <w:rPr>
+                        <w:rFonts w:ascii="Calibri" w:eastAsia="Calibri" w:hAnsi="Calibri" w:cs="Calibri"/>
+                        <w:noProof/>
+                        <w:color w:val="000000"/>
+                        <w:sz w:val="20"/>
+                        <w:szCs w:val="20"/>
+                      </w:rPr>
+                      <w:t>Lockheed Martin Proprietary Information</w:t>
+                    </w:r>
+                  </w:p>
+                </w:txbxContent>
+              </v:textbox>
+              <w10:wrap type="square"/>
+            </v:shape>
+          </w:pict>
+        </mc:Fallback>
+      </mc:AlternateContent>
+    </w:r>
     <w:r>
       <w:t>Lockheed Martin Proprietary Information</w:t>
     </w:r>
@@ -8221,7 +9698,7 @@
 </file>
 
 <file path=word/numbering.xml><?xml version="1.0" encoding="utf-8"?>
-<w:numbering xmlns:wpc="http://schemas.microsoft.com/office/word/2010/wordprocessingCanvas" xmlns:cx="http://schemas.microsoft.com/office/drawing/2014/chartex" xmlns:cx1="http://schemas.microsoft.com/office/drawing/2015/9/8/chartex" xmlns:cx2="http://schemas.microsoft.com/office/drawing/2015/10/21/chartex" xmlns:cx3="http://schemas.microsoft.com/office/drawing/2016/5/9/chartex" xmlns:cx4="http://schemas.microsoft.com/office/drawing/2016/5/10/chartex" xmlns:cx5="http://schemas.microsoft.com/office/drawing/2016/5/11/chartex" xmlns:cx6="http://schemas.microsoft.com/office/drawing/2016/5/12/chartex" xmlns:cx7="http://schemas.microsoft.com/office/drawing/2016/5/13/chartex" xmlns:cx8="http://schemas.microsoft.com/office/drawing/2016/5/14/chartex" xmlns:mc="http://schemas.openxmlformats.org/markup-compatibility/2006" xmlns:aink="http://schemas.microsoft.com/office/drawing/2016/ink" xmlns:am3d="http://schemas.microsoft.com/office/drawing/2017/model3d" xmlns:o="urn:schemas-microsoft-com:office:office" xmlns:r="http://schemas.openxmlformats.org/officeDocument/2006/relationships" xmlns:m="http://schemas.openxmlformats.org/officeDocument/2006/math" xmlns:v="urn:schemas-microsoft-com:vml" xmlns:wp14="http://schemas.microsoft.com/office/word/2010/wordprocessingDrawing" xmlns:wp="http://schemas.openxmlformats.org/drawingml/2006/wordprocessingDrawing" xmlns:w10="urn:schemas-microsoft-com:office:word" xmlns:w="http://schemas.openxmlformats.org/wordprocessingml/2006/main" xmlns:w14="http://schemas.microsoft.com/office/word/2010/wordml" xmlns:w15="http://schemas.microsoft.com/office/word/2012/wordml" xmlns:w16cex="http://schemas.microsoft.com/office/word/2018/wordml/cex" xmlns:w16cid="http://schemas.microsoft.com/office/word/2016/wordml/cid" xmlns:w16="http://schemas.microsoft.com/office/word/2018/wordml" xmlns:w16sdtdh="http://schemas.microsoft.com/office/word/2020/wordml/sdtdatahash" xmlns:w16se="http://schemas.microsoft.com/office/word/2015/wordml/symex" xmlns:wpg="http://schemas.microsoft.com/office/word/2010/wordprocessingGroup" xmlns:wpi="http://schemas.microsoft.com/office/word/2010/wordprocessingInk" xmlns:wne="http://schemas.microsoft.com/office/word/2006/wordml" xmlns:wps="http://schemas.microsoft.com/office/word/2010/wordprocessingShape" mc:Ignorable="w14 w15 w16se w16cid w16 w16cex w16sdtdh wp14">
+<w:numbering xmlns:wpc="http://schemas.microsoft.com/office/word/2010/wordprocessingCanvas" xmlns:cx="http://schemas.microsoft.com/office/drawing/2014/chartex" xmlns:cx1="http://schemas.microsoft.com/office/drawing/2015/9/8/chartex" xmlns:cx2="http://schemas.microsoft.com/office/drawing/2015/10/21/chartex" xmlns:cx3="http://schemas.microsoft.com/office/drawing/2016/5/9/chartex" xmlns:cx4="http://schemas.microsoft.com/office/drawing/2016/5/10/chartex" xmlns:cx5="http://schemas.microsoft.com/office/drawing/2016/5/11/chartex" xmlns:cx6="http://schemas.microsoft.com/office/drawing/2016/5/12/chartex" xmlns:cx7="http://schemas.microsoft.com/office/drawing/2016/5/13/chartex" xmlns:cx8="http://schemas.microsoft.com/office/drawing/2016/5/14/chartex" xmlns:mc="http://schemas.openxmlformats.org/markup-compatibility/2006" xmlns:aink="http://schemas.microsoft.com/office/drawing/2016/ink" xmlns:am3d="http://schemas.microsoft.com/office/drawing/2017/model3d" xmlns:o="urn:schemas-microsoft-com:office:office" xmlns:oel="http://schemas.microsoft.com/office/2019/extlst" xmlns:r="http://schemas.openxmlformats.org/officeDocument/2006/relationships" xmlns:m="http://schemas.openxmlformats.org/officeDocument/2006/math" xmlns:v="urn:schemas-microsoft-com:vml" xmlns:wp14="http://schemas.microsoft.com/office/word/2010/wordprocessingDrawing" xmlns:wp="http://schemas.openxmlformats.org/drawingml/2006/wordprocessingDrawing" xmlns:w10="urn:schemas-microsoft-com:office:word" xmlns:w="http://schemas.openxmlformats.org/wordprocessingml/2006/main" xmlns:w14="http://schemas.microsoft.com/office/word/2010/wordml" xmlns:w15="http://schemas.microsoft.com/office/word/2012/wordml" xmlns:w16cex="http://schemas.microsoft.com/office/word/2018/wordml/cex" xmlns:w16cid="http://schemas.microsoft.com/office/word/2016/wordml/cid" xmlns:w16="http://schemas.microsoft.com/office/word/2018/wordml" xmlns:w16sdtdh="http://schemas.microsoft.com/office/word/2020/wordml/sdtdatahash" xmlns:w16se="http://schemas.microsoft.com/office/word/2015/wordml/symex" xmlns:wpg="http://schemas.microsoft.com/office/word/2010/wordprocessingGroup" xmlns:wpi="http://schemas.microsoft.com/office/word/2010/wordprocessingInk" xmlns:wne="http://schemas.microsoft.com/office/word/2006/wordml" xmlns:wps="http://schemas.microsoft.com/office/word/2010/wordprocessingShape" mc:Ignorable="w14 w15 w16se w16cid w16 w16cex w16sdtdh wp14">
   <w:abstractNum w:abstractNumId="0" w15:restartNumberingAfterBreak="0">
     <w:nsid w:val="03E528F9"/>
     <w:multiLevelType w:val="hybridMultilevel"/>
@@ -9702,52 +11179,52 @@
       </w:pPr>
     </w:lvl>
   </w:abstractNum>
-  <w:num w:numId="1">
+  <w:num w:numId="1" w16cid:durableId="2015765191">
     <w:abstractNumId w:val="3"/>
   </w:num>
-  <w:num w:numId="2">
+  <w:num w:numId="2" w16cid:durableId="395327095">
     <w:abstractNumId w:val="0"/>
   </w:num>
-  <w:num w:numId="3">
+  <w:num w:numId="3" w16cid:durableId="1555850723">
     <w:abstractNumId w:val="12"/>
   </w:num>
-  <w:num w:numId="4">
+  <w:num w:numId="4" w16cid:durableId="2122994131">
     <w:abstractNumId w:val="15"/>
   </w:num>
-  <w:num w:numId="5">
+  <w:num w:numId="5" w16cid:durableId="2038389411">
     <w:abstractNumId w:val="5"/>
   </w:num>
-  <w:num w:numId="6">
+  <w:num w:numId="6" w16cid:durableId="831143648">
     <w:abstractNumId w:val="2"/>
   </w:num>
-  <w:num w:numId="7">
+  <w:num w:numId="7" w16cid:durableId="1988825063">
     <w:abstractNumId w:val="1"/>
   </w:num>
-  <w:num w:numId="8">
+  <w:num w:numId="8" w16cid:durableId="238096328">
     <w:abstractNumId w:val="13"/>
   </w:num>
-  <w:num w:numId="9">
+  <w:num w:numId="9" w16cid:durableId="1341152597">
     <w:abstractNumId w:val="4"/>
   </w:num>
-  <w:num w:numId="10">
+  <w:num w:numId="10" w16cid:durableId="1660839921">
     <w:abstractNumId w:val="9"/>
   </w:num>
-  <w:num w:numId="11">
+  <w:num w:numId="11" w16cid:durableId="1212618625">
     <w:abstractNumId w:val="8"/>
   </w:num>
-  <w:num w:numId="12">
+  <w:num w:numId="12" w16cid:durableId="506865108">
     <w:abstractNumId w:val="10"/>
   </w:num>
-  <w:num w:numId="13">
+  <w:num w:numId="13" w16cid:durableId="1506478518">
     <w:abstractNumId w:val="14"/>
   </w:num>
-  <w:num w:numId="14">
+  <w:num w:numId="14" w16cid:durableId="863902092">
     <w:abstractNumId w:val="11"/>
   </w:num>
-  <w:num w:numId="15">
+  <w:num w:numId="15" w16cid:durableId="974456316">
     <w:abstractNumId w:val="7"/>
   </w:num>
-  <w:num w:numId="16">
+  <w:num w:numId="16" w16cid:durableId="725684500">
     <w:abstractNumId w:val="6"/>
   </w:num>
   <w:numIdMacAtCleanup w:val="5"/>
@@ -9755,7 +11232,7 @@
 </file>
 
 <file path=word/people.xml><?xml version="1.0" encoding="utf-8"?>
-<w15:people xmlns:wpc="http://schemas.microsoft.com/office/word/2010/wordprocessingCanvas" xmlns:cx="http://schemas.microsoft.com/office/drawing/2014/chartex" xmlns:cx1="http://schemas.microsoft.com/office/drawing/2015/9/8/chartex" xmlns:cx2="http://schemas.microsoft.com/office/drawing/2015/10/21/chartex" xmlns:cx3="http://schemas.microsoft.com/office/drawing/2016/5/9/chartex" xmlns:cx4="http://schemas.microsoft.com/office/drawing/2016/5/10/chartex" xmlns:cx5="http://schemas.microsoft.com/office/drawing/2016/5/11/chartex" xmlns:cx6="http://schemas.microsoft.com/office/drawing/2016/5/12/chartex" xmlns:cx7="http://schemas.microsoft.com/office/drawing/2016/5/13/chartex" xmlns:cx8="http://schemas.microsoft.com/office/drawing/2016/5/14/chartex" xmlns:mc="http://schemas.openxmlformats.org/markup-compatibility/2006" xmlns:aink="http://schemas.microsoft.com/office/drawing/2016/ink" xmlns:am3d="http://schemas.microsoft.com/office/drawing/2017/model3d" xmlns:o="urn:schemas-microsoft-com:office:office" xmlns:r="http://schemas.openxmlformats.org/officeDocument/2006/relationships" xmlns:m="http://schemas.openxmlformats.org/officeDocument/2006/math" xmlns:v="urn:schemas-microsoft-com:vml" xmlns:wp14="http://schemas.microsoft.com/office/word/2010/wordprocessingDrawing" xmlns:wp="http://schemas.openxmlformats.org/drawingml/2006/wordprocessingDrawing" xmlns:w10="urn:schemas-microsoft-com:office:word" xmlns:w="http://schemas.openxmlformats.org/wordprocessingml/2006/main" xmlns:w14="http://schemas.microsoft.com/office/word/2010/wordml" xmlns:w15="http://schemas.microsoft.com/office/word/2012/wordml" xmlns:w16cex="http://schemas.microsoft.com/office/word/2018/wordml/cex" xmlns:w16cid="http://schemas.microsoft.com/office/word/2016/wordml/cid" xmlns:w16="http://schemas.microsoft.com/office/word/2018/wordml" xmlns:w16sdtdh="http://schemas.microsoft.com/office/word/2020/wordml/sdtdatahash" xmlns:w16se="http://schemas.microsoft.com/office/word/2015/wordml/symex" xmlns:wpg="http://schemas.microsoft.com/office/word/2010/wordprocessingGroup" xmlns:wpi="http://schemas.microsoft.com/office/word/2010/wordprocessingInk" xmlns:wne="http://schemas.microsoft.com/office/word/2006/wordml" xmlns:wps="http://schemas.microsoft.com/office/word/2010/wordprocessingShape" mc:Ignorable="w14 w15 w16se w16cid w16 w16cex w16sdtdh wp14">
+<w15:people xmlns:wpc="http://schemas.microsoft.com/office/word/2010/wordprocessingCanvas" xmlns:cx="http://schemas.microsoft.com/office/drawing/2014/chartex" xmlns:cx1="http://schemas.microsoft.com/office/drawing/2015/9/8/chartex" xmlns:cx2="http://schemas.microsoft.com/office/drawing/2015/10/21/chartex" xmlns:cx3="http://schemas.microsoft.com/office/drawing/2016/5/9/chartex" xmlns:cx4="http://schemas.microsoft.com/office/drawing/2016/5/10/chartex" xmlns:cx5="http://schemas.microsoft.com/office/drawing/2016/5/11/chartex" xmlns:cx6="http://schemas.microsoft.com/office/drawing/2016/5/12/chartex" xmlns:cx7="http://schemas.microsoft.com/office/drawing/2016/5/13/chartex" xmlns:cx8="http://schemas.microsoft.com/office/drawing/2016/5/14/chartex" xmlns:mc="http://schemas.openxmlformats.org/markup-compatibility/2006" xmlns:aink="http://schemas.microsoft.com/office/drawing/2016/ink" xmlns:am3d="http://schemas.microsoft.com/office/drawing/2017/model3d" xmlns:o="urn:schemas-microsoft-com:office:office" xmlns:oel="http://schemas.microsoft.com/office/2019/extlst" xmlns:r="http://schemas.openxmlformats.org/officeDocument/2006/relationships" xmlns:m="http://schemas.openxmlformats.org/officeDocument/2006/math" xmlns:v="urn:schemas-microsoft-com:vml" xmlns:wp14="http://schemas.microsoft.com/office/word/2010/wordprocessingDrawing" xmlns:wp="http://schemas.openxmlformats.org/drawingml/2006/wordprocessingDrawing" xmlns:w10="urn:schemas-microsoft-com:office:word" xmlns:w="http://schemas.openxmlformats.org/wordprocessingml/2006/main" xmlns:w14="http://schemas.microsoft.com/office/word/2010/wordml" xmlns:w15="http://schemas.microsoft.com/office/word/2012/wordml" xmlns:w16cex="http://schemas.microsoft.com/office/word/2018/wordml/cex" xmlns:w16cid="http://schemas.microsoft.com/office/word/2016/wordml/cid" xmlns:w16="http://schemas.microsoft.com/office/word/2018/wordml" xmlns:w16sdtdh="http://schemas.microsoft.com/office/word/2020/wordml/sdtdatahash" xmlns:w16se="http://schemas.microsoft.com/office/word/2015/wordml/symex" xmlns:wpg="http://schemas.microsoft.com/office/word/2010/wordprocessingGroup" xmlns:wpi="http://schemas.microsoft.com/office/word/2010/wordprocessingInk" xmlns:wne="http://schemas.microsoft.com/office/word/2006/wordml" xmlns:wps="http://schemas.microsoft.com/office/word/2010/wordprocessingShape" mc:Ignorable="w14 w15 w16se w16cid w16 w16cex w16sdtdh wp14">
   <w15:person w15:author="Palider, Dusan (US)">
     <w15:presenceInfo w15:providerId="None" w15:userId="Palider, Dusan (US)"/>
   </w15:person>

</xml_diff>

<commit_message>
update instructions touch up
</commit_message>
<xml_diff>
--- a/ClassifiedInstallationStuff/_Instructions/Initial GenBoe Installation Instructions.docx
+++ b/ClassifiedInstallationStuff/_Instructions/Initial GenBoe Installation Instructions.docx
@@ -37,17 +37,18 @@
         </w:rPr>
       </w:pPr>
     </w:p>
-    <w:bookmarkStart w:id="0" w:name="_Toc98332567" w:displacedByCustomXml="next"/>
-    <w:bookmarkStart w:id="1" w:name="_Toc98329161" w:displacedByCustomXml="next"/>
-    <w:bookmarkStart w:id="2" w:name="_Toc426545466" w:displacedByCustomXml="next"/>
-    <w:bookmarkStart w:id="3" w:name="_Toc426545102" w:displacedByCustomXml="next"/>
-    <w:bookmarkStart w:id="4" w:name="_Toc426544400" w:displacedByCustomXml="next"/>
-    <w:bookmarkStart w:id="5" w:name="_Toc410652409" w:displacedByCustomXml="next"/>
-    <w:bookmarkStart w:id="6" w:name="_Toc410286731" w:displacedByCustomXml="next"/>
-    <w:bookmarkStart w:id="7" w:name="_Toc410226779" w:displacedByCustomXml="next"/>
-    <w:bookmarkStart w:id="8" w:name="_Toc409096411" w:displacedByCustomXml="next"/>
-    <w:bookmarkStart w:id="9" w:name="_Toc402261032" w:displacedByCustomXml="next"/>
-    <w:bookmarkStart w:id="10" w:name="_Toc435089160" w:displacedByCustomXml="next"/>
+    <w:bookmarkStart w:id="0" w:name="_Toc165372583" w:displacedByCustomXml="next"/>
+    <w:bookmarkStart w:id="1" w:name="_Toc435089160" w:displacedByCustomXml="next"/>
+    <w:bookmarkStart w:id="2" w:name="_Toc402261032" w:displacedByCustomXml="next"/>
+    <w:bookmarkStart w:id="3" w:name="_Toc409096411" w:displacedByCustomXml="next"/>
+    <w:bookmarkStart w:id="4" w:name="_Toc410226779" w:displacedByCustomXml="next"/>
+    <w:bookmarkStart w:id="5" w:name="_Toc410286731" w:displacedByCustomXml="next"/>
+    <w:bookmarkStart w:id="6" w:name="_Toc410652409" w:displacedByCustomXml="next"/>
+    <w:bookmarkStart w:id="7" w:name="_Toc426544400" w:displacedByCustomXml="next"/>
+    <w:bookmarkStart w:id="8" w:name="_Toc426545102" w:displacedByCustomXml="next"/>
+    <w:bookmarkStart w:id="9" w:name="_Toc426545466" w:displacedByCustomXml="next"/>
+    <w:bookmarkStart w:id="10" w:name="_Toc98329161" w:displacedByCustomXml="next"/>
+    <w:bookmarkStart w:id="11" w:name="_Toc98332567" w:displacedByCustomXml="next"/>
     <w:sdt>
       <w:sdtPr>
         <w:rPr>
@@ -75,8 +76,8 @@
         </w:rPr>
       </w:sdtEndPr>
       <w:sdtContent>
-        <w:bookmarkStart w:id="11" w:name="_Toc266280202" w:displacedByCustomXml="prev"/>
         <w:bookmarkStart w:id="12" w:name="_Toc320016168" w:displacedByCustomXml="prev"/>
+        <w:bookmarkStart w:id="13" w:name="_Toc266280202" w:displacedByCustomXml="prev"/>
         <w:p>
           <w:pPr>
             <w:pStyle w:val="Heading1"/>
@@ -95,6 +96,7 @@
             </w:rPr>
             <w:t>GenBOE Installation Instructions</w:t>
           </w:r>
+          <w:bookmarkEnd w:id="11"/>
           <w:bookmarkEnd w:id="10"/>
           <w:bookmarkEnd w:id="9"/>
           <w:bookmarkEnd w:id="8"/>
@@ -118,17 +120,18 @@
               <w:szCs w:val="24"/>
             </w:rPr>
           </w:pPr>
-          <w:bookmarkStart w:id="13" w:name="_Toc402261033"/>
-          <w:bookmarkStart w:id="14" w:name="_Toc409096412"/>
-          <w:bookmarkStart w:id="15" w:name="_Toc410226780"/>
-          <w:bookmarkStart w:id="16" w:name="_Toc410286732"/>
-          <w:bookmarkStart w:id="17" w:name="_Toc410652410"/>
-          <w:bookmarkStart w:id="18" w:name="_Toc426544401"/>
-          <w:bookmarkStart w:id="19" w:name="_Toc426545103"/>
-          <w:bookmarkStart w:id="20" w:name="_Toc426545467"/>
-          <w:bookmarkStart w:id="21" w:name="_Toc435089161"/>
-          <w:bookmarkStart w:id="22" w:name="_Toc98329162"/>
-          <w:bookmarkStart w:id="23" w:name="_Toc98332568"/>
+          <w:bookmarkStart w:id="14" w:name="_Toc402261033"/>
+          <w:bookmarkStart w:id="15" w:name="_Toc409096412"/>
+          <w:bookmarkStart w:id="16" w:name="_Toc410226780"/>
+          <w:bookmarkStart w:id="17" w:name="_Toc410286732"/>
+          <w:bookmarkStart w:id="18" w:name="_Toc410652410"/>
+          <w:bookmarkStart w:id="19" w:name="_Toc426544401"/>
+          <w:bookmarkStart w:id="20" w:name="_Toc426545103"/>
+          <w:bookmarkStart w:id="21" w:name="_Toc426545467"/>
+          <w:bookmarkStart w:id="22" w:name="_Toc435089161"/>
+          <w:bookmarkStart w:id="23" w:name="_Toc98329162"/>
+          <w:bookmarkStart w:id="24" w:name="_Toc98332568"/>
+          <w:bookmarkStart w:id="25" w:name="_Toc165372584"/>
           <w:r>
             <w:rPr>
               <w:smallCaps/>
@@ -145,7 +148,6 @@
             </w:rPr>
             <w:t>Classified Instance</w:t>
           </w:r>
-          <w:bookmarkEnd w:id="13"/>
           <w:bookmarkEnd w:id="14"/>
           <w:bookmarkEnd w:id="15"/>
           <w:bookmarkEnd w:id="16"/>
@@ -156,6 +158,8 @@
           <w:bookmarkEnd w:id="21"/>
           <w:bookmarkEnd w:id="22"/>
           <w:bookmarkEnd w:id="23"/>
+          <w:bookmarkEnd w:id="24"/>
+          <w:bookmarkEnd w:id="25"/>
         </w:p>
         <w:p>
           <w:r>
@@ -166,20 +170,22 @@
           <w:pPr>
             <w:pStyle w:val="Heading1"/>
           </w:pPr>
-          <w:bookmarkStart w:id="24" w:name="_Toc409096413"/>
-          <w:bookmarkStart w:id="25" w:name="_Toc435089162"/>
-          <w:bookmarkStart w:id="26" w:name="_Toc98329163"/>
-          <w:bookmarkStart w:id="27" w:name="_Toc98332569"/>
+          <w:bookmarkStart w:id="26" w:name="_Toc409096413"/>
+          <w:bookmarkStart w:id="27" w:name="_Toc435089162"/>
+          <w:bookmarkStart w:id="28" w:name="_Toc98329163"/>
+          <w:bookmarkStart w:id="29" w:name="_Toc98332569"/>
+          <w:bookmarkStart w:id="30" w:name="_Toc165372585"/>
           <w:r>
             <w:lastRenderedPageBreak/>
             <w:t>Change History</w:t>
           </w:r>
+          <w:bookmarkEnd w:id="13"/>
           <w:bookmarkEnd w:id="12"/>
-          <w:bookmarkEnd w:id="11"/>
-          <w:bookmarkEnd w:id="24"/>
-          <w:bookmarkEnd w:id="25"/>
           <w:bookmarkEnd w:id="26"/>
           <w:bookmarkEnd w:id="27"/>
+          <w:bookmarkEnd w:id="28"/>
+          <w:bookmarkEnd w:id="29"/>
+          <w:bookmarkEnd w:id="30"/>
         </w:p>
         <w:p>
           <w:pPr>
@@ -598,26 +604,30 @@
           <w:pPr>
             <w:pStyle w:val="Heading1"/>
           </w:pPr>
-          <w:bookmarkStart w:id="28" w:name="_Toc409096414"/>
-          <w:bookmarkStart w:id="29" w:name="_Toc410652412"/>
-          <w:bookmarkStart w:id="30" w:name="_Toc435089163"/>
-          <w:bookmarkStart w:id="31" w:name="_Toc98329164"/>
-          <w:bookmarkStart w:id="32" w:name="_Toc98332570"/>
+          <w:bookmarkStart w:id="31" w:name="_Toc409096414"/>
+          <w:bookmarkStart w:id="32" w:name="_Toc410652412"/>
+          <w:bookmarkStart w:id="33" w:name="_Toc435089163"/>
+          <w:bookmarkStart w:id="34" w:name="_Toc98329164"/>
+          <w:bookmarkStart w:id="35" w:name="_Toc98332570"/>
+          <w:bookmarkStart w:id="36" w:name="_Toc165372586"/>
           <w:r>
             <w:lastRenderedPageBreak/>
             <w:t>Table of Contents</w:t>
           </w:r>
-          <w:bookmarkEnd w:id="28"/>
-          <w:bookmarkEnd w:id="29"/>
-          <w:bookmarkEnd w:id="30"/>
           <w:bookmarkEnd w:id="31"/>
           <w:bookmarkEnd w:id="32"/>
+          <w:bookmarkEnd w:id="33"/>
+          <w:bookmarkEnd w:id="34"/>
+          <w:bookmarkEnd w:id="35"/>
+          <w:bookmarkEnd w:id="36"/>
         </w:p>
         <w:p>
           <w:pPr>
             <w:pStyle w:val="TOC1"/>
             <w:rPr>
               <w:i w:val="0"/>
+              <w:kern w:val="2"/>
+              <w14:ligatures w14:val="standardContextual"/>
             </w:rPr>
           </w:pPr>
           <w:r>
@@ -629,7 +639,245 @@
           <w:r>
             <w:fldChar w:fldCharType="separate"/>
           </w:r>
-          <w:hyperlink w:anchor="_Toc98332571" w:history="1">
+          <w:hyperlink w:anchor="_Toc165372583" w:history="1">
+            <w:r>
+              <w:rPr>
+                <w:rStyle w:val="Hyperlink"/>
+                <w:smallCaps/>
+              </w:rPr>
+              <w:t>GenBOE Installation Instructions</w:t>
+            </w:r>
+            <w:r>
+              <w:rPr>
+                <w:webHidden/>
+              </w:rPr>
+              <w:tab/>
+            </w:r>
+            <w:r>
+              <w:rPr>
+                <w:webHidden/>
+              </w:rPr>
+              <w:fldChar w:fldCharType="begin"/>
+            </w:r>
+            <w:r>
+              <w:rPr>
+                <w:webHidden/>
+              </w:rPr>
+              <w:instrText xml:space="preserve"> PAGEREF _Toc165372583 \h </w:instrText>
+            </w:r>
+            <w:r>
+              <w:rPr>
+                <w:webHidden/>
+              </w:rPr>
+            </w:r>
+            <w:r>
+              <w:rPr>
+                <w:webHidden/>
+              </w:rPr>
+              <w:fldChar w:fldCharType="separate"/>
+            </w:r>
+            <w:r>
+              <w:rPr>
+                <w:webHidden/>
+              </w:rPr>
+              <w:t>1</w:t>
+            </w:r>
+            <w:r>
+              <w:rPr>
+                <w:webHidden/>
+              </w:rPr>
+              <w:fldChar w:fldCharType="end"/>
+            </w:r>
+          </w:hyperlink>
+        </w:p>
+        <w:p>
+          <w:pPr>
+            <w:pStyle w:val="TOC1"/>
+            <w:rPr>
+              <w:i w:val="0"/>
+              <w:kern w:val="2"/>
+              <w14:ligatures w14:val="standardContextual"/>
+            </w:rPr>
+          </w:pPr>
+          <w:hyperlink w:anchor="_Toc165372584" w:history="1">
+            <w:r>
+              <w:rPr>
+                <w:rStyle w:val="Hyperlink"/>
+                <w:smallCaps/>
+              </w:rPr>
+              <w:t>For a Classified Instance</w:t>
+            </w:r>
+            <w:r>
+              <w:rPr>
+                <w:webHidden/>
+              </w:rPr>
+              <w:tab/>
+            </w:r>
+            <w:r>
+              <w:rPr>
+                <w:webHidden/>
+              </w:rPr>
+              <w:fldChar w:fldCharType="begin"/>
+            </w:r>
+            <w:r>
+              <w:rPr>
+                <w:webHidden/>
+              </w:rPr>
+              <w:instrText xml:space="preserve"> PAGEREF _Toc165372584 \h </w:instrText>
+            </w:r>
+            <w:r>
+              <w:rPr>
+                <w:webHidden/>
+              </w:rPr>
+            </w:r>
+            <w:r>
+              <w:rPr>
+                <w:webHidden/>
+              </w:rPr>
+              <w:fldChar w:fldCharType="separate"/>
+            </w:r>
+            <w:r>
+              <w:rPr>
+                <w:webHidden/>
+              </w:rPr>
+              <w:t>1</w:t>
+            </w:r>
+            <w:r>
+              <w:rPr>
+                <w:webHidden/>
+              </w:rPr>
+              <w:fldChar w:fldCharType="end"/>
+            </w:r>
+          </w:hyperlink>
+        </w:p>
+        <w:p>
+          <w:pPr>
+            <w:pStyle w:val="TOC1"/>
+            <w:rPr>
+              <w:i w:val="0"/>
+              <w:kern w:val="2"/>
+              <w14:ligatures w14:val="standardContextual"/>
+            </w:rPr>
+          </w:pPr>
+          <w:hyperlink w:anchor="_Toc165372585" w:history="1">
+            <w:r>
+              <w:rPr>
+                <w:rStyle w:val="Hyperlink"/>
+              </w:rPr>
+              <w:t>Change History</w:t>
+            </w:r>
+            <w:r>
+              <w:rPr>
+                <w:webHidden/>
+              </w:rPr>
+              <w:tab/>
+            </w:r>
+            <w:r>
+              <w:rPr>
+                <w:webHidden/>
+              </w:rPr>
+              <w:fldChar w:fldCharType="begin"/>
+            </w:r>
+            <w:r>
+              <w:rPr>
+                <w:webHidden/>
+              </w:rPr>
+              <w:instrText xml:space="preserve"> PAGEREF _Toc165372585 \h </w:instrText>
+            </w:r>
+            <w:r>
+              <w:rPr>
+                <w:webHidden/>
+              </w:rPr>
+            </w:r>
+            <w:r>
+              <w:rPr>
+                <w:webHidden/>
+              </w:rPr>
+              <w:fldChar w:fldCharType="separate"/>
+            </w:r>
+            <w:r>
+              <w:rPr>
+                <w:webHidden/>
+              </w:rPr>
+              <w:t>2</w:t>
+            </w:r>
+            <w:r>
+              <w:rPr>
+                <w:webHidden/>
+              </w:rPr>
+              <w:fldChar w:fldCharType="end"/>
+            </w:r>
+          </w:hyperlink>
+        </w:p>
+        <w:p>
+          <w:pPr>
+            <w:pStyle w:val="TOC1"/>
+            <w:rPr>
+              <w:i w:val="0"/>
+              <w:kern w:val="2"/>
+              <w14:ligatures w14:val="standardContextual"/>
+            </w:rPr>
+          </w:pPr>
+          <w:hyperlink w:anchor="_Toc165372586" w:history="1">
+            <w:r>
+              <w:rPr>
+                <w:rStyle w:val="Hyperlink"/>
+              </w:rPr>
+              <w:t>Table of Contents</w:t>
+            </w:r>
+            <w:r>
+              <w:rPr>
+                <w:webHidden/>
+              </w:rPr>
+              <w:tab/>
+            </w:r>
+            <w:r>
+              <w:rPr>
+                <w:webHidden/>
+              </w:rPr>
+              <w:fldChar w:fldCharType="begin"/>
+            </w:r>
+            <w:r>
+              <w:rPr>
+                <w:webHidden/>
+              </w:rPr>
+              <w:instrText xml:space="preserve"> PAGEREF _Toc165372586 \h </w:instrText>
+            </w:r>
+            <w:r>
+              <w:rPr>
+                <w:webHidden/>
+              </w:rPr>
+            </w:r>
+            <w:r>
+              <w:rPr>
+                <w:webHidden/>
+              </w:rPr>
+              <w:fldChar w:fldCharType="separate"/>
+            </w:r>
+            <w:r>
+              <w:rPr>
+                <w:webHidden/>
+              </w:rPr>
+              <w:t>3</w:t>
+            </w:r>
+            <w:r>
+              <w:rPr>
+                <w:webHidden/>
+              </w:rPr>
+              <w:fldChar w:fldCharType="end"/>
+            </w:r>
+          </w:hyperlink>
+        </w:p>
+        <w:p>
+          <w:pPr>
+            <w:pStyle w:val="TOC1"/>
+            <w:rPr>
+              <w:i w:val="0"/>
+              <w:kern w:val="2"/>
+              <w14:ligatures w14:val="standardContextual"/>
+            </w:rPr>
+          </w:pPr>
+          <w:hyperlink w:anchor="_Toc165372587" w:history="1">
             <w:r>
               <w:rPr>
                 <w:rStyle w:val="Hyperlink"/>
@@ -652,7 +900,7 @@
               <w:rPr>
                 <w:webHidden/>
               </w:rPr>
-              <w:instrText xml:space="preserve"> PAGEREF _Toc98332571 \h </w:instrText>
+              <w:instrText xml:space="preserve"> PAGEREF _Toc165372587 \h </w:instrText>
             </w:r>
             <w:r>
               <w:rPr>
@@ -684,9 +932,11 @@
             <w:pStyle w:val="TOC1"/>
             <w:rPr>
               <w:i w:val="0"/>
+              <w:kern w:val="2"/>
+              <w14:ligatures w14:val="standardContextual"/>
             </w:rPr>
           </w:pPr>
-          <w:hyperlink w:anchor="_Toc98332572" w:history="1">
+          <w:hyperlink w:anchor="_Toc165372588" w:history="1">
             <w:r>
               <w:rPr>
                 <w:rStyle w:val="Hyperlink"/>
@@ -709,7 +959,7 @@
               <w:rPr>
                 <w:webHidden/>
               </w:rPr>
-              <w:instrText xml:space="preserve"> PAGEREF _Toc98332572 \h </w:instrText>
+              <w:instrText xml:space="preserve"> PAGEREF _Toc165372588 \h </w:instrText>
             </w:r>
             <w:r>
               <w:rPr>
@@ -741,9 +991,11 @@
             <w:pStyle w:val="TOC1"/>
             <w:rPr>
               <w:i w:val="0"/>
+              <w:kern w:val="2"/>
+              <w14:ligatures w14:val="standardContextual"/>
             </w:rPr>
           </w:pPr>
-          <w:hyperlink w:anchor="_Toc98332573" w:history="1">
+          <w:hyperlink w:anchor="_Toc165372589" w:history="1">
             <w:r>
               <w:rPr>
                 <w:rStyle w:val="Hyperlink"/>
@@ -766,7 +1018,7 @@
               <w:rPr>
                 <w:webHidden/>
               </w:rPr>
-              <w:instrText xml:space="preserve"> PAGEREF _Toc98332573 \h </w:instrText>
+              <w:instrText xml:space="preserve"> PAGEREF _Toc165372589 \h </w:instrText>
             </w:r>
             <w:r>
               <w:rPr>
@@ -798,9 +1050,11 @@
             <w:pStyle w:val="TOC1"/>
             <w:rPr>
               <w:i w:val="0"/>
+              <w:kern w:val="2"/>
+              <w14:ligatures w14:val="standardContextual"/>
             </w:rPr>
           </w:pPr>
-          <w:hyperlink w:anchor="_Toc98332574" w:history="1">
+          <w:hyperlink w:anchor="_Toc165372590" w:history="1">
             <w:r>
               <w:rPr>
                 <w:rStyle w:val="Hyperlink"/>
@@ -823,7 +1077,7 @@
               <w:rPr>
                 <w:webHidden/>
               </w:rPr>
-              <w:instrText xml:space="preserve"> PAGEREF _Toc98332574 \h </w:instrText>
+              <w:instrText xml:space="preserve"> PAGEREF _Toc165372590 \h </w:instrText>
             </w:r>
             <w:r>
               <w:rPr>
@@ -855,9 +1109,11 @@
             <w:pStyle w:val="TOC1"/>
             <w:rPr>
               <w:i w:val="0"/>
+              <w:kern w:val="2"/>
+              <w14:ligatures w14:val="standardContextual"/>
             </w:rPr>
           </w:pPr>
-          <w:hyperlink w:anchor="_Toc98332575" w:history="1">
+          <w:hyperlink w:anchor="_Toc165372591" w:history="1">
             <w:r>
               <w:rPr>
                 <w:rStyle w:val="Hyperlink"/>
@@ -880,7 +1136,7 @@
               <w:rPr>
                 <w:webHidden/>
               </w:rPr>
-              <w:instrText xml:space="preserve"> PAGEREF _Toc98332575 \h </w:instrText>
+              <w:instrText xml:space="preserve"> PAGEREF _Toc165372591 \h </w:instrText>
             </w:r>
             <w:r>
               <w:rPr>
@@ -912,9 +1168,11 @@
             <w:pStyle w:val="TOC1"/>
             <w:rPr>
               <w:i w:val="0"/>
+              <w:kern w:val="2"/>
+              <w14:ligatures w14:val="standardContextual"/>
             </w:rPr>
           </w:pPr>
-          <w:hyperlink w:anchor="_Toc98332576" w:history="1">
+          <w:hyperlink w:anchor="_Toc165372592" w:history="1">
             <w:r>
               <w:rPr>
                 <w:rStyle w:val="Hyperlink"/>
@@ -937,7 +1195,7 @@
               <w:rPr>
                 <w:webHidden/>
               </w:rPr>
-              <w:instrText xml:space="preserve"> PAGEREF _Toc98332576 \h </w:instrText>
+              <w:instrText xml:space="preserve"> PAGEREF _Toc165372592 \h </w:instrText>
             </w:r>
             <w:r>
               <w:rPr>
@@ -969,9 +1227,11 @@
             <w:pStyle w:val="TOC1"/>
             <w:rPr>
               <w:i w:val="0"/>
+              <w:kern w:val="2"/>
+              <w14:ligatures w14:val="standardContextual"/>
             </w:rPr>
           </w:pPr>
-          <w:hyperlink w:anchor="_Toc98332577" w:history="1">
+          <w:hyperlink w:anchor="_Toc165372593" w:history="1">
             <w:r>
               <w:rPr>
                 <w:rStyle w:val="Hyperlink"/>
@@ -994,7 +1254,7 @@
               <w:rPr>
                 <w:webHidden/>
               </w:rPr>
-              <w:instrText xml:space="preserve"> PAGEREF _Toc98332577 \h </w:instrText>
+              <w:instrText xml:space="preserve"> PAGEREF _Toc165372593 \h </w:instrText>
             </w:r>
             <w:r>
               <w:rPr>
@@ -1026,9 +1286,11 @@
             <w:pStyle w:val="TOC1"/>
             <w:rPr>
               <w:i w:val="0"/>
+              <w:kern w:val="2"/>
+              <w14:ligatures w14:val="standardContextual"/>
             </w:rPr>
           </w:pPr>
-          <w:hyperlink w:anchor="_Toc98332578" w:history="1">
+          <w:hyperlink w:anchor="_Toc165372594" w:history="1">
             <w:r>
               <w:rPr>
                 <w:rStyle w:val="Hyperlink"/>
@@ -1051,7 +1313,7 @@
               <w:rPr>
                 <w:webHidden/>
               </w:rPr>
-              <w:instrText xml:space="preserve"> PAGEREF _Toc98332578 \h </w:instrText>
+              <w:instrText xml:space="preserve"> PAGEREF _Toc165372594 \h </w:instrText>
             </w:r>
             <w:r>
               <w:rPr>
@@ -1083,9 +1345,11 @@
             <w:pStyle w:val="TOC1"/>
             <w:rPr>
               <w:i w:val="0"/>
+              <w:kern w:val="2"/>
+              <w14:ligatures w14:val="standardContextual"/>
             </w:rPr>
           </w:pPr>
-          <w:hyperlink w:anchor="_Toc98332579" w:history="1">
+          <w:hyperlink w:anchor="_Toc165372595" w:history="1">
             <w:r>
               <w:rPr>
                 <w:rStyle w:val="Hyperlink"/>
@@ -1108,7 +1372,7 @@
               <w:rPr>
                 <w:webHidden/>
               </w:rPr>
-              <w:instrText xml:space="preserve"> PAGEREF _Toc98332579 \h </w:instrText>
+              <w:instrText xml:space="preserve"> PAGEREF _Toc165372595 \h </w:instrText>
             </w:r>
             <w:r>
               <w:rPr>
@@ -1140,9 +1404,11 @@
             <w:pStyle w:val="TOC1"/>
             <w:rPr>
               <w:i w:val="0"/>
+              <w:kern w:val="2"/>
+              <w14:ligatures w14:val="standardContextual"/>
             </w:rPr>
           </w:pPr>
-          <w:hyperlink w:anchor="_Toc98332580" w:history="1">
+          <w:hyperlink w:anchor="_Toc165372596" w:history="1">
             <w:r>
               <w:rPr>
                 <w:rStyle w:val="Hyperlink"/>
@@ -1165,7 +1431,7 @@
               <w:rPr>
                 <w:webHidden/>
               </w:rPr>
-              <w:instrText xml:space="preserve"> PAGEREF _Toc98332580 \h </w:instrText>
+              <w:instrText xml:space="preserve"> PAGEREF _Toc165372596 \h </w:instrText>
             </w:r>
             <w:r>
               <w:rPr>
@@ -1197,9 +1463,11 @@
             <w:pStyle w:val="TOC1"/>
             <w:rPr>
               <w:i w:val="0"/>
+              <w:kern w:val="2"/>
+              <w14:ligatures w14:val="standardContextual"/>
             </w:rPr>
           </w:pPr>
-          <w:hyperlink w:anchor="_Toc98332581" w:history="1">
+          <w:hyperlink w:anchor="_Toc165372597" w:history="1">
             <w:r>
               <w:rPr>
                 <w:rStyle w:val="Hyperlink"/>
@@ -1222,7 +1490,7 @@
               <w:rPr>
                 <w:webHidden/>
               </w:rPr>
-              <w:instrText xml:space="preserve"> PAGEREF _Toc98332581 \h </w:instrText>
+              <w:instrText xml:space="preserve"> PAGEREF _Toc165372597 \h </w:instrText>
             </w:r>
             <w:r>
               <w:rPr>
@@ -1254,9 +1522,11 @@
             <w:pStyle w:val="TOC1"/>
             <w:rPr>
               <w:i w:val="0"/>
+              <w:kern w:val="2"/>
+              <w14:ligatures w14:val="standardContextual"/>
             </w:rPr>
           </w:pPr>
-          <w:hyperlink w:anchor="_Toc98332582" w:history="1">
+          <w:hyperlink w:anchor="_Toc165372598" w:history="1">
             <w:r>
               <w:rPr>
                 <w:rStyle w:val="Hyperlink"/>
@@ -1279,7 +1549,7 @@
               <w:rPr>
                 <w:webHidden/>
               </w:rPr>
-              <w:instrText xml:space="preserve"> PAGEREF _Toc98332582 \h </w:instrText>
+              <w:instrText xml:space="preserve"> PAGEREF _Toc165372598 \h </w:instrText>
             </w:r>
             <w:r>
               <w:rPr>
@@ -1329,12 +1599,12 @@
       <w:pPr>
         <w:pStyle w:val="Heading1"/>
       </w:pPr>
-      <w:bookmarkStart w:id="33" w:name="_Toc98332571"/>
+      <w:bookmarkStart w:id="37" w:name="_Toc165372587"/>
       <w:r>
         <w:lastRenderedPageBreak/>
         <w:t>About</w:t>
       </w:r>
-      <w:bookmarkEnd w:id="33"/>
+      <w:bookmarkEnd w:id="37"/>
     </w:p>
     <w:p>
       <w:r>
@@ -1425,13 +1695,13 @@
       <w:pPr>
         <w:pStyle w:val="Heading1"/>
       </w:pPr>
-      <w:bookmarkStart w:id="34" w:name="_Toc69207024"/>
-      <w:bookmarkStart w:id="35" w:name="_Toc98332572"/>
+      <w:bookmarkStart w:id="38" w:name="_Toc69207024"/>
+      <w:bookmarkStart w:id="39" w:name="_Toc165372588"/>
       <w:r>
         <w:t>Package</w:t>
       </w:r>
-      <w:bookmarkEnd w:id="34"/>
-      <w:bookmarkEnd w:id="35"/>
+      <w:bookmarkEnd w:id="38"/>
+      <w:bookmarkEnd w:id="39"/>
     </w:p>
     <w:p>
       <w:r>
@@ -1574,13 +1844,13 @@
       <w:pPr>
         <w:pStyle w:val="Heading1"/>
       </w:pPr>
-      <w:bookmarkStart w:id="36" w:name="_Toc69207023"/>
-      <w:bookmarkStart w:id="37" w:name="_Toc98332573"/>
+      <w:bookmarkStart w:id="40" w:name="_Toc69207023"/>
+      <w:bookmarkStart w:id="41" w:name="_Toc165372589"/>
       <w:r>
         <w:t>Avoiding a common mistake</w:t>
       </w:r>
-      <w:bookmarkEnd w:id="36"/>
-      <w:bookmarkEnd w:id="37"/>
+      <w:bookmarkEnd w:id="40"/>
+      <w:bookmarkEnd w:id="41"/>
     </w:p>
     <w:p>
       <w:r>
@@ -1633,12 +1903,12 @@
       <w:pPr>
         <w:pStyle w:val="Heading1"/>
       </w:pPr>
-      <w:bookmarkStart w:id="38" w:name="_Toc98332574"/>
+      <w:bookmarkStart w:id="42" w:name="_Toc165372590"/>
       <w:r>
         <w:lastRenderedPageBreak/>
         <w:t>Getting Started</w:t>
       </w:r>
-      <w:bookmarkEnd w:id="38"/>
+      <w:bookmarkEnd w:id="42"/>
     </w:p>
     <w:p>
       <w:pPr>
@@ -1822,7 +2092,7 @@
       <w:pPr>
         <w:pStyle w:val="Heading1"/>
       </w:pPr>
-      <w:bookmarkStart w:id="39" w:name="_Toc98332575"/>
+      <w:bookmarkStart w:id="43" w:name="_Toc165372591"/>
       <w:r>
         <w:t>AD Groups</w:t>
       </w:r>
@@ -1836,7 +2106,7 @@
       <w:r>
         <w:t>etc</w:t>
       </w:r>
-      <w:bookmarkEnd w:id="39"/>
+      <w:bookmarkEnd w:id="43"/>
       <w:proofErr w:type="spellEnd"/>
     </w:p>
     <w:p>
@@ -2169,12 +2439,12 @@
       <w:pPr>
         <w:pStyle w:val="Heading1"/>
       </w:pPr>
-      <w:bookmarkStart w:id="40" w:name="_Toc98332576"/>
+      <w:bookmarkStart w:id="44" w:name="_Toc165372592"/>
       <w:r>
         <w:lastRenderedPageBreak/>
         <w:t>Initial IIS Setup</w:t>
       </w:r>
-      <w:bookmarkEnd w:id="40"/>
+      <w:bookmarkEnd w:id="44"/>
     </w:p>
     <w:p>
       <w:pPr>
@@ -3027,11 +3297,11 @@
       <w:pPr>
         <w:pStyle w:val="Heading1"/>
       </w:pPr>
-      <w:bookmarkStart w:id="41" w:name="_Toc98332577"/>
+      <w:bookmarkStart w:id="45" w:name="_Toc165372593"/>
       <w:r>
         <w:t>Database Deployment</w:t>
       </w:r>
-      <w:bookmarkEnd w:id="41"/>
+      <w:bookmarkEnd w:id="45"/>
     </w:p>
     <w:p>
       <w:pPr>
@@ -3123,11 +3393,11 @@
       <w:pPr>
         <w:pStyle w:val="Heading1"/>
       </w:pPr>
-      <w:bookmarkStart w:id="42" w:name="_Toc98332578"/>
+      <w:bookmarkStart w:id="46" w:name="_Toc165372594"/>
       <w:r>
         <w:t>Additional Files</w:t>
       </w:r>
-      <w:bookmarkEnd w:id="42"/>
+      <w:bookmarkEnd w:id="46"/>
     </w:p>
     <w:p>
       <w:pPr>
@@ -3257,7 +3527,7 @@
       <w:pPr>
         <w:pStyle w:val="Heading1"/>
       </w:pPr>
-      <w:bookmarkStart w:id="43" w:name="_Toc98332579"/>
+      <w:bookmarkStart w:id="47" w:name="_Toc165372595"/>
       <w:r>
         <w:lastRenderedPageBreak/>
         <w:t xml:space="preserve">Appendix A: </w:t>
@@ -3271,7 +3541,7 @@
       <w:r>
         <w:t xml:space="preserve"> Customization</w:t>
       </w:r>
-      <w:bookmarkEnd w:id="43"/>
+      <w:bookmarkEnd w:id="47"/>
     </w:p>
     <w:p>
       <w:pPr>
@@ -3498,13 +3768,13 @@
         </w:rPr>
         <w:br w:type="page"/>
       </w:r>
-      <w:bookmarkStart w:id="44" w:name="_Toc69207029"/>
+      <w:bookmarkStart w:id="48" w:name="_Toc69207029"/>
     </w:p>
     <w:p>
       <w:pPr>
         <w:pStyle w:val="Heading1"/>
       </w:pPr>
-      <w:bookmarkStart w:id="45" w:name="_Toc98332580"/>
+      <w:bookmarkStart w:id="49" w:name="_Toc165372596"/>
       <w:r>
         <w:lastRenderedPageBreak/>
         <w:t xml:space="preserve">Appendix </w:t>
@@ -3532,8 +3802,8 @@
       <w:r>
         <w:t xml:space="preserve"> Customization</w:t>
       </w:r>
-      <w:bookmarkEnd w:id="44"/>
-      <w:bookmarkEnd w:id="45"/>
+      <w:bookmarkEnd w:id="48"/>
+      <w:bookmarkEnd w:id="49"/>
     </w:p>
     <w:p>
       <w:pPr>
@@ -4062,7 +4332,7 @@
           <w:rFonts w:ascii="Calibri" w:eastAsia="Times New Roman" w:hAnsi="Calibri" w:cs="Calibri"/>
         </w:rPr>
       </w:pPr>
-      <w:bookmarkStart w:id="46" w:name="_Hlk34723628"/>
+      <w:bookmarkStart w:id="50" w:name="_Hlk34723628"/>
       <w:proofErr w:type="spellStart"/>
       <w:r>
         <w:rPr>
@@ -4080,7 +4350,7 @@
         </w:rPr>
         <w:t xml:space="preserve"> </w:t>
       </w:r>
-      <w:bookmarkEnd w:id="46"/>
+      <w:bookmarkEnd w:id="50"/>
       <w:r>
         <w:rPr>
           <w:rFonts w:ascii="Calibri" w:eastAsia="Times New Roman" w:hAnsi="Calibri" w:cs="Calibri"/>
@@ -4530,7 +4800,7 @@
         </w:numPr>
         <w:spacing w:after="0"/>
       </w:pPr>
-      <w:bookmarkStart w:id="47" w:name="_Hlk95193873"/>
+      <w:bookmarkStart w:id="51" w:name="_Hlk95193873"/>
       <w:proofErr w:type="spellStart"/>
       <w:r>
         <w:rPr>
@@ -4551,7 +4821,7 @@
         </w:rPr>
         <w:t xml:space="preserve"> </w:t>
       </w:r>
-      <w:bookmarkEnd w:id="47"/>
+      <w:bookmarkEnd w:id="51"/>
       <w:r>
         <w:t xml:space="preserve">– </w:t>
       </w:r>
@@ -4774,7 +5044,7 @@
       <w:r>
         <w:t xml:space="preserve"> </w:t>
       </w:r>
-      <w:commentRangeStart w:id="48"/>
+      <w:commentRangeStart w:id="52"/>
       <w:r>
         <w:t>set as appropriate</w:t>
       </w:r>
@@ -4795,13 +5065,13 @@
       <w:r>
         <w:t xml:space="preserve"> will cause EPs to be used, instead of hours</w:t>
       </w:r>
-      <w:commentRangeEnd w:id="48"/>
+      <w:commentRangeEnd w:id="52"/>
       <w:r>
         <w:rPr>
           <w:rStyle w:val="CommentReference"/>
           <w:rFonts w:ascii="Calibri" w:eastAsiaTheme="minorHAnsi" w:hAnsi="Calibri" w:cs="Times New Roman"/>
         </w:rPr>
-        <w:commentReference w:id="48"/>
+        <w:commentReference w:id="52"/>
       </w:r>
     </w:p>
     <w:p>
@@ -4878,7 +5148,7 @@
       <w:r>
         <w:t xml:space="preserve">set to </w:t>
       </w:r>
-      <w:commentRangeStart w:id="49"/>
+      <w:commentRangeStart w:id="53"/>
       <w:r>
         <w:rPr>
           <w:rFonts w:ascii="Consolas" w:hAnsi="Consolas" w:cs="Consolas"/>
@@ -4887,13 +5157,13 @@
         </w:rPr>
         <w:t>true</w:t>
       </w:r>
-      <w:commentRangeEnd w:id="49"/>
+      <w:commentRangeEnd w:id="53"/>
       <w:r>
         <w:rPr>
           <w:rStyle w:val="CommentReference"/>
           <w:rFonts w:ascii="Calibri" w:eastAsiaTheme="minorHAnsi" w:hAnsi="Calibri" w:cs="Times New Roman"/>
         </w:rPr>
-        <w:commentReference w:id="49"/>
+        <w:commentReference w:id="53"/>
       </w:r>
       <w:r>
         <w:rPr>
@@ -6488,7 +6758,7 @@
           <w:rFonts w:ascii="Calibri" w:eastAsia="Times New Roman" w:hAnsi="Calibri" w:cs="Calibri"/>
         </w:rPr>
       </w:pPr>
-      <w:commentRangeStart w:id="50"/>
+      <w:commentRangeStart w:id="54"/>
       <w:r>
         <w:rPr>
           <w:rFonts w:ascii="Calibri" w:eastAsia="Times New Roman" w:hAnsi="Calibri" w:cs="Calibri"/>
@@ -6496,13 +6766,13 @@
         </w:rPr>
         <w:t>RMS</w:t>
       </w:r>
-      <w:commentRangeEnd w:id="50"/>
+      <w:commentRangeEnd w:id="54"/>
       <w:r>
         <w:rPr>
           <w:rStyle w:val="CommentReference"/>
           <w:rFonts w:ascii="Calibri" w:eastAsiaTheme="minorHAnsi" w:hAnsi="Calibri" w:cs="Times New Roman"/>
         </w:rPr>
-        <w:commentReference w:id="50"/>
+        <w:commentReference w:id="54"/>
       </w:r>
       <w:r>
         <w:rPr>
@@ -7444,8 +7714,8 @@
       <w:pPr>
         <w:pStyle w:val="Heading1"/>
       </w:pPr>
-      <w:bookmarkStart w:id="51" w:name="_Toc69207035"/>
-      <w:bookmarkStart w:id="52" w:name="_Toc98332581"/>
+      <w:bookmarkStart w:id="55" w:name="_Toc69207035"/>
+      <w:bookmarkStart w:id="56" w:name="_Toc165372597"/>
       <w:r>
         <w:lastRenderedPageBreak/>
         <w:t xml:space="preserve">Appendix </w:t>
@@ -7464,8 +7734,8 @@
       <w:r>
         <w:t xml:space="preserve"> Customization</w:t>
       </w:r>
-      <w:bookmarkEnd w:id="51"/>
-      <w:bookmarkEnd w:id="52"/>
+      <w:bookmarkEnd w:id="55"/>
+      <w:bookmarkEnd w:id="56"/>
     </w:p>
     <w:p>
       <w:pPr>
@@ -8158,8 +8428,8 @@
       <w:pPr>
         <w:pStyle w:val="Heading1"/>
       </w:pPr>
-      <w:bookmarkStart w:id="53" w:name="_Toc69207034"/>
-      <w:bookmarkStart w:id="54" w:name="_Toc98332582"/>
+      <w:bookmarkStart w:id="57" w:name="_Toc69207034"/>
+      <w:bookmarkStart w:id="58" w:name="_Toc165372598"/>
       <w:r>
         <w:t xml:space="preserve">Appendix </w:t>
       </w:r>
@@ -8183,8 +8453,8 @@
       <w:r>
         <w:t xml:space="preserve"> Customization</w:t>
       </w:r>
-      <w:bookmarkEnd w:id="53"/>
-      <w:bookmarkEnd w:id="54"/>
+      <w:bookmarkEnd w:id="57"/>
+      <w:bookmarkEnd w:id="58"/>
     </w:p>
     <w:p>
       <w:pPr>
@@ -8540,7 +8810,7 @@
 
 <file path=word/comments.xml><?xml version="1.0" encoding="utf-8"?>
 <w:comments xmlns:wpc="http://schemas.microsoft.com/office/word/2010/wordprocessingCanvas" xmlns:cx="http://schemas.microsoft.com/office/drawing/2014/chartex" xmlns:cx1="http://schemas.microsoft.com/office/drawing/2015/9/8/chartex" xmlns:cx2="http://schemas.microsoft.com/office/drawing/2015/10/21/chartex" xmlns:cx3="http://schemas.microsoft.com/office/drawing/2016/5/9/chartex" xmlns:cx4="http://schemas.microsoft.com/office/drawing/2016/5/10/chartex" xmlns:cx5="http://schemas.microsoft.com/office/drawing/2016/5/11/chartex" xmlns:cx6="http://schemas.microsoft.com/office/drawing/2016/5/12/chartex" xmlns:cx7="http://schemas.microsoft.com/office/drawing/2016/5/13/chartex" xmlns:cx8="http://schemas.microsoft.com/office/drawing/2016/5/14/chartex" xmlns:mc="http://schemas.openxmlformats.org/markup-compatibility/2006" xmlns:aink="http://schemas.microsoft.com/office/drawing/2016/ink" xmlns:am3d="http://schemas.microsoft.com/office/drawing/2017/model3d" xmlns:o="urn:schemas-microsoft-com:office:office" xmlns:oel="http://schemas.microsoft.com/office/2019/extlst" xmlns:r="http://schemas.openxmlformats.org/officeDocument/2006/relationships" xmlns:m="http://schemas.openxmlformats.org/officeDocument/2006/math" xmlns:v="urn:schemas-microsoft-com:vml" xmlns:wp14="http://schemas.microsoft.com/office/word/2010/wordprocessingDrawing" xmlns:wp="http://schemas.openxmlformats.org/drawingml/2006/wordprocessingDrawing" xmlns:w10="urn:schemas-microsoft-com:office:word" xmlns:w="http://schemas.openxmlformats.org/wordprocessingml/2006/main" xmlns:w14="http://schemas.microsoft.com/office/word/2010/wordml" xmlns:w15="http://schemas.microsoft.com/office/word/2012/wordml" xmlns:w16cex="http://schemas.microsoft.com/office/word/2018/wordml/cex" xmlns:w16cid="http://schemas.microsoft.com/office/word/2016/wordml/cid" xmlns:w16="http://schemas.microsoft.com/office/word/2018/wordml" xmlns:w16sdtdh="http://schemas.microsoft.com/office/word/2020/wordml/sdtdatahash" xmlns:w16se="http://schemas.microsoft.com/office/word/2015/wordml/symex" xmlns:wpg="http://schemas.microsoft.com/office/word/2010/wordprocessingGroup" xmlns:wpi="http://schemas.microsoft.com/office/word/2010/wordprocessingInk" xmlns:wne="http://schemas.microsoft.com/office/word/2006/wordml" xmlns:wps="http://schemas.microsoft.com/office/word/2010/wordprocessingShape" mc:Ignorable="w14 w15 w16se w16cid w16 w16cex w16sdtdh wp14">
-  <w:comment w:id="48" w:author="Palider, Dusan (US)" w:date="2022-03-16T13:49:00Z" w:initials="DP">
+  <w:comment w:id="52" w:author="Palider, Dusan (US)" w:date="2022-03-16T13:49:00Z" w:initials="DP">
     <w:p>
       <w:pPr>
         <w:pStyle w:val="CommentText"/>
@@ -8562,7 +8832,7 @@
       </w:r>
     </w:p>
   </w:comment>
-  <w:comment w:id="49" w:author="Palider, Dusan (US)" w:date="2022-03-16T13:49:00Z" w:initials="DP">
+  <w:comment w:id="53" w:author="Palider, Dusan (US)" w:date="2022-03-16T13:49:00Z" w:initials="DP">
     <w:p>
       <w:pPr>
         <w:pStyle w:val="CommentText"/>
@@ -8578,7 +8848,7 @@
       </w:r>
     </w:p>
   </w:comment>
-  <w:comment w:id="50" w:author="Palider, Dusan (US)" w:date="2022-03-16T13:39:00Z" w:initials="DP">
+  <w:comment w:id="54" w:author="Palider, Dusan (US)" w:date="2022-03-16T13:39:00Z" w:initials="DP">
     <w:p>
       <w:pPr>
         <w:pStyle w:val="CommentText"/>

</xml_diff>

<commit_message>
update docs to include case sensitivity "gotcha"
</commit_message>
<xml_diff>
--- a/ClassifiedInstallationStuff/_Instructions/Initial GenBoe Installation Instructions.docx
+++ b/ClassifiedInstallationStuff/_Instructions/Initial GenBoe Installation Instructions.docx
@@ -37,18 +37,18 @@
         </w:rPr>
       </w:pPr>
     </w:p>
-    <w:bookmarkStart w:id="0" w:name="_Toc165372583" w:displacedByCustomXml="next"/>
-    <w:bookmarkStart w:id="1" w:name="_Toc435089160" w:displacedByCustomXml="next"/>
-    <w:bookmarkStart w:id="2" w:name="_Toc402261032" w:displacedByCustomXml="next"/>
-    <w:bookmarkStart w:id="3" w:name="_Toc409096411" w:displacedByCustomXml="next"/>
-    <w:bookmarkStart w:id="4" w:name="_Toc410226779" w:displacedByCustomXml="next"/>
-    <w:bookmarkStart w:id="5" w:name="_Toc410286731" w:displacedByCustomXml="next"/>
-    <w:bookmarkStart w:id="6" w:name="_Toc410652409" w:displacedByCustomXml="next"/>
-    <w:bookmarkStart w:id="7" w:name="_Toc426544400" w:displacedByCustomXml="next"/>
-    <w:bookmarkStart w:id="8" w:name="_Toc426545102" w:displacedByCustomXml="next"/>
-    <w:bookmarkStart w:id="9" w:name="_Toc426545466" w:displacedByCustomXml="next"/>
-    <w:bookmarkStart w:id="10" w:name="_Toc98329161" w:displacedByCustomXml="next"/>
-    <w:bookmarkStart w:id="11" w:name="_Toc98332567" w:displacedByCustomXml="next"/>
+    <w:bookmarkStart w:id="0" w:name="_Toc98332567" w:displacedByCustomXml="next"/>
+    <w:bookmarkStart w:id="1" w:name="_Toc98329161" w:displacedByCustomXml="next"/>
+    <w:bookmarkStart w:id="2" w:name="_Toc426545466" w:displacedByCustomXml="next"/>
+    <w:bookmarkStart w:id="3" w:name="_Toc426545102" w:displacedByCustomXml="next"/>
+    <w:bookmarkStart w:id="4" w:name="_Toc426544400" w:displacedByCustomXml="next"/>
+    <w:bookmarkStart w:id="5" w:name="_Toc410652409" w:displacedByCustomXml="next"/>
+    <w:bookmarkStart w:id="6" w:name="_Toc410286731" w:displacedByCustomXml="next"/>
+    <w:bookmarkStart w:id="7" w:name="_Toc410226779" w:displacedByCustomXml="next"/>
+    <w:bookmarkStart w:id="8" w:name="_Toc409096411" w:displacedByCustomXml="next"/>
+    <w:bookmarkStart w:id="9" w:name="_Toc402261032" w:displacedByCustomXml="next"/>
+    <w:bookmarkStart w:id="10" w:name="_Toc435089160" w:displacedByCustomXml="next"/>
+    <w:bookmarkStart w:id="11" w:name="_Toc165372583" w:displacedByCustomXml="next"/>
     <w:sdt>
       <w:sdtPr>
         <w:rPr>
@@ -76,8 +76,8 @@
         </w:rPr>
       </w:sdtEndPr>
       <w:sdtContent>
-        <w:bookmarkStart w:id="12" w:name="_Toc320016168" w:displacedByCustomXml="prev"/>
-        <w:bookmarkStart w:id="13" w:name="_Toc266280202" w:displacedByCustomXml="prev"/>
+        <w:bookmarkStart w:id="12" w:name="_Toc266280202" w:displacedByCustomXml="prev"/>
+        <w:bookmarkStart w:id="13" w:name="_Toc320016168" w:displacedByCustomXml="prev"/>
         <w:p>
           <w:pPr>
             <w:pStyle w:val="Heading1"/>
@@ -5464,6 +5464,7 @@
           <w:rFonts w:ascii="Calibri" w:eastAsia="Times New Roman" w:hAnsi="Calibri" w:cs="Calibri"/>
         </w:rPr>
       </w:pPr>
+      <w:commentRangeStart w:id="54"/>
       <w:r>
         <w:rPr>
           <w:rFonts w:ascii="Calibri" w:eastAsia="Times New Roman" w:hAnsi="Calibri" w:cs="Calibri"/>
@@ -5557,6 +5558,14 @@
           <w:szCs w:val="19"/>
         </w:rPr>
         <w:t>/”</w:t>
+      </w:r>
+      <w:commentRangeEnd w:id="54"/>
+      <w:r>
+        <w:rPr>
+          <w:rStyle w:val="CommentReference"/>
+          <w:rFonts w:ascii="Calibri" w:eastAsiaTheme="minorHAnsi" w:hAnsi="Calibri" w:cs="Times New Roman"/>
+        </w:rPr>
+        <w:commentReference w:id="54"/>
       </w:r>
     </w:p>
     <w:p>
@@ -6758,7 +6767,7 @@
           <w:rFonts w:ascii="Calibri" w:eastAsia="Times New Roman" w:hAnsi="Calibri" w:cs="Calibri"/>
         </w:rPr>
       </w:pPr>
-      <w:commentRangeStart w:id="54"/>
+      <w:commentRangeStart w:id="55"/>
       <w:r>
         <w:rPr>
           <w:rFonts w:ascii="Calibri" w:eastAsia="Times New Roman" w:hAnsi="Calibri" w:cs="Calibri"/>
@@ -6766,13 +6775,13 @@
         </w:rPr>
         <w:t>RMS</w:t>
       </w:r>
-      <w:commentRangeEnd w:id="54"/>
+      <w:commentRangeEnd w:id="55"/>
       <w:r>
         <w:rPr>
           <w:rStyle w:val="CommentReference"/>
           <w:rFonts w:ascii="Calibri" w:eastAsiaTheme="minorHAnsi" w:hAnsi="Calibri" w:cs="Times New Roman"/>
         </w:rPr>
-        <w:commentReference w:id="54"/>
+        <w:commentReference w:id="55"/>
       </w:r>
       <w:r>
         <w:rPr>
@@ -7714,8 +7723,8 @@
       <w:pPr>
         <w:pStyle w:val="Heading1"/>
       </w:pPr>
-      <w:bookmarkStart w:id="55" w:name="_Toc69207035"/>
-      <w:bookmarkStart w:id="56" w:name="_Toc165372597"/>
+      <w:bookmarkStart w:id="56" w:name="_Toc69207035"/>
+      <w:bookmarkStart w:id="57" w:name="_Toc165372597"/>
       <w:r>
         <w:lastRenderedPageBreak/>
         <w:t xml:space="preserve">Appendix </w:t>
@@ -7734,8 +7743,8 @@
       <w:r>
         <w:t xml:space="preserve"> Customization</w:t>
       </w:r>
-      <w:bookmarkEnd w:id="55"/>
       <w:bookmarkEnd w:id="56"/>
+      <w:bookmarkEnd w:id="57"/>
     </w:p>
     <w:p>
       <w:pPr>
@@ -8428,8 +8437,8 @@
       <w:pPr>
         <w:pStyle w:val="Heading1"/>
       </w:pPr>
-      <w:bookmarkStart w:id="57" w:name="_Toc69207034"/>
-      <w:bookmarkStart w:id="58" w:name="_Toc165372598"/>
+      <w:bookmarkStart w:id="58" w:name="_Toc69207034"/>
+      <w:bookmarkStart w:id="59" w:name="_Toc165372598"/>
       <w:r>
         <w:t xml:space="preserve">Appendix </w:t>
       </w:r>
@@ -8453,8 +8462,8 @@
       <w:r>
         <w:t xml:space="preserve"> Customization</w:t>
       </w:r>
-      <w:bookmarkEnd w:id="57"/>
       <w:bookmarkEnd w:id="58"/>
+      <w:bookmarkEnd w:id="59"/>
     </w:p>
     <w:p>
       <w:pPr>
@@ -8848,7 +8857,33 @@
       </w:r>
     </w:p>
   </w:comment>
-  <w:comment w:id="54" w:author="Palider, Dusan (US)" w:date="2022-03-16T13:39:00Z" w:initials="DP">
+  <w:comment w:id="54" w:author="Asuncion, Thomas (US)" w:date="2024-05-08T12:55:00Z" w:initials="AT(">
+    <w:p>
+      <w:pPr>
+        <w:pStyle w:val="CommentText"/>
+      </w:pPr>
+      <w:r>
+        <w:rPr>
+          <w:rStyle w:val="CommentReference"/>
+        </w:rPr>
+        <w:annotationRef/>
+      </w:r>
+      <w:r>
+        <w:t xml:space="preserve">The string "maintenancebanner" is case sensitive. It must be </w:t>
+      </w:r>
+      <w:r>
+        <w:rPr>
+          <w:b/>
+          <w:bCs/>
+        </w:rPr>
+        <w:t>lowercase</w:t>
+      </w:r>
+      <w:r>
+        <w:t>. Otherwise it will not work.</w:t>
+      </w:r>
+    </w:p>
+  </w:comment>
+  <w:comment w:id="55" w:author="Palider, Dusan (US)" w:date="2022-03-16T13:39:00Z" w:initials="DP">
     <w:p>
       <w:pPr>
         <w:pStyle w:val="CommentText"/>
@@ -8871,6 +8906,7 @@
 <w15:commentsEx xmlns:wpc="http://schemas.microsoft.com/office/word/2010/wordprocessingCanvas" xmlns:cx="http://schemas.microsoft.com/office/drawing/2014/chartex" xmlns:cx1="http://schemas.microsoft.com/office/drawing/2015/9/8/chartex" xmlns:cx2="http://schemas.microsoft.com/office/drawing/2015/10/21/chartex" xmlns:cx3="http://schemas.microsoft.com/office/drawing/2016/5/9/chartex" xmlns:cx4="http://schemas.microsoft.com/office/drawing/2016/5/10/chartex" xmlns:cx5="http://schemas.microsoft.com/office/drawing/2016/5/11/chartex" xmlns:cx6="http://schemas.microsoft.com/office/drawing/2016/5/12/chartex" xmlns:cx7="http://schemas.microsoft.com/office/drawing/2016/5/13/chartex" xmlns:cx8="http://schemas.microsoft.com/office/drawing/2016/5/14/chartex" xmlns:mc="http://schemas.openxmlformats.org/markup-compatibility/2006" xmlns:aink="http://schemas.microsoft.com/office/drawing/2016/ink" xmlns:am3d="http://schemas.microsoft.com/office/drawing/2017/model3d" xmlns:o="urn:schemas-microsoft-com:office:office" xmlns:oel="http://schemas.microsoft.com/office/2019/extlst" xmlns:r="http://schemas.openxmlformats.org/officeDocument/2006/relationships" xmlns:m="http://schemas.openxmlformats.org/officeDocument/2006/math" xmlns:v="urn:schemas-microsoft-com:vml" xmlns:wp14="http://schemas.microsoft.com/office/word/2010/wordprocessingDrawing" xmlns:wp="http://schemas.openxmlformats.org/drawingml/2006/wordprocessingDrawing" xmlns:w10="urn:schemas-microsoft-com:office:word" xmlns:w="http://schemas.openxmlformats.org/wordprocessingml/2006/main" xmlns:w14="http://schemas.microsoft.com/office/word/2010/wordml" xmlns:w15="http://schemas.microsoft.com/office/word/2012/wordml" xmlns:w16cex="http://schemas.microsoft.com/office/word/2018/wordml/cex" xmlns:w16cid="http://schemas.microsoft.com/office/word/2016/wordml/cid" xmlns:w16="http://schemas.microsoft.com/office/word/2018/wordml" xmlns:w16sdtdh="http://schemas.microsoft.com/office/word/2020/wordml/sdtdatahash" xmlns:w16se="http://schemas.microsoft.com/office/word/2015/wordml/symex" xmlns:wpg="http://schemas.microsoft.com/office/word/2010/wordprocessingGroup" xmlns:wpi="http://schemas.microsoft.com/office/word/2010/wordprocessingInk" xmlns:wne="http://schemas.microsoft.com/office/word/2006/wordml" xmlns:wps="http://schemas.microsoft.com/office/word/2010/wordprocessingShape" mc:Ignorable="w14 w15 w16se w16cid w16 w16cex w16sdtdh wp14">
   <w15:commentEx w15:paraId="5130C7D0" w15:done="0"/>
   <w15:commentEx w15:paraId="415B1A11" w15:done="0"/>
+  <w15:commentEx w15:paraId="4D246C69" w15:done="0"/>
   <w15:commentEx w15:paraId="1019FC62" w15:done="0"/>
 </w15:commentsEx>
 </file>
@@ -8879,6 +8915,7 @@
 <w16cex:commentsExtensible xmlns:wpc="http://schemas.microsoft.com/office/word/2010/wordprocessingCanvas" xmlns:cx="http://schemas.microsoft.com/office/drawing/2014/chartex" xmlns:cx1="http://schemas.microsoft.com/office/drawing/2015/9/8/chartex" xmlns:cx2="http://schemas.microsoft.com/office/drawing/2015/10/21/chartex" xmlns:cx3="http://schemas.microsoft.com/office/drawing/2016/5/9/chartex" xmlns:cx4="http://schemas.microsoft.com/office/drawing/2016/5/10/chartex" xmlns:cx5="http://schemas.microsoft.com/office/drawing/2016/5/11/chartex" xmlns:cx6="http://schemas.microsoft.com/office/drawing/2016/5/12/chartex" xmlns:cx7="http://schemas.microsoft.com/office/drawing/2016/5/13/chartex" xmlns:cx8="http://schemas.microsoft.com/office/drawing/2016/5/14/chartex" xmlns:mc="http://schemas.openxmlformats.org/markup-compatibility/2006" xmlns:aink="http://schemas.microsoft.com/office/drawing/2016/ink" xmlns:am3d="http://schemas.microsoft.com/office/drawing/2017/model3d" xmlns:o="urn:schemas-microsoft-com:office:office" xmlns:oel="http://schemas.microsoft.com/office/2019/extlst" xmlns:r="http://schemas.openxmlformats.org/officeDocument/2006/relationships" xmlns:m="http://schemas.openxmlformats.org/officeDocument/2006/math" xmlns:v="urn:schemas-microsoft-com:vml" xmlns:wp14="http://schemas.microsoft.com/office/word/2010/wordprocessingDrawing" xmlns:wp="http://schemas.openxmlformats.org/drawingml/2006/wordprocessingDrawing" xmlns:w10="urn:schemas-microsoft-com:office:word" xmlns:w="http://schemas.openxmlformats.org/wordprocessingml/2006/main" xmlns:w14="http://schemas.microsoft.com/office/word/2010/wordml" xmlns:w15="http://schemas.microsoft.com/office/word/2012/wordml" xmlns:w16cex="http://schemas.microsoft.com/office/word/2018/wordml/cex" xmlns:w16cid="http://schemas.microsoft.com/office/word/2016/wordml/cid" xmlns:w16="http://schemas.microsoft.com/office/word/2018/wordml" xmlns:w16sdtdh="http://schemas.microsoft.com/office/word/2020/wordml/sdtdatahash" xmlns:w16se="http://schemas.microsoft.com/office/word/2015/wordml/symex" xmlns:wpg="http://schemas.microsoft.com/office/word/2010/wordprocessingGroup" xmlns:wpi="http://schemas.microsoft.com/office/word/2010/wordprocessingInk" xmlns:wne="http://schemas.microsoft.com/office/word/2006/wordml" xmlns:wps="http://schemas.microsoft.com/office/word/2010/wordprocessingShape" mc:Ignorable="w14 w15 w16se w16cid w16 w16cex w16sdtdh wp14">
   <w16cex:commentExtensible w16cex:durableId="25DC6983" w16cex:dateUtc="2022-03-16T17:49:00Z"/>
   <w16cex:commentExtensible w16cex:durableId="25DC696B" w16cex:dateUtc="2022-03-16T17:49:00Z"/>
+  <w16cex:commentExtensible w16cex:durableId="29E5F4CE" w16cex:dateUtc="2024-05-08T16:55:00Z"/>
   <w16cex:commentExtensible w16cex:durableId="25DC670B" w16cex:dateUtc="2022-03-16T17:39:00Z"/>
 </w16cex:commentsExtensible>
 </file>
@@ -8887,6 +8924,7 @@
 <w16cid:commentsIds xmlns:wpc="http://schemas.microsoft.com/office/word/2010/wordprocessingCanvas" xmlns:cx="http://schemas.microsoft.com/office/drawing/2014/chartex" xmlns:cx1="http://schemas.microsoft.com/office/drawing/2015/9/8/chartex" xmlns:cx2="http://schemas.microsoft.com/office/drawing/2015/10/21/chartex" xmlns:cx3="http://schemas.microsoft.com/office/drawing/2016/5/9/chartex" xmlns:cx4="http://schemas.microsoft.com/office/drawing/2016/5/10/chartex" xmlns:cx5="http://schemas.microsoft.com/office/drawing/2016/5/11/chartex" xmlns:cx6="http://schemas.microsoft.com/office/drawing/2016/5/12/chartex" xmlns:cx7="http://schemas.microsoft.com/office/drawing/2016/5/13/chartex" xmlns:cx8="http://schemas.microsoft.com/office/drawing/2016/5/14/chartex" xmlns:mc="http://schemas.openxmlformats.org/markup-compatibility/2006" xmlns:aink="http://schemas.microsoft.com/office/drawing/2016/ink" xmlns:am3d="http://schemas.microsoft.com/office/drawing/2017/model3d" xmlns:o="urn:schemas-microsoft-com:office:office" xmlns:oel="http://schemas.microsoft.com/office/2019/extlst" xmlns:r="http://schemas.openxmlformats.org/officeDocument/2006/relationships" xmlns:m="http://schemas.openxmlformats.org/officeDocument/2006/math" xmlns:v="urn:schemas-microsoft-com:vml" xmlns:wp14="http://schemas.microsoft.com/office/word/2010/wordprocessingDrawing" xmlns:wp="http://schemas.openxmlformats.org/drawingml/2006/wordprocessingDrawing" xmlns:w10="urn:schemas-microsoft-com:office:word" xmlns:w="http://schemas.openxmlformats.org/wordprocessingml/2006/main" xmlns:w14="http://schemas.microsoft.com/office/word/2010/wordml" xmlns:w15="http://schemas.microsoft.com/office/word/2012/wordml" xmlns:w16cex="http://schemas.microsoft.com/office/word/2018/wordml/cex" xmlns:w16cid="http://schemas.microsoft.com/office/word/2016/wordml/cid" xmlns:w16="http://schemas.microsoft.com/office/word/2018/wordml" xmlns:w16sdtdh="http://schemas.microsoft.com/office/word/2020/wordml/sdtdatahash" xmlns:w16se="http://schemas.microsoft.com/office/word/2015/wordml/symex" xmlns:wpg="http://schemas.microsoft.com/office/word/2010/wordprocessingGroup" xmlns:wpi="http://schemas.microsoft.com/office/word/2010/wordprocessingInk" xmlns:wne="http://schemas.microsoft.com/office/word/2006/wordml" xmlns:wps="http://schemas.microsoft.com/office/word/2010/wordprocessingShape" mc:Ignorable="w14 w15 w16se w16cid w16 w16cex w16sdtdh wp14">
   <w16cid:commentId w16cid:paraId="5130C7D0" w16cid:durableId="25DC6983"/>
   <w16cid:commentId w16cid:paraId="415B1A11" w16cid:durableId="25DC696B"/>
+  <w16cid:commentId w16cid:paraId="4D246C69" w16cid:durableId="29E5F4CE"/>
   <w16cid:commentId w16cid:paraId="1019FC62" w16cid:durableId="25DC670B"/>
 </w16cid:commentsIds>
 </file>
@@ -11493,6 +11531,9 @@
 <w15:people xmlns:wpc="http://schemas.microsoft.com/office/word/2010/wordprocessingCanvas" xmlns:cx="http://schemas.microsoft.com/office/drawing/2014/chartex" xmlns:cx1="http://schemas.microsoft.com/office/drawing/2015/9/8/chartex" xmlns:cx2="http://schemas.microsoft.com/office/drawing/2015/10/21/chartex" xmlns:cx3="http://schemas.microsoft.com/office/drawing/2016/5/9/chartex" xmlns:cx4="http://schemas.microsoft.com/office/drawing/2016/5/10/chartex" xmlns:cx5="http://schemas.microsoft.com/office/drawing/2016/5/11/chartex" xmlns:cx6="http://schemas.microsoft.com/office/drawing/2016/5/12/chartex" xmlns:cx7="http://schemas.microsoft.com/office/drawing/2016/5/13/chartex" xmlns:cx8="http://schemas.microsoft.com/office/drawing/2016/5/14/chartex" xmlns:mc="http://schemas.openxmlformats.org/markup-compatibility/2006" xmlns:aink="http://schemas.microsoft.com/office/drawing/2016/ink" xmlns:am3d="http://schemas.microsoft.com/office/drawing/2017/model3d" xmlns:o="urn:schemas-microsoft-com:office:office" xmlns:oel="http://schemas.microsoft.com/office/2019/extlst" xmlns:r="http://schemas.openxmlformats.org/officeDocument/2006/relationships" xmlns:m="http://schemas.openxmlformats.org/officeDocument/2006/math" xmlns:v="urn:schemas-microsoft-com:vml" xmlns:wp14="http://schemas.microsoft.com/office/word/2010/wordprocessingDrawing" xmlns:wp="http://schemas.openxmlformats.org/drawingml/2006/wordprocessingDrawing" xmlns:w10="urn:schemas-microsoft-com:office:word" xmlns:w="http://schemas.openxmlformats.org/wordprocessingml/2006/main" xmlns:w14="http://schemas.microsoft.com/office/word/2010/wordml" xmlns:w15="http://schemas.microsoft.com/office/word/2012/wordml" xmlns:w16cex="http://schemas.microsoft.com/office/word/2018/wordml/cex" xmlns:w16cid="http://schemas.microsoft.com/office/word/2016/wordml/cid" xmlns:w16="http://schemas.microsoft.com/office/word/2018/wordml" xmlns:w16sdtdh="http://schemas.microsoft.com/office/word/2020/wordml/sdtdatahash" xmlns:w16se="http://schemas.microsoft.com/office/word/2015/wordml/symex" xmlns:wpg="http://schemas.microsoft.com/office/word/2010/wordprocessingGroup" xmlns:wpi="http://schemas.microsoft.com/office/word/2010/wordprocessingInk" xmlns:wne="http://schemas.microsoft.com/office/word/2006/wordml" xmlns:wps="http://schemas.microsoft.com/office/word/2010/wordprocessingShape" mc:Ignorable="w14 w15 w16se w16cid w16 w16cex w16sdtdh wp14">
   <w15:person w15:author="Palider, Dusan (US)">
     <w15:presenceInfo w15:providerId="None" w15:userId="Palider, Dusan (US)"/>
+  </w15:person>
+  <w15:person w15:author="Asuncion, Thomas (US)">
+    <w15:presenceInfo w15:providerId="None" w15:userId="Asuncion, Thomas (US)"/>
   </w15:person>
 </w15:people>
 </file>

</xml_diff>